<commit_message>
fix missing vendeur section
</commit_message>
<xml_diff>
--- a/documents/HLM-template.docx
+++ b/documents/HLM-template.docx
@@ -4478,7 +4478,7 @@
               </wp:inline>
             </w:drawing>
           </mc:Choice>
-          <mc:Fallback xmlns="">
+          <mc:Fallback>
             <w:pict>
               <v:shapetype w14:anchorId="4F8DC28C" id="_x0000_t202" coordsize="21600,21600" o:spt="202" path="m,l,21600r21600,l21600,xe">
                 <v:stroke joinstyle="miter"/>
@@ -5452,7 +5452,6 @@
       <w:r>
         <w:rPr>
           <w:rFonts w:ascii="TimesNewRomanPSMT" w:hAnsi="TimesNewRomanPSMT" w:cs="TimesNewRomanPSMT"/>
-          <w:lang w:val="fr-FR"/>
         </w:rPr>
         <w:t>lot</w:t>
       </w:r>
@@ -5830,7 +5829,6 @@
       <w:r>
         <w:rPr>
           <w:rFonts w:ascii="TimesNewRomanPSMT" w:hAnsi="TimesNewRomanPSMT" w:cs="TimesNewRomanPSMT"/>
-          <w:lang w:val="fr-FR"/>
         </w:rPr>
         <w:t>_</w:t>
       </w:r>
@@ -5886,7 +5884,6 @@
       <w:r>
         <w:rPr>
           <w:rFonts w:ascii="TimesNewRomanPSMT" w:hAnsi="TimesNewRomanPSMT" w:cs="TimesNewRomanPSMT"/>
-          <w:lang w:val="fr-FR"/>
         </w:rPr>
         <w:t>_</w:t>
       </w:r>
@@ -12323,6 +12320,154 @@
         <w:rPr>
           <w:rFonts w:ascii="TimesNewRomanPSMT" w:hAnsi="TimesNewRomanPSMT" w:cs="TimesNewRomanPSMT"/>
         </w:rPr>
+        <w:t>Vendeur</w:t>
+      </w:r>
+      <w:r>
+        <w:rPr>
+          <w:rFonts w:ascii="TimesNewRomanPSMT" w:hAnsi="TimesNewRomanPSMT" w:cs="TimesNewRomanPSMT" w:hint="eastAsia"/>
+        </w:rPr>
+        <w:t> </w:t>
+      </w:r>
+      <w:r>
+        <w:rPr>
+          <w:rFonts w:ascii="TimesNewRomanPSMT" w:hAnsi="TimesNewRomanPSMT" w:cs="TimesNewRomanPSMT"/>
+        </w:rPr>
+        <w:t xml:space="preserve">: </w:t>
+      </w:r>
+      <w:bookmarkStart w:id="53" w:name="Vendeur"/>
+      <w:bookmarkEnd w:id="53"/>
+      <w:r>
+        <w:rPr>
+          <w:rFonts w:ascii="TimesNewRomanPSMT" w:hAnsi="TimesNewRomanPSMT" w:cs="TimesNewRomanPSMT"/>
+        </w:rPr>
+        <w:t>{{ programme.vendeur</w:t>
+      </w:r>
+      <w:r>
+        <w:rPr>
+          <w:rFonts w:ascii="TimesNewRomanPSMT" w:hAnsi="TimesNewRomanPSMT" w:cs="TimesNewRomanPSMT"/>
+          <w:lang w:val="fr-FR"/>
+        </w:rPr>
+        <w:t>_</w:t>
+      </w:r>
+      <w:proofErr w:type="spellStart"/>
+      <w:r>
+        <w:rPr>
+          <w:rFonts w:ascii="TimesNewRomanPSMT" w:hAnsi="TimesNewRomanPSMT" w:cs="TimesNewRomanPSMT"/>
+          <w:lang w:val="fr-FR"/>
+        </w:rPr>
+        <w:t>text</w:t>
+      </w:r>
+      <w:proofErr w:type="spellEnd"/>
+      <w:r>
+        <w:rPr>
+          <w:rFonts w:ascii="TimesNewRomanPSMT" w:hAnsi="TimesNewRomanPSMT" w:cs="TimesNewRomanPSMT"/>
+          <w:lang w:val="fr-FR"/>
+        </w:rPr>
+        <w:t>()</w:t>
+      </w:r>
+      <w:r>
+        <w:rPr>
+          <w:rFonts w:ascii="TimesNewRomanPSMT" w:hAnsi="TimesNewRomanPSMT" w:cs="TimesNewRomanPSMT"/>
+        </w:rPr>
+        <w:t xml:space="preserve">  }}</w:t>
+      </w:r>
+    </w:p>
+    <w:p>
+      <w:pPr>
+        <w:rPr>
+          <w:rFonts w:ascii="TimesNewRomanPSMT" w:hAnsi="TimesNewRomanPSMT" w:cs="TimesNewRomanPSMT"/>
+          <w:lang w:val="fr-FR"/>
+        </w:rPr>
+      </w:pPr>
+      <w:r>
+        <w:rPr>
+          <w:rFonts w:ascii="TimesNewRomanPSMT" w:hAnsi="TimesNewRomanPSMT" w:cs="TimesNewRomanPSMT"/>
+          <w:lang w:val="fr-FR"/>
+        </w:rPr>
+        <w:lastRenderedPageBreak/>
+        <w:t xml:space="preserve">{% for image in </w:t>
+      </w:r>
+      <w:proofErr w:type="spellStart"/>
+      <w:r>
+        <w:rPr>
+          <w:rFonts w:ascii="TimesNewRomanPSMT" w:hAnsi="TimesNewRomanPSMT" w:cs="TimesNewRomanPSMT"/>
+          <w:lang w:val="fr-FR"/>
+        </w:rPr>
+        <w:t>vendeur_images</w:t>
+      </w:r>
+      <w:proofErr w:type="spellEnd"/>
+      <w:r>
+        <w:rPr>
+          <w:rFonts w:ascii="TimesNewRomanPSMT" w:hAnsi="TimesNewRomanPSMT" w:cs="TimesNewRomanPSMT"/>
+          <w:lang w:val="fr-FR"/>
+        </w:rPr>
+        <w:t xml:space="preserve"> %}</w:t>
+      </w:r>
+    </w:p>
+    <w:p>
+      <w:pPr>
+        <w:rPr>
+          <w:rFonts w:ascii="TimesNewRomanPSMT" w:hAnsi="TimesNewRomanPSMT" w:cs="TimesNewRomanPSMT"/>
+          <w:lang w:val="fr-FR"/>
+        </w:rPr>
+      </w:pPr>
+      <w:r>
+        <w:rPr>
+          <w:rFonts w:ascii="TimesNewRomanPSMT" w:hAnsi="TimesNewRomanPSMT" w:cs="TimesNewRomanPSMT"/>
+          <w:lang w:val="fr-FR"/>
+        </w:rPr>
+        <w:t>{{image}}</w:t>
+      </w:r>
+    </w:p>
+    <w:p>
+      <w:pPr>
+        <w:rPr>
+          <w:rFonts w:ascii="TimesNewRomanPSMT" w:hAnsi="TimesNewRomanPSMT" w:cs="TimesNewRomanPSMT"/>
+          <w:lang w:val="fr-FR"/>
+        </w:rPr>
+      </w:pPr>
+    </w:p>
+    <w:p>
+      <w:pPr>
+        <w:rPr>
+          <w:rFonts w:ascii="TimesNewRomanPSMT" w:hAnsi="TimesNewRomanPSMT" w:cs="TimesNewRomanPSMT"/>
+          <w:lang w:val="fr-FR"/>
+        </w:rPr>
+      </w:pPr>
+      <w:r>
+        <w:rPr>
+          <w:rFonts w:ascii="TimesNewRomanPSMT" w:hAnsi="TimesNewRomanPSMT" w:cs="TimesNewRomanPSMT"/>
+          <w:lang w:val="fr-FR"/>
+        </w:rPr>
+        <w:t xml:space="preserve">{% </w:t>
+      </w:r>
+      <w:proofErr w:type="spellStart"/>
+      <w:r>
+        <w:rPr>
+          <w:rFonts w:ascii="TimesNewRomanPSMT" w:hAnsi="TimesNewRomanPSMT" w:cs="TimesNewRomanPSMT"/>
+          <w:lang w:val="fr-FR"/>
+        </w:rPr>
+        <w:t>endfor</w:t>
+      </w:r>
+      <w:proofErr w:type="spellEnd"/>
+      <w:r>
+        <w:rPr>
+          <w:rFonts w:ascii="TimesNewRomanPSMT" w:hAnsi="TimesNewRomanPSMT" w:cs="TimesNewRomanPSMT"/>
+          <w:lang w:val="fr-FR"/>
+        </w:rPr>
+        <w:t xml:space="preserve"> %}</w:t>
+      </w:r>
+    </w:p>
+    <w:p>
+      <w:pPr>
+        <w:rPr>
+          <w:rFonts w:ascii="TimesNewRomanPSMT" w:hAnsi="TimesNewRomanPSMT" w:cs="TimesNewRomanPSMT"/>
+        </w:rPr>
+      </w:pPr>
+      <w:r>
+        <w:rPr>
+          <w:rFonts w:ascii="TimesNewRomanPSMT" w:hAnsi="TimesNewRomanPSMT" w:cs="TimesNewRomanPSMT"/>
+        </w:rPr>
         <w:t>Acquéreur</w:t>
       </w:r>
       <w:r>
@@ -12337,8 +12482,8 @@
         </w:rPr>
         <w:t xml:space="preserve">: </w:t>
       </w:r>
-      <w:bookmarkStart w:id="53" w:name="Acquereur"/>
-      <w:bookmarkEnd w:id="53"/>
+      <w:bookmarkStart w:id="54" w:name="Acquereur"/>
+      <w:bookmarkEnd w:id="54"/>
       <w:r>
         <w:rPr>
           <w:rFonts w:ascii="TimesNewRomanPSMT" w:hAnsi="TimesNewRomanPSMT" w:cs="TimesNewRomanPSMT"/>
@@ -12391,7 +12536,6 @@
         <w:rPr>
           <w:rFonts w:ascii="TimesNewRomanPSMT" w:hAnsi="TimesNewRomanPSMT" w:cs="TimesNewRomanPSMT"/>
         </w:rPr>
-        <w:lastRenderedPageBreak/>
         <w:t>{% for image in acquereur_images %}</w:t>
       </w:r>
     </w:p>
@@ -12432,8 +12576,8 @@
       <w:r>
         <w:t xml:space="preserve">Acte notarié : </w:t>
       </w:r>
-      <w:bookmarkStart w:id="54" w:name="ActeNotaire"/>
-      <w:bookmarkEnd w:id="54"/>
+      <w:bookmarkStart w:id="55" w:name="ActeNotaire"/>
+      <w:bookmarkEnd w:id="55"/>
       <w:r>
         <w:rPr>
           <w:rFonts w:ascii="TimesNewRomanPSMT" w:hAnsi="TimesNewRomanPSMT" w:cs="TimesNewRomanPSMT"/>
@@ -12470,8 +12614,8 @@
       <w:r>
         <w:t xml:space="preserve">Notaire : </w:t>
       </w:r>
-      <w:bookmarkStart w:id="55" w:name="Notaire"/>
-      <w:bookmarkEnd w:id="55"/>
+      <w:bookmarkStart w:id="56" w:name="Notaire"/>
+      <w:bookmarkEnd w:id="56"/>
       <w:r>
         <w:rPr>
           <w:rFonts w:ascii="TimesNewRomanPSMT" w:hAnsi="TimesNewRomanPSMT" w:cs="TimesNewRomanPSMT"/>
@@ -12565,8 +12709,8 @@
       <w:r>
         <w:t xml:space="preserve">Référence publicitaire : </w:t>
       </w:r>
-      <w:bookmarkStart w:id="56" w:name="Refpublic"/>
-      <w:bookmarkEnd w:id="56"/>
+      <w:bookmarkStart w:id="57" w:name="Refpublic"/>
+      <w:bookmarkEnd w:id="57"/>
       <w:r>
         <w:rPr>
           <w:rFonts w:ascii="TimesNewRomanPSMT" w:hAnsi="TimesNewRomanPSMT" w:cs="TimesNewRomanPSMT"/>
@@ -12710,8 +12854,8 @@
         </w:rPr>
         <w:t xml:space="preserve">5.1. Permis de construire : </w:t>
       </w:r>
-      <w:bookmarkStart w:id="57" w:name="PC"/>
-      <w:bookmarkEnd w:id="57"/>
+      <w:bookmarkStart w:id="58" w:name="PC"/>
+      <w:bookmarkEnd w:id="58"/>
       <w:r>
         <w:rPr>
           <w:rFonts w:ascii="TimesNewRomanPSMT" w:hAnsi="TimesNewRomanPSMT" w:cs="TimesNewRomanPSMT"/>
@@ -12785,8 +12929,8 @@
         </w:rPr>
         <w:t xml:space="preserve">5.3. Date d'achat : </w:t>
       </w:r>
-      <w:bookmarkStart w:id="58" w:name="Achat"/>
-      <w:bookmarkEnd w:id="58"/>
+      <w:bookmarkStart w:id="59" w:name="Achat"/>
+      <w:bookmarkEnd w:id="59"/>
       <w:r>
         <w:rPr>
           <w:rFonts w:ascii="TimesNewRomanPSMT" w:hAnsi="TimesNewRomanPSMT" w:cs="TimesNewRomanPSMT"/>
@@ -13329,8 +13473,8 @@
           <w:rFonts w:ascii="TimesNewRomanPSMT" w:hAnsi="TimesNewRomanPSMT" w:cs="TimesNewRomanPSMT"/>
         </w:rPr>
       </w:pPr>
-      <w:bookmarkStart w:id="59" w:name="Etat"/>
-      <w:bookmarkEnd w:id="59"/>
+      <w:bookmarkStart w:id="60" w:name="Etat"/>
+      <w:bookmarkEnd w:id="60"/>
       <w:r>
         <w:rPr>
           <w:rFonts w:ascii="TimesNewRomanPSMT" w:hAnsi="TimesNewRomanPSMT" w:cs="TimesNewRomanPSMT"/>
@@ -13818,8 +13962,8 @@
           <w:rFonts w:ascii="TimesNewRomanPSMT" w:hAnsi="TimesNewRomanPSMT" w:cs="TimesNewRomanPSMT"/>
         </w:rPr>
       </w:pPr>
-      <w:bookmarkStart w:id="60" w:name="Fondpropre"/>
-      <w:bookmarkEnd w:id="60"/>
+      <w:bookmarkStart w:id="61" w:name="Fondpropre"/>
+      <w:bookmarkEnd w:id="61"/>
       <w:r>
         <w:rPr>
           <w:rFonts w:ascii="TimesNewRomanPSMT" w:hAnsi="TimesNewRomanPSMT" w:cs="TimesNewRomanPSMT"/>
@@ -13865,8 +14009,8 @@
         </w:rPr>
         <w:t xml:space="preserve">Date d'achèvement de la construction ou certificat de conformité : </w:t>
       </w:r>
-      <w:bookmarkStart w:id="61" w:name="Construc"/>
-      <w:bookmarkEnd w:id="61"/>
+      <w:bookmarkStart w:id="62" w:name="Construc"/>
+      <w:bookmarkEnd w:id="62"/>
       <w:r>
         <w:rPr>
           <w:rFonts w:ascii="TimesNewRomanPSMT" w:hAnsi="TimesNewRomanPSMT" w:cs="TimesNewRomanPSMT"/>
@@ -13911,6 +14055,7 @@
         <w:rPr>
           <w:rFonts w:ascii="TimesNewRomanPSMT" w:hAnsi="TimesNewRomanPSMT" w:cs="TimesNewRomanPSMT"/>
         </w:rPr>
+        <w:lastRenderedPageBreak/>
         <w:t xml:space="preserve">Fait en </w:t>
       </w:r>
       <w:r>
@@ -14313,8 +14458,8 @@
         </w:rPr>
         <w:t xml:space="preserve"> </w:t>
       </w:r>
-      <w:bookmarkStart w:id="62" w:name="Siret2"/>
-      <w:bookmarkEnd w:id="62"/>
+      <w:bookmarkStart w:id="63" w:name="Siret2"/>
+      <w:bookmarkEnd w:id="63"/>
       <w:r>
         <w:rPr>
           <w:rFonts w:ascii="TimesNewRomanPSMT" w:hAnsi="TimesNewRomanPSMT" w:cs="TimesNewRomanPSMT"/>
@@ -14745,7 +14890,7 @@
             </wp:anchor>
           </w:drawing>
         </mc:Choice>
-        <mc:Fallback xmlns="">
+        <mc:Fallback>
           <w:pict>
             <v:shapetype w14:anchorId="6DE7176B" id="_x0000_t202" coordsize="21600,21600" o:spt="202" path="m,l,21600r21600,l21600,xe">
               <v:stroke joinstyle="miter"/>
@@ -14940,7 +15085,7 @@
             </wp:anchor>
           </w:drawing>
         </mc:Choice>
-        <mc:Fallback xmlns="">
+        <mc:Fallback>
           <w:pict>
             <v:rect w14:anchorId="032676F4" id="Rectangle 5" o:spid="_x0000_s1026" style="position:absolute;margin-left:2in;margin-top:21.6pt;width:417.65pt;height:777.65pt;z-index:-251663360;visibility:visible;mso-wrap-style:none;mso-width-percent:0;mso-height-percent:0;mso-wrap-distance-left:9pt;mso-wrap-distance-top:0;mso-wrap-distance-right:9pt;mso-wrap-distance-bottom:0;mso-position-horizontal:absolute;mso-position-horizontal-relative:page;mso-position-vertical:absolute;mso-position-vertical-relative:page;mso-width-percent:0;mso-height-percent:0;mso-width-relative:page;mso-height-relative:page;v-text-anchor:middle" o:gfxdata="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" filled="f" strokeweight=".18mm">
               <v:stroke endcap="square"/>
@@ -15118,7 +15263,7 @@
             </wp:anchor>
           </w:drawing>
         </mc:Choice>
-        <mc:Fallback xmlns="">
+        <mc:Fallback>
           <w:pict>
             <v:shapetype w14:anchorId="507FEBED" id="_x0000_t202" coordsize="21600,21600" o:spt="202" path="m,l,21600r21600,l21600,xe">
               <v:stroke joinstyle="miter"/>
@@ -15368,7 +15513,7 @@
             </wp:anchor>
           </w:drawing>
         </mc:Choice>
-        <mc:Fallback xmlns="">
+        <mc:Fallback>
           <w:pict>
             <v:group w14:anchorId="241D2DC0" id="Group 14" o:spid="_x0000_s1029" style="position:absolute;margin-left:540pt;margin-top:21.6pt;width:21.4pt;height:14.2pt;z-index:251662336;mso-wrap-distance-left:0;mso-wrap-distance-right:0;mso-position-horizontal-relative:page;mso-position-vertical-relative:page" coordorigin="10800,432" coordsize="428,284" o:gfxdata="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">
               <v:roundrect id="AutoShape 15" o:spid="_x0000_s1030" style="position:absolute;left:10807;top:439;width:420;height:276;visibility:visible;mso-wrap-style:none;v-text-anchor:middle" arcsize="10923f" o:gfxdata="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" filled="f" stroked="f" strokecolor="#3465a4">
@@ -15510,11 +15655,11 @@
                                 <v:path o:extrusionok="f" gradientshapeok="t" o:connecttype="rect"/>
                                 <o:lock v:ext="edit" aspectratio="t"/>
                               </v:shapetype>
-                              <v:shape id="_x0000_i1025" type="#_x0000_t75" alt="" style="width:39.35pt;height:26pt;mso-width-percent:0;mso-height-percent:0;mso-width-percent:0;mso-height-percent:0" filled="t">
+                              <v:shape id="_x0000_i1025" type="#_x0000_t75" alt="" style="width:38.65pt;height:26pt;mso-width-percent:0;mso-height-percent:0;mso-width-percent:0;mso-height-percent:0" filled="t">
                                 <v:fill color2="black"/>
                                 <v:imagedata r:id="rId3" o:title="" croptop="-22f" cropbottom="-22f" cropleft="-25f" cropright="-25f"/>
                               </v:shape>
-                              <o:OLEObject Type="Embed" ProgID="Word.Picture.8" ShapeID="_x0000_i1025" DrawAspect="Content" ObjectID="_1708270854" r:id="rId4"/>
+                              <o:OLEObject Type="Embed" ProgID="Word.Picture.8" ShapeID="_x0000_i1025" DrawAspect="Content" ObjectID="_1708933825" r:id="rId4"/>
                             </w:object>
                           </w:r>
                         </w:p>
@@ -15590,11 +15735,11 @@
                         <w:noProof/>
                       </w:rPr>
                       <w:object w:dxaOrig="787" w:dyaOrig="520" w14:anchorId="014D4779">
-                        <v:shape id="_x0000_i1025" type="#_x0000_t75" alt="" style="width:39.35pt;height:26pt;mso-width-percent:0;mso-height-percent:0;mso-width-percent:0;mso-height-percent:0" filled="t">
+                        <v:shape id="_x0000_i1025" type="#_x0000_t75" alt="" style="width:38.65pt;height:26pt;mso-width-percent:0;mso-height-percent:0;mso-width-percent:0;mso-height-percent:0" filled="t">
                           <v:fill color2="black"/>
                           <v:imagedata r:id="rId3" o:title="" croptop="-22f" cropbottom="-22f" cropleft="-25f" cropright="-25f"/>
                         </v:shape>
-                        <o:OLEObject Type="Embed" ProgID="Word.Picture.8" ShapeID="_x0000_i1025" DrawAspect="Content" ObjectID="_1708270854" r:id="rId5"/>
+                        <o:OLEObject Type="Embed" ProgID="Word.Picture.8" ShapeID="_x0000_i1025" DrawAspect="Content" ObjectID="_1708933825" r:id="rId5"/>
                       </w:object>
                     </w:r>
                   </w:p>
@@ -15725,7 +15870,7 @@
             </wp:anchor>
           </w:drawing>
         </mc:Choice>
-        <mc:Fallback xmlns="">
+        <mc:Fallback>
           <w:pict>
             <v:shape w14:anchorId="47A57F0C" id="Text Box 18" o:spid="_x0000_s1033" type="#_x0000_t202" style="position:absolute;margin-left:475.8pt;margin-top:28.2pt;width:62.9pt;height:24.15pt;z-index:251664384;visibility:visible;mso-wrap-style:square;mso-width-percent:0;mso-height-percent:0;mso-wrap-distance-left:9.05pt;mso-wrap-distance-top:0;mso-wrap-distance-right:9.05pt;mso-wrap-distance-bottom:0;mso-position-horizontal:absolute;mso-position-horizontal-relative:page;mso-position-vertical:absolute;mso-position-vertical-relative:page;mso-width-percent:0;mso-height-percent:0;mso-width-relative:page;mso-height-relative:page;v-text-anchor:top" o:gfxdata="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" stroked="f">
               <v:fill opacity="0"/>
@@ -15830,7 +15975,7 @@
             </wp:anchor>
           </w:drawing>
         </mc:Choice>
-        <mc:Fallback xmlns="">
+        <mc:Fallback>
           <w:pict>
             <v:shape w14:anchorId="4BFDE3DD" id="Text Box 19" o:spid="_x0000_s1034" type="#_x0000_t202" style="position:absolute;margin-left:143.75pt;margin-top:21.35pt;width:417.4pt;height:71.5pt;z-index:251665408;visibility:visible;mso-wrap-style:square;mso-width-percent:0;mso-height-percent:0;mso-wrap-distance-left:9.05pt;mso-wrap-distance-top:0;mso-wrap-distance-right:9.05pt;mso-wrap-distance-bottom:0;mso-position-horizontal:absolute;mso-position-horizontal-relative:page;mso-position-vertical:absolute;mso-position-vertical-relative:page;mso-width-percent:0;mso-height-percent:0;mso-width-relative:page;mso-height-relative:page;v-text-anchor:top" o:gfxdata="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" strokeweight=".5pt">
               <v:fill opacity="0"/>
@@ -15951,7 +16096,7 @@
             </wp:anchor>
           </w:drawing>
         </mc:Choice>
-        <mc:Fallback xmlns="">
+        <mc:Fallback>
           <w:pict>
             <v:shape w14:anchorId="46940403" id="Text Box 20" o:spid="_x0000_s1035" type="#_x0000_t202" style="position:absolute;left:0;text-align:left;margin-left:2in;margin-top:57.6pt;width:416.9pt;height:35.3pt;z-index:251666432;visibility:visible;mso-wrap-style:square;mso-width-percent:0;mso-height-percent:0;mso-wrap-distance-left:9.05pt;mso-wrap-distance-top:0;mso-wrap-distance-right:9.05pt;mso-wrap-distance-bottom:0;mso-position-horizontal:absolute;mso-position-horizontal-relative:page;mso-position-vertical:absolute;mso-position-vertical-relative:page;mso-width-percent:0;mso-height-percent:0;mso-width-relative:page;mso-height-relative:page;v-text-anchor:top" o:gfxdata="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" stroked="f">
               <v:fill opacity="0"/>
@@ -16150,7 +16295,7 @@
             </wp:anchor>
           </w:drawing>
         </mc:Choice>
-        <mc:Fallback xmlns="">
+        <mc:Fallback>
           <w:pict>
             <v:shape w14:anchorId="14392A7E" id="Text Box 9" o:spid="_x0000_s1036" type="#_x0000_t202" style="position:absolute;left:0;text-align:left;margin-left:374.15pt;margin-top:93.35pt;width:187pt;height:57.3pt;z-index:251657216;visibility:visible;mso-wrap-style:square;mso-width-percent:0;mso-height-percent:0;mso-wrap-distance-left:9.05pt;mso-wrap-distance-top:0;mso-wrap-distance-right:9.05pt;mso-wrap-distance-bottom:0;mso-position-horizontal:absolute;mso-position-horizontal-relative:page;mso-position-vertical:absolute;mso-position-vertical-relative:page;mso-width-percent:0;mso-height-percent:0;mso-width-relative:page;mso-height-relative:page;v-text-anchor:top" o:gfxdata="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" strokeweight=".5pt">
               <v:fill opacity="0"/>
@@ -16328,7 +16473,7 @@
             </wp:anchor>
           </w:drawing>
         </mc:Choice>
-        <mc:Fallback xmlns="">
+        <mc:Fallback>
           <w:pict>
             <v:shape w14:anchorId="101029BF" id="Text Box 11" o:spid="_x0000_s1037" type="#_x0000_t202" style="position:absolute;left:0;text-align:left;margin-left:266.4pt;margin-top:93.6pt;width:107.3pt;height:56.9pt;z-index:251659264;visibility:visible;mso-wrap-style:square;mso-width-percent:0;mso-height-percent:0;mso-wrap-distance-left:9.05pt;mso-wrap-distance-top:0;mso-wrap-distance-right:9.05pt;mso-wrap-distance-bottom:0;mso-position-horizontal:absolute;mso-position-horizontal-relative:page;mso-position-vertical:absolute;mso-position-vertical-relative:page;mso-width-percent:0;mso-height-percent:0;mso-width-relative:page;mso-height-relative:page;v-text-anchor:top" o:gfxdata="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" stroked="f">
               <v:fill opacity="0"/>
@@ -16459,7 +16604,7 @@
             </wp:anchor>
           </w:drawing>
         </mc:Choice>
-        <mc:Fallback xmlns="">
+        <mc:Fallback>
           <w:pict>
             <v:rect w14:anchorId="7772CE94" id="Rectangle 4" o:spid="_x0000_s1026" style="position:absolute;margin-left:2in;margin-top:151.2pt;width:122.45pt;height:115.25pt;z-index:-251664384;visibility:visible;mso-wrap-style:none;mso-width-percent:0;mso-height-percent:0;mso-wrap-distance-left:9pt;mso-wrap-distance-top:0;mso-wrap-distance-right:9pt;mso-wrap-distance-bottom:0;mso-position-horizontal:absolute;mso-position-horizontal-relative:page;mso-position-vertical:absolute;mso-position-vertical-relative:page;mso-width-percent:0;mso-height-percent:0;mso-width-relative:page;mso-height-relative:page;v-text-anchor:middle" o:gfxdata="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" filled="f" strokeweight=".09mm">
               <v:stroke endcap="square"/>
@@ -16644,7 +16789,7 @@
             </wp:anchor>
           </w:drawing>
         </mc:Choice>
-        <mc:Fallback xmlns="">
+        <mc:Fallback>
           <w:pict>
             <v:shape w14:anchorId="63BBC8AA" id="Text Box 6" o:spid="_x0000_s1038" type="#_x0000_t202" style="position:absolute;left:0;text-align:left;margin-left:273.6pt;margin-top:158.4pt;width:287.3pt;height:92.9pt;z-index:251654144;visibility:visible;mso-wrap-style:square;mso-width-percent:0;mso-height-percent:0;mso-wrap-distance-left:9.05pt;mso-wrap-distance-top:0;mso-wrap-distance-right:9.05pt;mso-wrap-distance-bottom:0;mso-position-horizontal:absolute;mso-position-horizontal-relative:page;mso-position-vertical:absolute;mso-position-vertical-relative:page;mso-width-percent:0;mso-height-percent:0;mso-width-relative:page;mso-height-relative:page;v-text-anchor:top" o:gfxdata="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" stroked="f">
               <v:fill opacity="0"/>
@@ -16882,7 +17027,7 @@
             </wp:anchor>
           </w:drawing>
         </mc:Choice>
-        <mc:Fallback xmlns="">
+        <mc:Fallback>
           <w:pict>
             <v:shape w14:anchorId="569E7306" id="Text Box 7" o:spid="_x0000_s1039" type="#_x0000_t202" style="position:absolute;left:0;text-align:left;margin-left:143.75pt;margin-top:93.95pt;width:122.25pt;height:57.45pt;z-index:251655168;visibility:visible;mso-wrap-style:square;mso-width-percent:0;mso-height-percent:0;mso-wrap-distance-left:9.05pt;mso-wrap-distance-top:0;mso-wrap-distance-right:9.05pt;mso-wrap-distance-bottom:0;mso-position-horizontal:absolute;mso-position-horizontal-relative:page;mso-position-vertical:absolute;mso-position-vertical-relative:page;mso-width-percent:0;mso-height-percent:0;mso-width-relative:page;mso-height-relative:page;v-text-anchor:top" o:gfxdata="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" strokeweight=".5pt">
               <v:fill opacity="0"/>
@@ -17029,7 +17174,7 @@
             </wp:anchor>
           </w:drawing>
         </mc:Choice>
-        <mc:Fallback xmlns="">
+        <mc:Fallback>
           <w:pict>
             <v:line w14:anchorId="209DA321" id="Line 10" o:spid="_x0000_s1026" style="position:absolute;z-index:-251658240;visibility:visible;mso-wrap-style:square;mso-width-percent:0;mso-height-percent:0;mso-wrap-distance-left:9pt;mso-wrap-distance-top:0;mso-wrap-distance-right:9pt;mso-wrap-distance-bottom:0;mso-position-horizontal:absolute;mso-position-horizontal-relative:page;mso-position-vertical:absolute;mso-position-vertical-relative:page;mso-width-percent:0;mso-height-percent:0;mso-width-relative:page;mso-height-relative:page" from="266.4pt,151.2pt" to="374.45pt,151.25pt" o:gfxdata="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" strokeweight=".26mm">
               <v:stroke joinstyle="miter" endcap="square"/>
@@ -17116,7 +17261,7 @@
             </wp:anchor>
           </w:drawing>
         </mc:Choice>
-        <mc:Fallback xmlns="">
+        <mc:Fallback>
           <w:pict>
             <v:line w14:anchorId="7DB057F7" id="Line 12" o:spid="_x0000_s1026" style="position:absolute;z-index:-251656192;visibility:visible;mso-wrap-style:square;mso-width-percent:0;mso-height-percent:0;mso-wrap-distance-left:9pt;mso-wrap-distance-top:0;mso-wrap-distance-right:9pt;mso-wrap-distance-bottom:0;mso-position-horizontal:absolute;mso-position-horizontal-relative:page;mso-position-vertical:absolute;mso-position-vertical-relative:page;mso-width-percent:0;mso-height-percent:0;mso-width-relative:page;mso-height-relative:page" from="561.6pt,151.2pt" to="561.65pt,266.45pt" o:gfxdata="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" strokeweight=".26mm">
               <v:stroke joinstyle="miter" endcap="square"/>
@@ -17259,7 +17404,7 @@
             </wp:anchor>
           </w:drawing>
         </mc:Choice>
-        <mc:Fallback xmlns="">
+        <mc:Fallback>
           <w:pict>
             <v:line w14:anchorId="1F3FF70F" id="Line 8" o:spid="_x0000_s1026" style="position:absolute;z-index:-251660288;visibility:visible;mso-wrap-style:square;mso-width-percent:0;mso-height-percent:0;mso-wrap-distance-left:9pt;mso-wrap-distance-top:0;mso-wrap-distance-right:9pt;mso-wrap-distance-bottom:0;mso-position-horizontal:absolute;mso-position-horizontal-relative:page;mso-position-vertical:absolute;mso-position-vertical-relative:page;mso-width-percent:0;mso-height-percent:0;mso-width-relative:page;mso-height-relative:page" from="439.2pt,3in" to="547.25pt,216.05pt" o:gfxdata="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" strokeweight=".26mm">
               <v:stroke joinstyle="miter" endcap="square"/>
@@ -17398,7 +17543,7 @@
             </wp:anchor>
           </w:drawing>
         </mc:Choice>
-        <mc:Fallback xmlns="">
+        <mc:Fallback>
           <w:pict>
             <v:rect w14:anchorId="61275CDC" id="Rectangle 3" o:spid="_x0000_s1026" style="position:absolute;margin-left:2in;margin-top:266.4pt;width:417.65pt;height:535.95pt;z-index:-251665408;visibility:visible;mso-wrap-style:none;mso-width-percent:0;mso-height-percent:0;mso-wrap-distance-left:9pt;mso-wrap-distance-top:0;mso-wrap-distance-right:9pt;mso-wrap-distance-bottom:0;mso-position-horizontal:absolute;mso-position-horizontal-relative:page;mso-position-vertical:absolute;mso-position-vertical-relative:page;mso-width-percent:0;mso-height-percent:0;mso-width-relative:page;mso-height-relative:page;v-text-anchor:middle" o:gfxdata="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" filled="f" strokeweight=".09mm">
               <v:stroke endcap="square"/>

</xml_diff>

<commit_message>
fix: remove highlight for number of pages (#205)
</commit_message>
<xml_diff>
--- a/documents/HLM-template.docx
+++ b/documents/HLM-template.docx
@@ -3036,21 +3036,7 @@
         <w:rPr>
           <w:rFonts w:ascii="TimesNewRomanPSMT" w:hAnsi="TimesNewRomanPSMT" w:cs="TimesNewRomanPSMT"/>
         </w:rPr>
-        <w:t xml:space="preserve">Conformément à l'arrêté préfectoral prévu au 5° de l'article D. 353-16 du code de la </w:t>
-      </w:r>
-      <w:proofErr w:type="gramStart"/>
-      <w:r>
-        <w:rPr>
-          <w:rFonts w:ascii="TimesNewRomanPSMT" w:hAnsi="TimesNewRomanPSMT" w:cs="TimesNewRomanPSMT"/>
-        </w:rPr>
-        <w:t>construction</w:t>
-      </w:r>
-      <w:proofErr w:type="gramEnd"/>
-      <w:r>
-        <w:rPr>
-          <w:rFonts w:ascii="TimesNewRomanPSMT" w:hAnsi="TimesNewRomanPSMT" w:cs="TimesNewRomanPSMT"/>
-        </w:rPr>
-        <w:t xml:space="preserve"> et de l'habitation, le loyer maximum peut être majoré dans les conditions de ce même article, sans dépasser ... € par mètre carré et par mois.</w:t>
+        <w:t>Conformément à l'arrêté préfectoral prévu au 5° de l'article D. 353-16 du code de la construction et de l'habitation, le loyer maximum peut être majoré dans les conditions de ce même article, sans dépasser ... € par mètre carré et par mois.</w:t>
       </w:r>
     </w:p>
     <w:p>
@@ -17234,7 +17220,6 @@
           <w:rFonts w:ascii="TimesNewRomanPSMT" w:hAnsi="TimesNewRomanPSMT" w:cs="TimesNewRomanPSMT"/>
           <w:b/>
           <w:szCs w:val="22"/>
-          <w:highlight w:val="yellow"/>
         </w:rPr>
         <w:fldChar w:fldCharType="begin"/>
       </w:r>
@@ -17243,7 +17228,6 @@
           <w:rFonts w:ascii="TimesNewRomanPSMT" w:hAnsi="TimesNewRomanPSMT" w:cs="TimesNewRomanPSMT"/>
           <w:b/>
           <w:szCs w:val="22"/>
-          <w:highlight w:val="yellow"/>
         </w:rPr>
         <w:instrText xml:space="preserve"> NUMPAGES  \* MERGEFORMAT </w:instrText>
       </w:r>
@@ -17252,7 +17236,6 @@
           <w:rFonts w:ascii="TimesNewRomanPSMT" w:hAnsi="TimesNewRomanPSMT" w:cs="TimesNewRomanPSMT"/>
           <w:b/>
           <w:szCs w:val="22"/>
-          <w:highlight w:val="yellow"/>
         </w:rPr>
         <w:fldChar w:fldCharType="separate"/>
       </w:r>
@@ -17262,7 +17245,6 @@
           <w:b/>
           <w:noProof/>
           <w:szCs w:val="22"/>
-          <w:highlight w:val="yellow"/>
         </w:rPr>
         <w:t>20</w:t>
       </w:r>
@@ -17271,7 +17253,6 @@
           <w:rFonts w:ascii="TimesNewRomanPSMT" w:hAnsi="TimesNewRomanPSMT" w:cs="TimesNewRomanPSMT"/>
           <w:b/>
           <w:szCs w:val="22"/>
-          <w:highlight w:val="yellow"/>
         </w:rPr>
         <w:fldChar w:fldCharType="end"/>
       </w:r>
@@ -18965,7 +18946,7 @@
                             <w:rPr>
                               <w:noProof/>
                             </w:rPr>
-                            <w:object w:dxaOrig="775" w:dyaOrig="514" w14:anchorId="6BBA4968">
+                            <w:object w:dxaOrig="770" w:dyaOrig="521" w14:anchorId="6BBA4968">
                               <v:shapetype id="_x0000_t75" coordsize="21600,21600" o:spt="75" o:preferrelative="t" path="m@4@5l@4@11@9@11@9@5xe" filled="f" stroked="f">
                                 <v:stroke joinstyle="miter"/>
                                 <v:formulas>
@@ -18985,11 +18966,11 @@
                                 <v:path o:extrusionok="f" gradientshapeok="t" o:connecttype="rect"/>
                                 <o:lock v:ext="edit" aspectratio="t"/>
                               </v:shapetype>
-                              <v:shape id="_x0000_i1026" type="#_x0000_t75" alt="" style="width:38.5pt;height:26.05pt;mso-width-percent:0;mso-height-percent:0;mso-width-percent:0;mso-height-percent:0" filled="t">
+                              <v:shape id="_x0000_i1026" type="#_x0000_t75" alt="" style="width:38.25pt;height:26.25pt;mso-width-percent:0;mso-height-percent:0;mso-width-percent:0;mso-height-percent:0" filled="t">
                                 <v:fill color2="black"/>
                                 <v:imagedata r:id="rId2" o:title="" croptop="-22f" cropbottom="-22f" cropleft="-25f" cropright="-25f"/>
                               </v:shape>
-                              <o:OLEObject Type="Embed" ProgID="Word.Picture.8" ShapeID="_x0000_i1026" DrawAspect="Content" ObjectID="_1715516320" r:id="rId3"/>
+                              <o:OLEObject Type="Embed" ProgID="Word.Picture.8" ShapeID="_x0000_i1026" DrawAspect="Content" ObjectID="_1716190580" r:id="rId3"/>
                             </w:object>
                           </w:r>
                         </w:p>
@@ -19060,12 +19041,12 @@
                       <w:rPr>
                         <w:noProof/>
                       </w:rPr>
-                      <w:object w:dxaOrig="775" w:dyaOrig="514" w14:anchorId="6BBA4968">
-                        <v:shape id="_x0000_i1026" type="#_x0000_t75" alt="" style="width:38.5pt;height:26.05pt;mso-width-percent:0;mso-height-percent:0;mso-width-percent:0;mso-height-percent:0" filled="t">
+                      <w:object w:dxaOrig="770" w:dyaOrig="521" w14:anchorId="6BBA4968">
+                        <v:shape id="_x0000_i1026" type="#_x0000_t75" alt="" style="width:38.25pt;height:26.25pt;mso-width-percent:0;mso-height-percent:0;mso-width-percent:0;mso-height-percent:0" filled="t">
                           <v:fill color2="black"/>
                           <v:imagedata r:id="rId2" o:title="" croptop="-22f" cropbottom="-22f" cropleft="-25f" cropright="-25f"/>
                         </v:shape>
-                        <o:OLEObject Type="Embed" ProgID="Word.Picture.8" ShapeID="_x0000_i1026" DrawAspect="Content" ObjectID="_1715516320" r:id="rId4"/>
+                        <o:OLEObject Type="Embed" ProgID="Word.Picture.8" ShapeID="_x0000_i1026" DrawAspect="Content" ObjectID="_1716190580" r:id="rId4"/>
                       </w:object>
                     </w:r>
                   </w:p>
@@ -19390,7 +19371,7 @@
             </wp:anchor>
           </w:drawing>
         </mc:Choice>
-        <mc:Fallback xmlns="">
+        <mc:Fallback>
           <w:pict>
             <v:line w14:anchorId="432B8050" id="Line 8" o:spid="_x0000_s1026" style="position:absolute;z-index:-251660288;visibility:visible;mso-wrap-style:square;mso-width-percent:0;mso-height-percent:0;mso-wrap-distance-left:9pt;mso-wrap-distance-top:0;mso-wrap-distance-right:9pt;mso-wrap-distance-bottom:0;mso-position-horizontal:absolute;mso-position-horizontal-relative:page;mso-position-vertical:absolute;mso-position-vertical-relative:page;mso-width-percent:0;mso-height-percent:0;mso-width-relative:page;mso-height-relative:page" from="439.2pt,3in" to="547.25pt,216.05pt" o:gfxdata="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" strokeweight=".26mm">
               <v:stroke joinstyle="miter" endcap="square"/>

</xml_diff>

<commit_message>
fix artefact spf on HLM-template.docx
</commit_message>
<xml_diff>
--- a/documents/HLM-template.docx
+++ b/documents/HLM-template.docx
@@ -511,7 +511,6 @@
         <w:rPr>
           <w:rFonts w:cs="TimesNewRomanPSMT"/>
         </w:rPr>
-        <w:lastRenderedPageBreak/>
         <w:t xml:space="preserve">La présente convention a pour objet de fixer les droits et les obligations des parties prévus par les articles L. 353-1 à L. 353-17 du code de la construction et de l'habitation pour l'opération de </w:t>
       </w:r>
       <w:bookmarkStart w:id="11" w:name="NomProgramme2"/>
@@ -542,6 +541,7 @@
         <w:rPr>
           <w:rFonts w:cs="TimesNewRomanPSMT"/>
         </w:rPr>
+        <w:lastRenderedPageBreak/>
         <w:t>   {{ lot.nb_logements }} logement{{ lot.nb_logements|pl }} {{ lot.financement }}{% if not loop.last %},{% endif %}{% endfor %} {{adresse|inline_text_multiline }} à {{code_postal }},  {{ville }}</w:t>
       </w:r>
     </w:p>
@@ -860,8 +860,14 @@
         <w:rPr>
           <w:rFonts w:cs="TimesNewRomanPSMT"/>
         </w:rPr>
+        <w:t xml:space="preserve">Les logements objets de la présente convention sont soumis aux dispositions de la loi n° 89-462 du 6 juillet 1989 tendant à améliorer les rapports locatifs et portant modification de la loi n° 86-1290 du 23 décembre 1986, dans les conditions prévues par le III de son article 40 et le cas échéant le VIII du même article, aux dispositions </w:t>
+      </w:r>
+      <w:r>
+        <w:rPr>
+          <w:rFonts w:cs="TimesNewRomanPSMT"/>
+        </w:rPr>
         <w:lastRenderedPageBreak/>
-        <w:t>Les logements objets de la présente convention sont soumis aux dispositions de la loi n° 89-462 du 6 juillet 1989 tendant à améliorer les rapports locatifs et portant modification de la loi n° 86-1290 du 23 décembre 1986, dans les conditions prévues par le III de son article 40 et le cas échéant le VIII du même article, aux dispositions du code de la construction et de l'habitation et aux stipulations de la présente convention.</w:t>
+        <w:t>du code de la construction et de l'habitation et aux stipulations de la présente convention.</w:t>
       </w:r>
     </w:p>
     <w:p>
@@ -1151,51 +1157,45 @@
         <w:rPr>
           <w:rFonts w:cs="TimesNewRomanPSMT"/>
         </w:rPr>
-        <w:t xml:space="preserve">Les logements libres de toute occupation sont loués à des ménages dont les ressources annuelles n'excèdent pas les plafonds de ressources fixés à l'article R. 441-1 du code </w:t>
-      </w:r>
+        <w:t>Les logements libres de toute occupation sont loués à des ménages dont les ressources annuelles n'excèdent pas les plafonds de ressources fixés à l'article R. 441-1 du code de la construction et de l’habitation ou prévus au premier alinéa de l'article D. 331-12 du même code pour l'attribution des logements sociaux.</w:t>
+      </w:r>
+    </w:p>
+    <w:p>
+      <w:pPr>
+        <w:jc w:val="both"/>
+        <w:rPr>
+          <w:rFonts w:ascii="TimesNewRomanPSMT" w:hAnsi="TimesNewRomanPSMT" w:cs="TimesNewRomanPSMT"/>
+        </w:rPr>
+      </w:pPr>
+    </w:p>
+    <w:p>
+      <w:pPr>
+        <w:jc w:val="both"/>
+      </w:pPr>
+      <w:r>
+        <w:rPr>
+          <w:rFonts w:cs="TimesNewRomanPSMT"/>
+        </w:rPr>
+        <w:t>3°-Mixité sociale.</w:t>
+      </w:r>
+    </w:p>
+    <w:p>
+      <w:pPr>
+        <w:jc w:val="both"/>
+        <w:rPr>
+          <w:rFonts w:cs="TimesNewRomanPSMT"/>
+        </w:rPr>
+      </w:pPr>
+    </w:p>
+    <w:p>
+      <w:pPr>
+        <w:jc w:val="both"/>
+      </w:pPr>
       <w:r>
         <w:rPr>
           <w:rFonts w:cs="TimesNewRomanPSMT"/>
         </w:rPr>
         <w:lastRenderedPageBreak/>
-        <w:t>de la construction et de l’habitation ou prévus au premier alinéa de l'article D. 331-12 du même code pour l'attribution des logements sociaux.</w:t>
-      </w:r>
-    </w:p>
-    <w:p>
-      <w:pPr>
-        <w:jc w:val="both"/>
-        <w:rPr>
-          <w:rFonts w:ascii="TimesNewRomanPSMT" w:hAnsi="TimesNewRomanPSMT" w:cs="TimesNewRomanPSMT"/>
-        </w:rPr>
-      </w:pPr>
-    </w:p>
-    <w:p>
-      <w:pPr>
-        <w:jc w:val="both"/>
-      </w:pPr>
-      <w:r>
-        <w:rPr>
-          <w:rFonts w:cs="TimesNewRomanPSMT"/>
-        </w:rPr>
-        <w:t>3°-Mixité sociale.</w:t>
-      </w:r>
-    </w:p>
-    <w:p>
-      <w:pPr>
-        <w:jc w:val="both"/>
-        <w:rPr>
-          <w:rFonts w:cs="TimesNewRomanPSMT"/>
-        </w:rPr>
-      </w:pPr>
-    </w:p>
-    <w:p>
-      <w:pPr>
-        <w:jc w:val="both"/>
-      </w:pPr>
-      <w:r>
-        <w:rPr>
-          <w:rFonts w:cs="TimesNewRomanPSMT"/>
-        </w:rPr>
         <w:t>a) Lorsque l'opération a été financée dans les conditions de l'article D. 331-14 du code de la construction et de l’habitation autres que celles prévues au II de l'article D. 331-1 du même code et qu'elle bénéficie de subventions prévues aux 2° ou 3° de l'article R. 331-15 du même code, 30 % au moins des logements, soit</w:t>
       </w:r>
       <w:r>
@@ -1461,7 +1461,14 @@
         <w:rPr>
           <w:rFonts w:cs="TimesNewRomanPSMT"/>
         </w:rPr>
-        <w:t>4°-Cas d'une acquisition ou d'une convention sans travaux faisant suite à une nouvelle acquisition lorsque les loyers ne sont pas établis sur la base de la surface corrigée, résultant de l'application du décret n° 48-1766 du 22 novembre 1948 fixant les conditions de détermination de la surface corrigée des locaux d'habitation ou à usage professionnel et de l'article 4 du décret n° 60-1063 du 1er octobre 1960 modifiant le décret n° 48-1766 du 22 novembre 1948 fixant les conditions de détermination de la surface corrigée des locaux d'habitation ou à usage professionnel.</w:t>
+        <w:t xml:space="preserve">4°-Cas d'une acquisition ou d'une convention sans travaux faisant suite à une nouvelle acquisition lorsque les loyers ne sont pas établis sur la base de la surface corrigée, résultant de l'application du décret n° 48-1766 du 22 novembre 1948 fixant les conditions de détermination de la surface corrigée des locaux d'habitation ou à usage </w:t>
+      </w:r>
+      <w:r>
+        <w:rPr>
+          <w:rFonts w:cs="TimesNewRomanPSMT"/>
+        </w:rPr>
+        <w:lastRenderedPageBreak/>
+        <w:t>professionnel et de l'article 4 du décret n° 60-1063 du 1er octobre 1960 modifiant le décret n° 48-1766 du 22 novembre 1948 fixant les conditions de détermination de la surface corrigée des locaux d'habitation ou à usage professionnel.</w:t>
       </w:r>
     </w:p>
     <w:p>
@@ -1951,7 +1958,6 @@
         <w:rPr>
           <w:rFonts w:cs="TimesNewRomanPSMT"/>
         </w:rPr>
-        <w:lastRenderedPageBreak/>
         <w:t>Ce montant est majoré de 33 % pour les logements qui ont été attribués dans les conditions du b du 3° de l'article 8 de la présente convention.</w:t>
       </w:r>
     </w:p>
@@ -2365,14 +2371,7 @@
               <w:rPr>
                 <w:rFonts w:cs="TimesNewRomanPSMT"/>
               </w:rPr>
-              <w:t>get_lot_with_financement(‘PLUS’)%}{{co</w:t>
-            </w:r>
-            <w:r>
-              <w:rPr>
-                <w:rFonts w:cs="TimesNewRomanPSMT"/>
-              </w:rPr>
-              <w:lastRenderedPageBreak/>
-              <w:t>nvention.get_lot_with_financement(‘PLUS’).</w:t>
+              <w:t>get_lot_with_financement(‘PLUS’)%}{{convention.get_lot_with_financement(‘PLUS’).</w:t>
             </w:r>
             <w:r>
               <w:t xml:space="preserve"> </w:t>
@@ -2410,7 +2409,6 @@
               <w:rPr>
                 <w:rFonts w:cs="TimesNewRomanPSMT"/>
               </w:rPr>
-              <w:lastRenderedPageBreak/>
               <w:t>PLS</w:t>
             </w:r>
           </w:p>
@@ -2721,47 +2719,640 @@
           <w:i/>
           <w:iCs/>
         </w:rPr>
-        <w:t xml:space="preserve">Dispositions particulières relatives aux loyers pratiqués des logements conventionnés lors d'une acquisition ou d'une convention sans travaux faisant suite à une nouvelle acquisition lorsque les loyers ne sont pas établis sur la base de la surface corrigée, </w:t>
-      </w:r>
+        <w:t>Dispositions particulières relatives aux loyers pratiqués des logements conventionnés lors d'une acquisition ou d'une convention sans travaux faisant suite à une nouvelle acquisition lorsque les loyers ne sont pas établis sur la base de la surface corrigée, résultant de l'application du décret n° 48-1766 du 22 novembre 1948 fixant les conditions de détermination de la surface corrigée des locaux d'habitation ou à usage professionnel et de l'article 4 du décret n° 60-1063 du 1er octobre 1960 modifiant le décret n° 48-1766 du 22 novembre 1948 fixant les conditions de détermination de la surface corrigée des locaux d'habitation ou à usage professionnel</w:t>
+      </w:r>
+      <w:r>
+        <w:rPr>
+          <w:rFonts w:cs="TimesNewRomanPSMT"/>
+        </w:rPr>
+        <w:t>.</w:t>
+      </w:r>
+    </w:p>
+    <w:p>
+      <w:pPr>
+        <w:jc w:val="both"/>
+      </w:pPr>
+    </w:p>
+    <w:p>
+      <w:pPr>
+        <w:jc w:val="both"/>
+      </w:pPr>
+      <w:r>
+        <w:rPr>
+          <w:rFonts w:cs="TimesNewRomanPSMT"/>
+        </w:rPr>
+        <w:t>Durant le mois qui suit la signature de la convention, le bailleur informe les locataires ou occupants de bonne foi en place à la date de signature de la convention qu'ils disposent d'un délai de deux mois à compter de la réception de l'information pour présenter leurs justificatifs de revenus dans les conditions prévues pour l'attribution des logements sociaux et que ceux disposant de ressources</w:t>
+      </w:r>
+      <w:r>
+        <w:t xml:space="preserve"> </w:t>
+      </w:r>
+      <w:r>
+        <w:rPr>
+          <w:rFonts w:cs="TimesNewRomanPSMT"/>
+        </w:rPr>
+        <w:t xml:space="preserve">inférieures aux plafonds prévus </w:t>
+      </w:r>
+      <w:r>
+        <w:rPr>
+          <w:rFonts w:cs="TimesNewRomanPSMT"/>
+        </w:rPr>
+        <w:lastRenderedPageBreak/>
+        <w:t>à l'article D. 331-12 précité pour l'attribution des logements sociaux se verront appliquer, à partir de la réception par l'organisme des justificatifs et au plus tard le quatrième mois suivant la date de signature de la convention ou la date d'achèvement des travaux si celle-ci en prévoit, un nouveau loyer dans la limite du loyer maximum fixé au document prévu par l'article 1er de la présente convention. Avant l'application de ce nouveau loyer, le loyer maximum est celui mentionné à l'article 9 bis de la présente convention.</w:t>
+      </w:r>
+    </w:p>
+    <w:p>
+      <w:pPr>
+        <w:jc w:val="both"/>
+        <w:rPr>
+          <w:rFonts w:ascii="TimesNewRomanPSMT" w:hAnsi="TimesNewRomanPSMT" w:cs="TimesNewRomanPSMT"/>
+        </w:rPr>
+      </w:pPr>
+    </w:p>
+    <w:p>
+      <w:pPr>
+        <w:jc w:val="both"/>
+      </w:pPr>
+      <w:r>
+        <w:rPr>
+          <w:rFonts w:cs="TimesNewRomanPSMT"/>
+        </w:rPr>
+        <w:t>Le locataire ou occupant de bonne foi peut également présenter ces justificatifs à tout moment et bénéficier de la même mesure dès le mois qui suit la présentation de ces justificatifs.</w:t>
+      </w:r>
+    </w:p>
+    <w:p>
+      <w:pPr>
+        <w:jc w:val="both"/>
+        <w:rPr>
+          <w:rFonts w:cs="TimesNewRomanPSMT"/>
+        </w:rPr>
+      </w:pPr>
+    </w:p>
+    <w:p>
+      <w:pPr>
+        <w:jc w:val="both"/>
+      </w:pPr>
+      <w:r>
+        <w:rPr>
+          <w:rFonts w:cs="TimesNewRomanPSMT"/>
+        </w:rPr>
+        <w:t>Le loyer pratiqué applicable à chaque logement occupé par un locataire ou un occupant de bonne foi dont les ressources excèdent les plafonds de ressources prévus à l'article D. 331-12 précité pour l'attribution des logements sociaux au moment de l'acquisition ou qui n'a pas fourni d'informations sur le niveau de ses ressources ne peut excéder le loyer maximum fixé à l'article 9 bis de la présente convention. Il peut être révisé chaque année le 1er janvier dans les conditions prévues à l’article L. 353-9-3 précité.</w:t>
+      </w:r>
+    </w:p>
+    <w:p>
+      <w:pPr>
+        <w:jc w:val="both"/>
+        <w:rPr>
+          <w:rFonts w:ascii="TimesNewRomanPSMT" w:hAnsi="TimesNewRomanPSMT" w:cs="TimesNewRomanPSMT"/>
+        </w:rPr>
+      </w:pPr>
+    </w:p>
+    <w:p>
+      <w:pPr>
+        <w:jc w:val="both"/>
+        <w:rPr>
+          <w:rFonts w:ascii="TimesNewRomanPSMT" w:hAnsi="TimesNewRomanPSMT" w:cs="TimesNewRomanPSMT"/>
+        </w:rPr>
+      </w:pPr>
+    </w:p>
+    <w:p>
+      <w:pPr>
+        <w:jc w:val="center"/>
+      </w:pPr>
+      <w:r>
+        <w:rPr>
+          <w:rFonts w:cs="TimesNewRomanPS-BoldMT"/>
+          <w:b/>
+        </w:rPr>
+        <w:t>III.-Engagements du bailleur à l'égard des locataires.</w:t>
+      </w:r>
+    </w:p>
+    <w:p>
+      <w:pPr>
+        <w:rPr>
+          <w:rFonts w:cs="TimesNewRomanPS-BoldMT"/>
+          <w:b/>
+        </w:rPr>
+      </w:pPr>
+    </w:p>
+    <w:p>
+      <w:pPr>
+        <w:jc w:val="center"/>
+      </w:pPr>
+      <w:r>
+        <w:rPr>
+          <w:rFonts w:cs="TimesNewRomanPSMT"/>
+        </w:rPr>
+        <w:t>Article 11.</w:t>
+      </w:r>
+    </w:p>
+    <w:p>
+      <w:pPr>
+        <w:rPr>
+          <w:rFonts w:cs="TimesNewRomanPSMT"/>
+        </w:rPr>
+      </w:pPr>
+    </w:p>
+    <w:p>
+      <w:pPr>
+        <w:jc w:val="center"/>
+      </w:pPr>
       <w:r>
         <w:rPr>
           <w:rFonts w:cs="TimesNewRomanPSMT"/>
           <w:i/>
           <w:iCs/>
         </w:rPr>
+        <w:t>Établissement d'un bail conforme à la convention.</w:t>
+      </w:r>
+    </w:p>
+    <w:p>
+      <w:pPr>
+        <w:jc w:val="both"/>
+        <w:rPr>
+          <w:rFonts w:cs="TimesNewRomanPSMT"/>
+        </w:rPr>
+      </w:pPr>
+    </w:p>
+    <w:p>
+      <w:pPr>
+        <w:jc w:val="both"/>
+      </w:pPr>
+      <w:r>
+        <w:rPr>
+          <w:rFonts w:cs="TimesNewRomanPSMT"/>
+        </w:rPr>
+        <w:t>Le bail doit être conforme à la présente convention. Une copie de la convention est tenue en permanence à la disposition des locataires et de leurs associations qui peuvent en prendre connaissance chez le gardien ou, en l'absence d'un gardien, au siège du bailleur. Cette information est mentionnée à chaque locataire ou affichée de façon très apparente dans les parties communes de l'immeuble.</w:t>
+      </w:r>
+    </w:p>
+    <w:p>
+      <w:pPr>
+        <w:jc w:val="both"/>
+        <w:rPr>
+          <w:rFonts w:cs="TimesNewRomanPSMT"/>
+        </w:rPr>
+      </w:pPr>
+    </w:p>
+    <w:p>
+      <w:pPr>
+        <w:jc w:val="both"/>
+      </w:pPr>
+      <w:r>
+        <w:rPr>
+          <w:rFonts w:cs="TimesNewRomanPSMT"/>
+        </w:rPr>
+        <w:t>Le bailleur est tenu de remettre à chaque locataire un décompte de surface utile établi d'après le modèle type annexé à l'article D. 353-19 du code de la construction et de l’habitation. Dans l'hypothèse où cette surface serait modifiée, le bailleur est tenu de communiquer au locataire un nouveau décompte dans les deux mois précédant son application.</w:t>
+      </w:r>
+    </w:p>
+    <w:p>
+      <w:pPr>
+        <w:jc w:val="both"/>
+        <w:rPr>
+          <w:rFonts w:ascii="TimesNewRomanPSMT" w:hAnsi="TimesNewRomanPSMT" w:cs="TimesNewRomanPSMT"/>
+        </w:rPr>
+      </w:pPr>
+    </w:p>
+    <w:p>
+      <w:pPr>
+        <w:jc w:val="center"/>
+      </w:pPr>
+      <w:r>
+        <w:rPr>
+          <w:rFonts w:cs="TimesNewRomanPSMT"/>
+        </w:rPr>
+        <w:t>Article 12.</w:t>
+      </w:r>
+    </w:p>
+    <w:p>
+      <w:pPr>
+        <w:rPr>
+          <w:rFonts w:cs="TimesNewRomanPSMT"/>
+        </w:rPr>
+      </w:pPr>
+    </w:p>
+    <w:p>
+      <w:pPr>
+        <w:jc w:val="center"/>
+      </w:pPr>
+      <w:r>
+        <w:rPr>
+          <w:rFonts w:cs="TimesNewRomanPSMT"/>
+          <w:i/>
+          <w:iCs/>
+        </w:rPr>
+        <w:t>Travaux.</w:t>
+      </w:r>
+    </w:p>
+    <w:p>
+      <w:pPr>
+        <w:jc w:val="both"/>
+        <w:rPr>
+          <w:rFonts w:cs="TimesNewRomanPSMT"/>
+        </w:rPr>
+      </w:pPr>
+    </w:p>
+    <w:p>
+      <w:pPr>
+        <w:jc w:val="both"/>
+      </w:pPr>
+      <w:r>
+        <w:rPr>
+          <w:rFonts w:cs="TimesNewRomanPSMT"/>
+        </w:rPr>
+        <w:t>Lorsque l'exécution des travaux nécessite l'évacuation temporaire des lieux, l'organisme bailleur doit mettre provisoirement à la disposition du locataire un logement en bon état d'habitation remplissant des conditions d'hygiène normales, correspondant à ses besoins personnels ou familiaux et, le cas échéant, professionnels, ainsi qu'à ses possibilités. Il doit en outre être situé :</w:t>
+      </w:r>
+    </w:p>
+    <w:p>
+      <w:pPr>
+        <w:jc w:val="both"/>
+      </w:pPr>
+      <w:r>
+        <w:rPr>
+          <w:rFonts w:cs="TimesNewRomanPSMT"/>
+        </w:rPr>
+        <w:t>- dans le même arrondissement ou les arrondissements limitrophes ou les communes limitrophes de l'arrondissement où se trouve le local, objet de la reprise, si celui-ci est situé dans une commune divisée en arrondissements ;</w:t>
+      </w:r>
+    </w:p>
+    <w:p>
+      <w:pPr>
+        <w:jc w:val="both"/>
+        <w:rPr>
+          <w:rFonts w:cs="TimesNewRomanPSMT"/>
+        </w:rPr>
+      </w:pPr>
+    </w:p>
+    <w:p>
+      <w:pPr>
+        <w:jc w:val="both"/>
+      </w:pPr>
+      <w:r>
+        <w:rPr>
+          <w:rFonts w:cs="TimesNewRomanPSMT"/>
+        </w:rPr>
+        <w:t>- dans le même canton ou dans les cantons limitrophes de ce canton inclus dans la même commune ou dans les communes limitrophes de ce canton, si la commune est divisée en cantons ;</w:t>
+      </w:r>
+    </w:p>
+    <w:p>
+      <w:pPr>
+        <w:jc w:val="both"/>
+        <w:rPr>
+          <w:rFonts w:cs="TimesNewRomanPSMT"/>
+        </w:rPr>
+      </w:pPr>
+    </w:p>
+    <w:p>
+      <w:pPr>
+        <w:jc w:val="both"/>
+      </w:pPr>
+      <w:r>
+        <w:rPr>
+          <w:rFonts w:cs="TimesNewRomanPSMT"/>
+        </w:rPr>
+        <w:t>- dans les autres cas, sur le territoire de la même commune ou d'une commune limitrophe, sans pouvoir être éloigné de plus de cinq kilomètres.</w:t>
+      </w:r>
+    </w:p>
+    <w:p>
+      <w:pPr>
+        <w:jc w:val="both"/>
+        <w:rPr>
+          <w:rFonts w:ascii="TimesNewRomanPSMT" w:hAnsi="TimesNewRomanPSMT" w:cs="TimesNewRomanPSMT"/>
+        </w:rPr>
+      </w:pPr>
+    </w:p>
+    <w:p>
+      <w:pPr>
+        <w:jc w:val="center"/>
+      </w:pPr>
+      <w:r>
+        <w:rPr>
+          <w:rFonts w:cs="TimesNewRomanPSMT"/>
+        </w:rPr>
+        <w:t>Article 13.</w:t>
+      </w:r>
+    </w:p>
+    <w:p>
+      <w:pPr>
+        <w:rPr>
+          <w:rFonts w:cs="TimesNewRomanPSMT"/>
+        </w:rPr>
+      </w:pPr>
+    </w:p>
+    <w:p>
+      <w:pPr>
+        <w:jc w:val="center"/>
+      </w:pPr>
+      <w:r>
+        <w:rPr>
+          <w:rFonts w:cs="TimesNewRomanPSMT"/>
+          <w:i/>
+          <w:iCs/>
+        </w:rPr>
+        <w:t>Information des locataires en cas de changement de propriétaire.</w:t>
+      </w:r>
+    </w:p>
+    <w:p>
+      <w:pPr>
+        <w:jc w:val="both"/>
+        <w:rPr>
+          <w:rFonts w:cs="TimesNewRomanPSMT"/>
+        </w:rPr>
+      </w:pPr>
+    </w:p>
+    <w:p>
+      <w:pPr>
+        <w:jc w:val="both"/>
+      </w:pPr>
+      <w:r>
+        <w:rPr>
+          <w:rFonts w:cs="TimesNewRomanPSMT"/>
+        </w:rPr>
+        <w:t>En cas de mutation à titre gratuit ou onéreux, et en vue de l'information du préfet ou, le cas échéant, du président de l'établissement public de coopération intercommunale, du conseil départemental, de la métropole de Lyon ou du conseil exécutif de Corse, partie à la présente convention, des locataires et des organismes liquidateurs de l'APL, le ou les nouveaux propriétaires leur font connaître leur identification dans les conditions conformes soit à l'article 5, soit à l'article 6 du décret n° 55-22 du</w:t>
+      </w:r>
+    </w:p>
+    <w:p>
+      <w:pPr>
+        <w:jc w:val="both"/>
+      </w:pPr>
+      <w:r>
+        <w:rPr>
+          <w:rFonts w:cs="TimesNewRomanPSMT"/>
+        </w:rPr>
+        <w:t>4 janvier 1955 modifié, par acte extrajudiciaire, lettre recommandée avec demande d'avis de réception ou remise contre décharge dans un délai d'un mois à compter de ladite mutation.</w:t>
+      </w:r>
+    </w:p>
+    <w:p>
+      <w:pPr>
+        <w:jc w:val="both"/>
+        <w:rPr>
+          <w:rFonts w:ascii="TimesNewRomanPSMT" w:hAnsi="TimesNewRomanPSMT" w:cs="TimesNewRomanPSMT"/>
+        </w:rPr>
+      </w:pPr>
+    </w:p>
+    <w:p>
+      <w:pPr>
+        <w:jc w:val="center"/>
+      </w:pPr>
+      <w:r>
+        <w:rPr>
+          <w:rFonts w:cs="TimesNewRomanPSMT"/>
+        </w:rPr>
+        <w:t>Article 14.</w:t>
+      </w:r>
+    </w:p>
+    <w:p>
+      <w:pPr>
+        <w:rPr>
+          <w:rFonts w:cs="TimesNewRomanPSMT"/>
+        </w:rPr>
+      </w:pPr>
+    </w:p>
+    <w:p>
+      <w:pPr>
+        <w:jc w:val="center"/>
+      </w:pPr>
+      <w:r>
+        <w:rPr>
+          <w:rFonts w:cs="TimesNewRomanPSMT"/>
+          <w:i/>
+          <w:iCs/>
+        </w:rPr>
+        <w:t>Information des locataires en cas de modification ou de résiliation de la convention.</w:t>
+      </w:r>
+    </w:p>
+    <w:p>
+      <w:pPr>
+        <w:jc w:val="both"/>
+        <w:rPr>
+          <w:rFonts w:cs="TimesNewRomanPSMT"/>
+        </w:rPr>
+      </w:pPr>
+    </w:p>
+    <w:p>
+      <w:pPr>
+        <w:jc w:val="both"/>
+      </w:pPr>
+      <w:r>
+        <w:rPr>
+          <w:rFonts w:cs="TimesNewRomanPSMT"/>
+        </w:rPr>
+        <w:t>Le bailleur informe les locataires de toute modification apportée à la convention ayant des incidences sur leurs relations contractuelles.</w:t>
+      </w:r>
+    </w:p>
+    <w:p>
+      <w:pPr>
+        <w:jc w:val="both"/>
+        <w:rPr>
+          <w:rFonts w:cs="TimesNewRomanPSMT"/>
+        </w:rPr>
+      </w:pPr>
+    </w:p>
+    <w:p>
+      <w:pPr>
+        <w:jc w:val="both"/>
+      </w:pPr>
+      <w:r>
+        <w:rPr>
+          <w:rFonts w:cs="TimesNewRomanPSMT"/>
+        </w:rPr>
+        <w:t>Quelle qu'en soit la cause, le bailleur informe le locataire de la date prévue pour l'expiration de la convention. En cas de résiliation de la convention aux torts du bailleur, il porte à la connaissance des locataires la teneur de l'article L. 353-6 du code de la construction et de l'habitation.</w:t>
+      </w:r>
+    </w:p>
+    <w:p>
+      <w:pPr>
+        <w:jc w:val="both"/>
+        <w:rPr>
+          <w:rFonts w:cs="TimesNewRomanPSMT"/>
+        </w:rPr>
+      </w:pPr>
+    </w:p>
+    <w:p>
+      <w:pPr>
+        <w:jc w:val="center"/>
+      </w:pPr>
+      <w:r>
+        <w:rPr>
+          <w:rFonts w:cs="TimesNewRomanPSMT"/>
+        </w:rPr>
+        <w:t>Article 15.</w:t>
+      </w:r>
+    </w:p>
+    <w:p>
+      <w:pPr>
+        <w:rPr>
+          <w:rFonts w:cs="TimesNewRomanPSMT"/>
+        </w:rPr>
+      </w:pPr>
+    </w:p>
+    <w:p>
+      <w:pPr>
+        <w:jc w:val="center"/>
+      </w:pPr>
+      <w:r>
+        <w:rPr>
+          <w:rFonts w:cs="TimesNewRomanPSMT"/>
+          <w:i/>
+          <w:iCs/>
+        </w:rPr>
+        <w:t>Maintien dans les lieux et congé donné par le locataire.</w:t>
+      </w:r>
+    </w:p>
+    <w:p>
+      <w:pPr>
+        <w:jc w:val="both"/>
+        <w:rPr>
+          <w:rFonts w:cs="TimesNewRomanPSMT"/>
+        </w:rPr>
+      </w:pPr>
+    </w:p>
+    <w:p>
+      <w:pPr>
+        <w:jc w:val="both"/>
+      </w:pPr>
+      <w:r>
+        <w:rPr>
+          <w:rFonts w:cs="TimesNewRomanPSMT"/>
+        </w:rPr>
+        <w:t>Pendant la durée de la convention, le locataire bénéficie du droit au maintien dans les lieux dans les conditions de l'article L. 353-15 du code de la construction et de l’habitation, dans la mesure où il se conforme aux obligations de l'article 7 de la loi du 6 juillet 1989 précitée, sauf dénonciation expresse du locataire dans les conditions des treizième à vingt-deuxième alinéas du I de l'article 15 de la loi du 6 juillet 1989 précitée.</w:t>
+      </w:r>
+    </w:p>
+    <w:p>
+      <w:pPr>
+        <w:jc w:val="both"/>
+        <w:rPr>
+          <w:rFonts w:cs="TimesNewRomanPSMT"/>
+        </w:rPr>
+      </w:pPr>
+    </w:p>
+    <w:p>
+      <w:pPr>
+        <w:jc w:val="both"/>
+      </w:pPr>
+      <w:r>
+        <w:rPr>
+          <w:rFonts w:cs="TimesNewRomanPSMT"/>
+        </w:rPr>
+        <w:t>Le locataire peut donner congé à tout moment. Il est redevable du loyer et des charges pendant la durée effective du délai de préavis, de jour à jour, sauf si le logement se trouve occupé avant la fin du préavis par un autre locataire en accord avec le bailleur</w:t>
+      </w:r>
+      <w:r>
+        <w:rPr>
+          <w:rFonts w:ascii="TimesNewRomanPSMT" w:hAnsi="TimesNewRomanPSMT" w:cs="TimesNewRomanPSMT"/>
+        </w:rPr>
+        <w:t>.</w:t>
+      </w:r>
+    </w:p>
+    <w:p>
+      <w:pPr>
+        <w:jc w:val="both"/>
+        <w:rPr>
+          <w:rFonts w:ascii="TimesNewRomanPSMT" w:hAnsi="TimesNewRomanPSMT" w:cs="TimesNewRomanPSMT"/>
+        </w:rPr>
+      </w:pPr>
+    </w:p>
+    <w:p>
+      <w:pPr>
+        <w:jc w:val="center"/>
+      </w:pPr>
+      <w:r>
+        <w:rPr>
+          <w:rFonts w:cs="TimesNewRomanPSMT"/>
+        </w:rPr>
+        <w:t>Article 16.</w:t>
+      </w:r>
+    </w:p>
+    <w:p>
+      <w:pPr>
+        <w:rPr>
+          <w:rFonts w:cs="TimesNewRomanPSMT"/>
+        </w:rPr>
+      </w:pPr>
+    </w:p>
+    <w:p>
+      <w:pPr>
+        <w:jc w:val="center"/>
+      </w:pPr>
+      <w:r>
+        <w:rPr>
+          <w:rFonts w:cs="TimesNewRomanPSMT"/>
+          <w:i/>
+          <w:iCs/>
+        </w:rPr>
         <w:lastRenderedPageBreak/>
-        <w:t>résultant de l'application du décret n° 48-1766 du 22 novembre 1948 fixant les conditions de détermination de la surface corrigée des locaux d'habitation ou à usage professionnel et de l'article 4 du décret n° 60-1063 du 1er octobre 1960 modifiant le décret n° 48-1766 du 22 novembre 1948 fixant les conditions de détermination de la surface corrigée des locaux d'habitation ou à usage professionnel</w:t>
-      </w:r>
-      <w:r>
-        <w:rPr>
-          <w:rFonts w:cs="TimesNewRomanPSMT"/>
-        </w:rPr>
-        <w:t>.</w:t>
-      </w:r>
-    </w:p>
-    <w:p>
-      <w:pPr>
-        <w:jc w:val="both"/>
-      </w:pPr>
-    </w:p>
-    <w:p>
-      <w:pPr>
-        <w:jc w:val="both"/>
-      </w:pPr>
-      <w:r>
-        <w:rPr>
-          <w:rFonts w:cs="TimesNewRomanPSMT"/>
-        </w:rPr>
-        <w:t>Durant le mois qui suit la signature de la convention, le bailleur informe les locataires ou occupants de bonne foi en place à la date de signature de la convention qu'ils disposent d'un délai de deux mois à compter de la réception de l'information pour présenter leurs justificatifs de revenus dans les conditions prévues pour l'attribution des logements sociaux et que ceux disposant de ressources</w:t>
-      </w:r>
-      <w:r>
-        <w:t xml:space="preserve"> </w:t>
-      </w:r>
-      <w:r>
-        <w:rPr>
-          <w:rFonts w:cs="TimesNewRomanPSMT"/>
-        </w:rPr>
-        <w:t>inférieures aux plafonds prévus à l'article D. 331-12 précité pour l'attribution des logements sociaux se verront appliquer, à partir de la réception par l'organisme des justificatifs et au plus tard le quatrième mois suivant la date de signature de la convention ou la date d'achèvement des travaux si celle-ci en prévoit, un nouveau loyer dans la limite du loyer maximum fixé au document prévu par l'article 1er de la présente convention. Avant l'application de ce nouveau loyer, le loyer maximum est celui mentionné à l'article 9 bis de la présente convention.</w:t>
+        <w:t>Modalités du paiement du loyer.</w:t>
+      </w:r>
+    </w:p>
+    <w:p>
+      <w:pPr>
+        <w:jc w:val="both"/>
+        <w:rPr>
+          <w:rFonts w:cs="TimesNewRomanPSMT"/>
+        </w:rPr>
+      </w:pPr>
+    </w:p>
+    <w:p>
+      <w:pPr>
+        <w:jc w:val="both"/>
+      </w:pPr>
+      <w:r>
+        <w:rPr>
+          <w:rFonts w:cs="TimesNewRomanPSMT"/>
+        </w:rPr>
+        <w:t>Le loyer est payé mensuellement à terme échu.</w:t>
+      </w:r>
+    </w:p>
+    <w:p>
+      <w:pPr>
+        <w:jc w:val="both"/>
+        <w:rPr>
+          <w:rFonts w:cs="TimesNewRomanPSMT"/>
+        </w:rPr>
+      </w:pPr>
+    </w:p>
+    <w:p>
+      <w:pPr>
+        <w:jc w:val="both"/>
+      </w:pPr>
+      <w:r>
+        <w:rPr>
+          <w:rFonts w:cs="TimesNewRomanPSMT"/>
+        </w:rPr>
+        <w:t>Le bailleur indique sur la quittance le montant du loyer principal, du ou des loyers accessoires, du loyer maximum, des charges locatives et, le cas échéant, le montant de l'APL, de la réduction de loyer de solidarité et de la contribution pour le partage des économies de charges.</w:t>
+      </w:r>
+    </w:p>
+    <w:p>
+      <w:pPr>
+        <w:jc w:val="both"/>
+        <w:rPr>
+          <w:rFonts w:cs="TimesNewRomanPSMT"/>
+        </w:rPr>
+      </w:pPr>
+    </w:p>
+    <w:p>
+      <w:pPr>
+        <w:jc w:val="both"/>
+      </w:pPr>
+      <w:r>
+        <w:rPr>
+          <w:rFonts w:cs="TimesNewRomanPSMT"/>
+        </w:rPr>
+        <w:t>En application de l'article L. 832-2 du code de la construction et de l'habitation, pour chaque appel de loyer, le bailleur déduit s'il y a lieu le montant de l'APL qu'il perçoit pour le compte du locataire du montant du loyer et des dépenses accessoires de logement.</w:t>
+      </w:r>
+    </w:p>
+    <w:p>
+      <w:pPr>
+        <w:jc w:val="both"/>
+        <w:rPr>
+          <w:rFonts w:cs="TimesNewRomanPSMT"/>
+        </w:rPr>
+      </w:pPr>
+    </w:p>
+    <w:p>
+      <w:pPr>
+        <w:jc w:val="both"/>
+      </w:pPr>
+      <w:r>
+        <w:rPr>
+          <w:rFonts w:cs="TimesNewRomanPSMT"/>
+        </w:rPr>
+        <w:t>Lorsque l'organisme liquidateur de l'APL verse au bailleur des rappels d'aide personnalisée pour le compte de locataires, le bailleur affecte ces sommes au compte de ces derniers. Si après affectation il en résulte un surplus, le bailleur le reverse au locataire dans le délai d'un mois.</w:t>
       </w:r>
     </w:p>
     <w:p>
@@ -2780,26 +3371,84 @@
         <w:rPr>
           <w:rFonts w:cs="TimesNewRomanPSMT"/>
         </w:rPr>
-        <w:t>Le locataire ou occupant de bonne foi peut également présenter ces justificatifs à tout moment et bénéficier de la même mesure dès le mois qui suit la présentation de ces justificatifs.</w:t>
-      </w:r>
-    </w:p>
-    <w:p>
-      <w:pPr>
-        <w:jc w:val="both"/>
-        <w:rPr>
-          <w:rFonts w:cs="TimesNewRomanPSMT"/>
-        </w:rPr>
-      </w:pPr>
-    </w:p>
-    <w:p>
-      <w:pPr>
-        <w:jc w:val="both"/>
-      </w:pPr>
-      <w:r>
-        <w:rPr>
-          <w:rFonts w:cs="TimesNewRomanPSMT"/>
-        </w:rPr>
-        <w:t>Le loyer pratiqué applicable à chaque logement occupé par un locataire ou un occupant de bonne foi dont les ressources excèdent les plafonds de ressources prévus à l'article D. 331-12 précité pour l'attribution des logements sociaux au moment de l'acquisition ou qui n'a pas fourni d'informations sur le niveau de ses ressources ne peut excéder le loyer maximum fixé à l'article 9 bis de la présente convention. Il peut être révisé chaque année le 1er janvier dans les conditions prévues à l’article L. 353-9-3 précité.</w:t>
+        <w:t>En cas de retard du locataire dans le paiement du loyer et des charges locatives, le bailleur doit prendre toutes dispositions en vue de recouvrer sa créance.</w:t>
+      </w:r>
+    </w:p>
+    <w:p>
+      <w:pPr>
+        <w:jc w:val="both"/>
+        <w:rPr>
+          <w:rFonts w:cs="TimesNewRomanPSMT"/>
+        </w:rPr>
+      </w:pPr>
+    </w:p>
+    <w:p>
+      <w:pPr>
+        <w:jc w:val="both"/>
+      </w:pPr>
+      <w:r>
+        <w:rPr>
+          <w:rFonts w:cs="TimesNewRomanPSMT"/>
+        </w:rPr>
+        <w:t>En cas d'impayé constitué au sens de l'article R. 824-1 du code de la construction et de l’habitation, et lorsque l'APL est versée en tiers payant, le bailleur doit informer l’organisme payeur de la situation du locataire dans un délai de deux mois après la constitution de l’impayé.</w:t>
+      </w:r>
+    </w:p>
+    <w:p>
+      <w:pPr>
+        <w:jc w:val="both"/>
+        <w:rPr>
+          <w:rFonts w:cs="TimesNewRomanPSMT"/>
+        </w:rPr>
+      </w:pPr>
+    </w:p>
+    <w:p>
+      <w:pPr>
+        <w:jc w:val="center"/>
+      </w:pPr>
+      <w:r>
+        <w:rPr>
+          <w:rFonts w:cs="TimesNewRomanPSMT"/>
+        </w:rPr>
+        <w:t>Article 17.</w:t>
+      </w:r>
+    </w:p>
+    <w:p>
+      <w:pPr>
+        <w:rPr>
+          <w:rFonts w:cs="TimesNewRomanPSMT"/>
+        </w:rPr>
+      </w:pPr>
+    </w:p>
+    <w:p>
+      <w:pPr>
+        <w:jc w:val="center"/>
+      </w:pPr>
+      <w:r>
+        <w:rPr>
+          <w:rFonts w:cs="TimesNewRomanPSMT"/>
+          <w:i/>
+          <w:iCs/>
+        </w:rPr>
+        <w:t>Dépôt de garantie.</w:t>
+      </w:r>
+    </w:p>
+    <w:p>
+      <w:pPr>
+        <w:jc w:val="both"/>
+        <w:rPr>
+          <w:rFonts w:cs="TimesNewRomanPSMT"/>
+        </w:rPr>
+      </w:pPr>
+    </w:p>
+    <w:p>
+      <w:pPr>
+        <w:jc w:val="both"/>
+      </w:pPr>
+      <w:r>
+        <w:rPr>
+          <w:rFonts w:cs="TimesNewRomanPSMT"/>
+        </w:rPr>
+        <w:t>Le dépôt de garantie stipulé le cas échéant par le contrat de location pour garantir l'exécution de ses obligations locatives par le locataire ne peut être supérieur à un mois de loyer en principal.</w:t>
       </w:r>
     </w:p>
     <w:p>
@@ -2827,7 +3476,7 @@
           <w:rFonts w:cs="TimesNewRomanPS-BoldMT"/>
           <w:b/>
         </w:rPr>
-        <w:t>III.-Engagements du bailleur à l'égard des locataires.</w:t>
+        <w:t>IV.-Dispositions spécifiques au statut de résidence universitaire.</w:t>
       </w:r>
     </w:p>
     <w:p>
@@ -2846,7 +3495,7 @@
         <w:rPr>
           <w:rFonts w:cs="TimesNewRomanPSMT"/>
         </w:rPr>
-        <w:t>Article 11.</w:t>
+        <w:t>Article 18.</w:t>
       </w:r>
     </w:p>
     <w:p>
@@ -2866,45 +3515,84 @@
           <w:i/>
           <w:iCs/>
         </w:rPr>
-        <w:t>Établissement d'un bail conforme à la convention.</w:t>
-      </w:r>
-    </w:p>
-    <w:p>
-      <w:pPr>
-        <w:jc w:val="both"/>
-        <w:rPr>
-          <w:rFonts w:cs="TimesNewRomanPSMT"/>
-        </w:rPr>
-      </w:pPr>
-    </w:p>
-    <w:p>
-      <w:pPr>
-        <w:jc w:val="both"/>
-      </w:pPr>
-      <w:r>
-        <w:rPr>
-          <w:rFonts w:cs="TimesNewRomanPSMT"/>
-        </w:rPr>
-        <w:t>Le bail doit être conforme à la présente convention. Une copie de la convention est tenue en permanence à la disposition des locataires et de leurs associations qui peuvent en prendre connaissance chez le gardien ou, en l'absence d'un gardien, au siège du bailleur. Cette information est mentionnée à chaque locataire ou affichée de façon très apparente dans les parties communes de l'immeuble.</w:t>
-      </w:r>
-    </w:p>
-    <w:p>
-      <w:pPr>
-        <w:jc w:val="both"/>
-        <w:rPr>
-          <w:rFonts w:cs="TimesNewRomanPSMT"/>
-        </w:rPr>
-      </w:pPr>
-    </w:p>
-    <w:p>
-      <w:pPr>
-        <w:jc w:val="both"/>
-      </w:pPr>
-      <w:r>
-        <w:rPr>
-          <w:rFonts w:cs="TimesNewRomanPSMT"/>
-        </w:rPr>
-        <w:t>Le bailleur est tenu de remettre à chaque locataire un décompte de surface utile établi d'après le modèle type annexé à l'article D. 353-19 du code de la construction et de l’habitation. Dans l'hypothèse où cette surface serait modifiée, le bailleur est tenu de communiquer au locataire un nouveau décompte dans les deux mois précédant son application.</w:t>
+        <w:t>Régime des rapports locatifs applicables aux logements.</w:t>
+      </w:r>
+    </w:p>
+    <w:p>
+      <w:pPr>
+        <w:jc w:val="both"/>
+        <w:rPr>
+          <w:rFonts w:cs="TimesNewRomanPSMT"/>
+        </w:rPr>
+      </w:pPr>
+    </w:p>
+    <w:p>
+      <w:pPr>
+        <w:jc w:val="both"/>
+      </w:pPr>
+      <w:r>
+        <w:rPr>
+          <w:rFonts w:cs="TimesNewRomanPSMT"/>
+        </w:rPr>
+        <w:t>Lorsque la présente convention est conclue en application de l’article L. 353-1 et du 3° de l’article L. 831-1 du code de la construction et de l'habitation pour une résidence universitaire définie à l'article L. 631-12 du même code, les logements de la résidence universitaire sont soumis aux dispositions de la loi n° 89-462 du 6 juillet 1989 tendant à améliorer les rapports locatifs, dans les conditions prévues par les III et VIII de l’article 40, aux dispositions du code de la construction et de l'habitation et aux stipulations de la présente convention.</w:t>
+      </w:r>
+    </w:p>
+    <w:p>
+      <w:pPr>
+        <w:jc w:val="both"/>
+        <w:rPr>
+          <w:rFonts w:cs="TimesNewRomanPSMT"/>
+        </w:rPr>
+      </w:pPr>
+    </w:p>
+    <w:p>
+      <w:pPr>
+        <w:jc w:val="both"/>
+      </w:pPr>
+      <w:r>
+        <w:rPr>
+          <w:rFonts w:cs="TimesNewRomanPSMT"/>
+        </w:rPr>
+        <w:lastRenderedPageBreak/>
+        <w:t>Les stipulations particulières suivantes s’appliquent :</w:t>
+      </w:r>
+    </w:p>
+    <w:p>
+      <w:pPr>
+        <w:jc w:val="both"/>
+        <w:rPr>
+          <w:rFonts w:cs="TimesNewRomanPSMT"/>
+        </w:rPr>
+      </w:pPr>
+    </w:p>
+    <w:p>
+      <w:pPr>
+        <w:jc w:val="both"/>
+      </w:pPr>
+      <w:r>
+        <w:rPr>
+          <w:rFonts w:cs="TimesNewRomanPSMT"/>
+        </w:rPr>
+        <w:t>1°- Conditions de location des logements de la résidence universitaire.</w:t>
+      </w:r>
+    </w:p>
+    <w:p>
+      <w:pPr>
+        <w:jc w:val="both"/>
+        <w:rPr>
+          <w:rFonts w:cs="TimesNewRomanPSMT"/>
+        </w:rPr>
+      </w:pPr>
+    </w:p>
+    <w:p>
+      <w:pPr>
+        <w:jc w:val="both"/>
+      </w:pPr>
+      <w:r>
+        <w:rPr>
+          <w:rFonts w:cs="TimesNewRomanPSMT"/>
+        </w:rPr>
+        <w:t>Les logements sont loués nus ou meublés à des étudiants, des personnes de moins de trente ans en formation ou en stage et des personnes titulaires d'un contrat de professionnalisation ou d'apprentissage, à titre de résidence principale, et occupés au moins huit mois par an. A titre exceptionnel, des logements peuvent être loués à des enseignants et des chercheurs.</w:t>
       </w:r>
     </w:p>
     <w:p>
@@ -2917,13 +3605,263 @@
     </w:p>
     <w:p>
       <w:pPr>
+        <w:jc w:val="both"/>
+      </w:pPr>
+      <w:r>
+        <w:rPr>
+          <w:rFonts w:cs="TimesNewRomanPSMT"/>
+        </w:rPr>
+        <w:t>Les logements peuvent également être loués dans les conditions prévues aux quatrième et cinquième alinéas du I de l’article L. 442-8-1 du code de la construction et de l’habitation.</w:t>
+      </w:r>
+    </w:p>
+    <w:p>
+      <w:pPr>
+        <w:jc w:val="both"/>
+        <w:rPr>
+          <w:rFonts w:cs="TimesNewRomanPSMT"/>
+        </w:rPr>
+      </w:pPr>
+    </w:p>
+    <w:p>
+      <w:pPr>
+        <w:jc w:val="both"/>
+      </w:pPr>
+      <w:r>
+        <w:rPr>
+          <w:rFonts w:cs="TimesNewRomanPSMT"/>
+        </w:rPr>
+        <w:t>2°- Modalités de fixation et de révision du loyer pratiqué des logements de la résidence universitaire.</w:t>
+      </w:r>
+    </w:p>
+    <w:p>
+      <w:pPr>
+        <w:jc w:val="both"/>
+        <w:rPr>
+          <w:rFonts w:cs="TimesNewRomanPSMT"/>
+        </w:rPr>
+      </w:pPr>
+    </w:p>
+    <w:p>
+      <w:pPr>
+        <w:jc w:val="both"/>
+      </w:pPr>
+      <w:r>
+        <w:rPr>
+          <w:rFonts w:cs="TimesNewRomanPSMT"/>
+        </w:rPr>
+        <w:t>Le loyer pratiqué pour chaque logement est fixé dans la limite du loyer maximum prévu par la présente convention.</w:t>
+      </w:r>
+    </w:p>
+    <w:p>
+      <w:pPr>
+        <w:jc w:val="both"/>
+        <w:rPr>
+          <w:rFonts w:ascii="TimesNewRomanPSMT" w:hAnsi="TimesNewRomanPSMT" w:cs="TimesNewRomanPSMT"/>
+        </w:rPr>
+      </w:pPr>
+    </w:p>
+    <w:p>
+      <w:pPr>
+        <w:jc w:val="both"/>
+      </w:pPr>
+      <w:r>
+        <w:rPr>
+          <w:rFonts w:cs="TimesNewRomanPSMT"/>
+        </w:rPr>
+        <w:t>Il ne peut donner lieu à révision en cours de bail.</w:t>
+      </w:r>
+    </w:p>
+    <w:p>
+      <w:pPr>
+        <w:jc w:val="both"/>
+        <w:rPr>
+          <w:rFonts w:cs="TimesNewRomanPSMT"/>
+        </w:rPr>
+      </w:pPr>
+    </w:p>
+    <w:p>
+      <w:pPr>
+        <w:jc w:val="both"/>
+      </w:pPr>
+      <w:r>
+        <w:rPr>
+          <w:rFonts w:cs="TimesNewRomanPSMT"/>
+        </w:rPr>
+        <w:t>Si le contrat de location est renouvelé dans les conditions prévues au 3° ci-dessous, le loyer peut être réévalué conformément aux dispositions du code de la construction et de l’habitation.</w:t>
+      </w:r>
+    </w:p>
+    <w:p>
+      <w:pPr>
+        <w:jc w:val="both"/>
+        <w:rPr>
+          <w:rFonts w:cs="TimesNewRomanPSMT"/>
+        </w:rPr>
+      </w:pPr>
+    </w:p>
+    <w:p>
+      <w:pPr>
+        <w:jc w:val="both"/>
+      </w:pPr>
+      <w:r>
+        <w:rPr>
+          <w:rFonts w:cs="TimesNewRomanPSMT"/>
+        </w:rPr>
+        <w:t>3°- Durée du contrat et congé donné par le locataire.</w:t>
+      </w:r>
+    </w:p>
+    <w:p>
+      <w:pPr>
+        <w:jc w:val="both"/>
+        <w:rPr>
+          <w:rFonts w:cs="TimesNewRomanPSMT"/>
+        </w:rPr>
+      </w:pPr>
+    </w:p>
+    <w:p>
+      <w:pPr>
+        <w:jc w:val="both"/>
+      </w:pPr>
+      <w:r>
+        <w:rPr>
+          <w:rFonts w:cs="TimesNewRomanPSMT"/>
+        </w:rPr>
+        <w:t>Par dérogation à l’article 15 de la présente convention, les locataires ne bénéficient pas du droit au maintien dans les lieux.</w:t>
+      </w:r>
+    </w:p>
+    <w:p>
+      <w:pPr>
+        <w:jc w:val="both"/>
+        <w:rPr>
+          <w:rFonts w:cs="TimesNewRomanPSMT"/>
+        </w:rPr>
+      </w:pPr>
+    </w:p>
+    <w:p>
+      <w:pPr>
+        <w:jc w:val="both"/>
+      </w:pPr>
+      <w:r>
+        <w:rPr>
+          <w:rFonts w:cs="TimesNewRomanPSMT"/>
+        </w:rPr>
+        <w:t>Le contrat de location a une durée maximale d'un an. Il peut être renouvelé dès lors que l'occupant continue à remplir les conditions prévues par l’article L. 631-12 du code de la construction et de l’habitation, ainsi que les conditions de ressources requises pour l’attribution du logement. Le renouvellement donne lieu à la signature d’un nouveau contrat.</w:t>
+      </w:r>
+    </w:p>
+    <w:p>
+      <w:pPr>
+        <w:jc w:val="both"/>
+        <w:rPr>
+          <w:rFonts w:cs="TimesNewRomanPSMT"/>
+        </w:rPr>
+      </w:pPr>
+    </w:p>
+    <w:p>
+      <w:pPr>
+        <w:jc w:val="both"/>
+      </w:pPr>
+      <w:r>
+        <w:rPr>
+          <w:rFonts w:cs="TimesNewRomanPSMT"/>
+        </w:rPr>
+        <w:t>Le locataire peut donner congé à tout moment, dans les conditions des treizième à vingt-deuxième alinéas du I de l'article 15 de la loi du 6 juillet 1989 précitée. Il est redevable du loyer et des charges pendant la durée effective du délai de préavis, de jour à jour, sauf si le logement se trouve occupé avant la fin du préavis par un autre locataire en accord avec le bailleur.</w:t>
+      </w:r>
+    </w:p>
+    <w:p>
+      <w:pPr>
+        <w:jc w:val="both"/>
+        <w:rPr>
+          <w:rFonts w:ascii="TimesNewRomanPSMT" w:hAnsi="TimesNewRomanPSMT" w:cs="TimesNewRomanPSMT"/>
+        </w:rPr>
+      </w:pPr>
+    </w:p>
+    <w:p>
+      <w:pPr>
+        <w:jc w:val="both"/>
+      </w:pPr>
+      <w:r>
+        <w:rPr>
+          <w:rFonts w:cs="TimesNewRomanPSMT"/>
+        </w:rPr>
+        <w:t>4°- Forfait de charges.</w:t>
+      </w:r>
+    </w:p>
+    <w:p>
+      <w:pPr>
+        <w:jc w:val="both"/>
+        <w:rPr>
+          <w:rFonts w:cs="TimesNewRomanPSMT"/>
+        </w:rPr>
+      </w:pPr>
+    </w:p>
+    <w:p>
+      <w:pPr>
+        <w:jc w:val="both"/>
+      </w:pPr>
+      <w:r>
+        <w:rPr>
+          <w:rFonts w:cs="TimesNewRomanPSMT"/>
+        </w:rPr>
+        <w:t xml:space="preserve">En application du VIII de l’article 40 de la loi du 6 juillet 1989 précitée, les charges locatives accessoires au loyer principal des logements de la résidence universitaire peuvent être récupérées par le bailleur sous la forme d'un forfait versé simultanément au loyer, dont le montant et la périodicité de versement sont définis au contrat et qui ne peut donner lieu à complément ou à régularisation ultérieure. Le montant du forfait de </w:t>
+      </w:r>
+      <w:r>
+        <w:rPr>
+          <w:rFonts w:cs="TimesNewRomanPSMT"/>
+        </w:rPr>
+        <w:lastRenderedPageBreak/>
+        <w:t>charges est fixé en fonction des montants exigibles par le bailleur en application de l'article 23 de la loi du 6 juillet 1989 précitée. Ce montant</w:t>
+      </w:r>
+      <w:r>
+        <w:t xml:space="preserve"> </w:t>
+      </w:r>
+      <w:r>
+        <w:rPr>
+          <w:rFonts w:cs="TimesNewRomanPSMT"/>
+        </w:rPr>
+        <w:t>ne doit pas être manifestement disproportionné au regard des charges dont le locataire ou, le cas échéant, le précédent locataire se serait acquitté.</w:t>
+      </w:r>
+    </w:p>
+    <w:p>
+      <w:pPr>
+        <w:jc w:val="both"/>
+        <w:rPr>
+          <w:rFonts w:cs="TimesNewRomanPSMT"/>
+        </w:rPr>
+      </w:pPr>
+    </w:p>
+    <w:p>
+      <w:pPr>
+        <w:jc w:val="both"/>
+      </w:pPr>
+      <w:r>
+        <w:rPr>
+          <w:rFonts w:cs="TimesNewRomanPSMT"/>
+        </w:rPr>
+        <w:t>Si le bailleur a opté pour cette modalité de récupération des charges, il indique sur la quittance le montant du forfait</w:t>
+      </w:r>
+      <w:r>
+        <w:rPr>
+          <w:rFonts w:ascii="TimesNewRomanPSMT" w:hAnsi="TimesNewRomanPSMT" w:cs="TimesNewRomanPSMT"/>
+        </w:rPr>
+        <w:t>.</w:t>
+      </w:r>
+    </w:p>
+    <w:p>
+      <w:pPr>
+        <w:jc w:val="both"/>
+        <w:rPr>
+          <w:rFonts w:ascii="TimesNewRomanPSMT" w:hAnsi="TimesNewRomanPSMT" w:cs="TimesNewRomanPSMT"/>
+        </w:rPr>
+      </w:pPr>
+    </w:p>
+    <w:p>
+      <w:pPr>
         <w:jc w:val="center"/>
       </w:pPr>
       <w:r>
         <w:rPr>
           <w:rFonts w:cs="TimesNewRomanPSMT"/>
         </w:rPr>
-        <w:t>Article 12.</w:t>
+        <w:t>Article 19.</w:t>
       </w:r>
     </w:p>
     <w:p>
@@ -2943,75 +3881,26 @@
           <w:i/>
           <w:iCs/>
         </w:rPr>
-        <w:t>Travaux.</w:t>
-      </w:r>
-    </w:p>
-    <w:p>
-      <w:pPr>
-        <w:jc w:val="both"/>
-        <w:rPr>
-          <w:rFonts w:cs="TimesNewRomanPSMT"/>
-        </w:rPr>
-      </w:pPr>
-    </w:p>
-    <w:p>
-      <w:pPr>
-        <w:jc w:val="both"/>
-      </w:pPr>
-      <w:r>
-        <w:rPr>
-          <w:rFonts w:cs="TimesNewRomanPSMT"/>
-        </w:rPr>
-        <w:t>Lorsque l'exécution des travaux nécessite l'évacuation temporaire des lieux, l'organisme bailleur doit mettre provisoirement à la disposition du locataire un logement en bon état d'habitation remplissant des conditions d'hygiène normales, correspondant à ses besoins personnels ou familiaux et, le cas échéant, professionnels, ainsi qu'à ses possibilités. Il doit en outre être situé :</w:t>
-      </w:r>
-    </w:p>
-    <w:p>
-      <w:pPr>
-        <w:jc w:val="both"/>
-      </w:pPr>
-      <w:r>
-        <w:rPr>
-          <w:rFonts w:cs="TimesNewRomanPSMT"/>
-        </w:rPr>
-        <w:t>- dans le même arrondissement ou les arrondissements limitrophes ou les communes limitrophes de l'arrondissement où se trouve le local, objet de la reprise, si celui-ci est situé dans une commune divisée en arrondissements ;</w:t>
-      </w:r>
-    </w:p>
-    <w:p>
-      <w:pPr>
-        <w:jc w:val="both"/>
-        <w:rPr>
-          <w:rFonts w:cs="TimesNewRomanPSMT"/>
-        </w:rPr>
-      </w:pPr>
-    </w:p>
-    <w:p>
-      <w:pPr>
-        <w:jc w:val="both"/>
-      </w:pPr>
-      <w:r>
-        <w:rPr>
-          <w:rFonts w:cs="TimesNewRomanPSMT"/>
-        </w:rPr>
-        <w:t>- dans le même canton ou dans les cantons limitrophes de ce canton inclus dans la même commune ou dans les communes limitrophes de ce canton, si la commune est divisée en cantons ;</w:t>
-      </w:r>
-    </w:p>
-    <w:p>
-      <w:pPr>
-        <w:jc w:val="both"/>
-        <w:rPr>
-          <w:rFonts w:cs="TimesNewRomanPSMT"/>
-        </w:rPr>
-      </w:pPr>
-    </w:p>
-    <w:p>
-      <w:pPr>
-        <w:jc w:val="both"/>
-      </w:pPr>
-      <w:r>
-        <w:rPr>
-          <w:rFonts w:cs="TimesNewRomanPSMT"/>
-        </w:rPr>
-        <w:t>- dans les autres cas, sur le territoire de la même commune ou d'une commune limitrophe, sans pouvoir être éloigné de plus de cinq kilomètres.</w:t>
+        <w:t>Renonciation au statut de résidence universitaire.</w:t>
+      </w:r>
+    </w:p>
+    <w:p>
+      <w:pPr>
+        <w:jc w:val="both"/>
+        <w:rPr>
+          <w:rFonts w:cs="TimesNewRomanPSMT"/>
+        </w:rPr>
+      </w:pPr>
+    </w:p>
+    <w:p>
+      <w:pPr>
+        <w:jc w:val="both"/>
+      </w:pPr>
+      <w:r>
+        <w:rPr>
+          <w:rFonts w:cs="TimesNewRomanPSMT"/>
+        </w:rPr>
+        <w:t>En cas de renonciation au statut de résidence universitaire, les dispositions relatives aux résidences universitaires figurant dans la présente convention sont sans objet. La renonciation au statut de résidence universitaire est définitive et s'effectue par avenant, à l’initiative du bailleur. Cet avenant est sans effet sur les contrats de location en cours. A l’échéance de chacun de ces contrats, le logement concerné est loué dans les conditions de droit commun de la présente convention.</w:t>
       </w:r>
     </w:p>
     <w:p>
@@ -3024,13 +3913,41 @@
     </w:p>
     <w:p>
       <w:pPr>
+        <w:jc w:val="both"/>
+        <w:rPr>
+          <w:rFonts w:cs="TimesNewRomanPSMT"/>
+        </w:rPr>
+      </w:pPr>
+    </w:p>
+    <w:p>
+      <w:pPr>
         <w:jc w:val="center"/>
       </w:pPr>
       <w:r>
         <w:rPr>
-          <w:rFonts w:cs="TimesNewRomanPSMT"/>
-        </w:rPr>
-        <w:t>Article 13.</w:t>
+          <w:rFonts w:cs="TimesNewRomanPS-BoldMT"/>
+          <w:b/>
+        </w:rPr>
+        <w:t>V.-Engagements du bailleur à l'égard des organismes chargés de la liquidation et du paiement de l'APL.</w:t>
+      </w:r>
+    </w:p>
+    <w:p>
+      <w:pPr>
+        <w:rPr>
+          <w:rFonts w:cs="TimesNewRomanPS-BoldMT"/>
+          <w:b/>
+        </w:rPr>
+      </w:pPr>
+    </w:p>
+    <w:p>
+      <w:pPr>
+        <w:jc w:val="center"/>
+      </w:pPr>
+      <w:r>
+        <w:rPr>
+          <w:rFonts w:cs="TimesNewRomanPSMT"/>
+        </w:rPr>
+        <w:t>Article 20.</w:t>
       </w:r>
     </w:p>
     <w:p>
@@ -3050,37 +3967,83 @@
           <w:i/>
           <w:iCs/>
         </w:rPr>
-        <w:t>Information des locataires en cas de changement de propriétaire.</w:t>
-      </w:r>
-    </w:p>
-    <w:p>
-      <w:pPr>
-        <w:jc w:val="both"/>
-        <w:rPr>
-          <w:rFonts w:cs="TimesNewRomanPSMT"/>
-        </w:rPr>
-      </w:pPr>
-    </w:p>
-    <w:p>
-      <w:pPr>
-        <w:jc w:val="both"/>
-      </w:pPr>
-      <w:r>
-        <w:rPr>
-          <w:rFonts w:cs="TimesNewRomanPSMT"/>
-        </w:rPr>
-        <w:t>En cas de mutation à titre gratuit ou onéreux, et en vue de l'information du préfet ou, le cas échéant, du président de l'établissement public de coopération intercommunale, du conseil départemental, de la métropole de Lyon ou du conseil exécutif de Corse, partie à la présente convention, des locataires et des organismes liquidateurs de l'APL, le ou les nouveaux propriétaires leur font connaître leur identification dans les conditions conformes soit à l'article 5, soit à l'article 6 du décret n° 55-22 du</w:t>
-      </w:r>
-    </w:p>
-    <w:p>
-      <w:pPr>
-        <w:jc w:val="both"/>
-      </w:pPr>
-      <w:r>
-        <w:rPr>
-          <w:rFonts w:cs="TimesNewRomanPSMT"/>
-        </w:rPr>
-        <w:t>4 janvier 1955 modifié, par acte extrajudiciaire, lettre recommandée avec demande d'avis de réception ou remise contre décharge dans un délai d'un mois à compter de ladite mutation.</w:t>
+        <w:t>Obligations générales.</w:t>
+      </w:r>
+    </w:p>
+    <w:p>
+      <w:pPr>
+        <w:jc w:val="both"/>
+        <w:rPr>
+          <w:rFonts w:cs="TimesNewRomanPSMT"/>
+        </w:rPr>
+      </w:pPr>
+    </w:p>
+    <w:p>
+      <w:pPr>
+        <w:jc w:val="both"/>
+      </w:pPr>
+      <w:r>
+        <w:rPr>
+          <w:rFonts w:cs="TimesNewRomanPSMT"/>
+        </w:rPr>
+        <w:t>1° Pour chaque locataire demandeur de l'APL, le bailleur s’engage à favoriser l’utilisation des services dématérialisés mis à sa disposition par les organismes payeurs pour l’envoi des informations nécessaires à l’étude d’un droit à une aide au logement. En dernier ressort, il renseigne dès l'entrée en vigueur de la convention pour chaque locataire demandeur de l'APL, la partie de l'imprimé de demande d'APL qui le concerne.</w:t>
+      </w:r>
+    </w:p>
+    <w:p>
+      <w:pPr>
+        <w:jc w:val="both"/>
+        <w:rPr>
+          <w:rFonts w:cs="TimesNewRomanPSMT"/>
+        </w:rPr>
+      </w:pPr>
+    </w:p>
+    <w:p>
+      <w:pPr>
+        <w:jc w:val="both"/>
+      </w:pPr>
+      <w:r>
+        <w:rPr>
+          <w:rFonts w:cs="TimesNewRomanPSMT"/>
+        </w:rPr>
+        <w:t>2° Pour permettre le renouvellement des droits à l’APL au 1er janvier de chaque année, le bailleur fournit aux organismes liquidateurs de l'APL au plus tard le 15 novembre de chaque année, conformément à l'arrêté du 22 août 1986 relatif à la fixation des justifications nécessaires à l'obtention de l'aide personnalisée au logement et à son renouvellement :</w:t>
+      </w:r>
+    </w:p>
+    <w:p>
+      <w:pPr>
+        <w:jc w:val="both"/>
+        <w:rPr>
+          <w:rFonts w:cs="TimesNewRomanPSMT"/>
+        </w:rPr>
+      </w:pPr>
+    </w:p>
+    <w:p>
+      <w:pPr>
+        <w:jc w:val="both"/>
+      </w:pPr>
+      <w:r>
+        <w:rPr>
+          <w:rFonts w:cs="TimesNewRomanPSMT"/>
+        </w:rPr>
+        <w:t>- une attestation concernant le montant du loyer applicable à chaque logement concerné par la présente convention, à compter du 1er juillet de l’année en cours ;</w:t>
+      </w:r>
+    </w:p>
+    <w:p>
+      <w:pPr>
+        <w:jc w:val="both"/>
+        <w:rPr>
+          <w:rFonts w:cs="TimesNewRomanPSMT"/>
+        </w:rPr>
+      </w:pPr>
+    </w:p>
+    <w:p>
+      <w:pPr>
+        <w:jc w:val="both"/>
+      </w:pPr>
+      <w:r>
+        <w:rPr>
+          <w:rFonts w:cs="TimesNewRomanPSMT"/>
+        </w:rPr>
+        <w:t>- un document attestant que tous les bénéficiaires sont à jour de leurs obligations vis-à-vis du bailleur ou, le cas échéant, la liste des bénéficiaires d'APL non à jour en certifiant que cette liste est exhaustive. Ce document mentionne également la date à laquelle l’organisme payeur a été saisi en cas d’impayé constitué selon la définition fixée par l’article R. 824-1 du code de la construction et de l’habitation.</w:t>
       </w:r>
     </w:p>
     <w:p>
@@ -3093,13 +4056,51 @@
     </w:p>
     <w:p>
       <w:pPr>
+        <w:jc w:val="both"/>
+      </w:pPr>
+      <w:r>
+        <w:rPr>
+          <w:rFonts w:cs="TimesNewRomanPSMT"/>
+        </w:rPr>
+        <w:t>Ces transmissions peuvent s’effectuer grâce à un dispositif de collecte dématérialisé.</w:t>
+      </w:r>
+    </w:p>
+    <w:p>
+      <w:pPr>
+        <w:jc w:val="both"/>
+        <w:rPr>
+          <w:rFonts w:cs="TimesNewRomanPSMT"/>
+        </w:rPr>
+      </w:pPr>
+    </w:p>
+    <w:p>
+      <w:pPr>
+        <w:jc w:val="both"/>
+      </w:pPr>
+      <w:r>
+        <w:rPr>
+          <w:rFonts w:cs="TimesNewRomanPSMT"/>
+        </w:rPr>
+        <w:t>3° En outre, il fait part dans un délai maximum d'un mois aux organismes liquidateurs de l'APL des modifications affectant la situation locative du bénéficiaire (notamment colocation, résiliation de bail, décès).</w:t>
+      </w:r>
+    </w:p>
+    <w:p>
+      <w:pPr>
+        <w:jc w:val="both"/>
+        <w:rPr>
+          <w:rFonts w:ascii="TimesNewRomanPSMT" w:hAnsi="TimesNewRomanPSMT" w:cs="TimesNewRomanPSMT"/>
+        </w:rPr>
+      </w:pPr>
+    </w:p>
+    <w:p>
+      <w:pPr>
         <w:jc w:val="center"/>
       </w:pPr>
       <w:r>
         <w:rPr>
           <w:rFonts w:cs="TimesNewRomanPSMT"/>
         </w:rPr>
-        <w:t>Article 14.</w:t>
+        <w:t>Article 21.</w:t>
       </w:r>
     </w:p>
     <w:p>
@@ -3119,52 +4120,100 @@
           <w:i/>
           <w:iCs/>
         </w:rPr>
-        <w:t>Information des locataires en cas de modification ou de résiliation de la convention.</w:t>
-      </w:r>
-    </w:p>
-    <w:p>
-      <w:pPr>
-        <w:jc w:val="both"/>
-        <w:rPr>
-          <w:rFonts w:cs="TimesNewRomanPSMT"/>
-        </w:rPr>
-      </w:pPr>
-    </w:p>
-    <w:p>
-      <w:pPr>
-        <w:jc w:val="both"/>
-      </w:pPr>
-      <w:r>
-        <w:rPr>
-          <w:rFonts w:cs="TimesNewRomanPSMT"/>
-        </w:rPr>
-        <w:t>Le bailleur informe les locataires de toute modification apportée à la convention ayant des incidences sur leurs relations contractuelles.</w:t>
-      </w:r>
-    </w:p>
-    <w:p>
-      <w:pPr>
-        <w:jc w:val="both"/>
-        <w:rPr>
-          <w:rFonts w:cs="TimesNewRomanPSMT"/>
-        </w:rPr>
-      </w:pPr>
-    </w:p>
-    <w:p>
-      <w:pPr>
-        <w:jc w:val="both"/>
-      </w:pPr>
-      <w:r>
-        <w:rPr>
-          <w:rFonts w:cs="TimesNewRomanPSMT"/>
-        </w:rPr>
-        <w:t>Quelle qu'en soit la cause, le bailleur informe le locataire de la date prévue pour l'expiration de la convention. En cas de résiliation de la convention aux torts du bailleur, il porte à la connaissance des locataires la teneur de l'article L. 353-6 du code de la construction et de l'habitation.</w:t>
-      </w:r>
-    </w:p>
-    <w:p>
-      <w:pPr>
-        <w:jc w:val="both"/>
-        <w:rPr>
-          <w:rFonts w:cs="TimesNewRomanPSMT"/>
+        <w:t>Obligations en cas d’impayé.</w:t>
+      </w:r>
+    </w:p>
+    <w:p>
+      <w:pPr>
+        <w:jc w:val="both"/>
+        <w:rPr>
+          <w:rFonts w:cs="TimesNewRomanPSMT"/>
+        </w:rPr>
+      </w:pPr>
+    </w:p>
+    <w:p>
+      <w:pPr>
+        <w:jc w:val="both"/>
+      </w:pPr>
+      <w:r>
+        <w:rPr>
+          <w:rFonts w:cs="TimesNewRomanPSMT"/>
+        </w:rPr>
+        <w:t>En application des articles L. 824-1 et R. 824-4 du code de la construction et de l’habitation, le bailleur auprès duquel l'aide est versée signale à l’organisme payeur lorsqu’un allocataire ne règle pas la part de la dépense de logement restant à sa charge, dans un délai de deux mois après la constitution de l'impayé défini à l’article R. 824-1 du code de la construction et de l’habitation, sauf si la somme due a été réglée entre-temps en totalité. Le bailleur doit justifier qu'il poursuit par tous les moyens possibles le recouvrement de sa créance. En outre, il communique le montant de l'impayé constitué au moment de la saisine de l’organisme payeur.</w:t>
+      </w:r>
+    </w:p>
+    <w:p>
+      <w:pPr>
+        <w:jc w:val="both"/>
+        <w:rPr>
+          <w:rFonts w:ascii="TimesNewRomanPSMT" w:hAnsi="TimesNewRomanPSMT" w:cs="TimesNewRomanPSMT"/>
+        </w:rPr>
+      </w:pPr>
+    </w:p>
+    <w:p>
+      <w:pPr>
+        <w:jc w:val="both"/>
+      </w:pPr>
+      <w:r>
+        <w:rPr>
+          <w:rFonts w:cs="TimesNewRomanPSMT"/>
+        </w:rPr>
+        <w:t>Parallèlement, en cas d'impayé, le bailleur doit poursuivre le recouvrement de sa créance en notifiant au locataire défaillant par lettre recommandée avec accusé de réception le montant de cette créance. Il doit également informer le locataire de la saisine de l’organisme payeur.</w:t>
+      </w:r>
+    </w:p>
+    <w:p>
+      <w:pPr>
+        <w:jc w:val="both"/>
+        <w:rPr>
+          <w:rFonts w:cs="TimesNewRomanPSMT"/>
+        </w:rPr>
+      </w:pPr>
+    </w:p>
+    <w:p>
+      <w:pPr>
+        <w:jc w:val="both"/>
+      </w:pPr>
+      <w:r>
+        <w:rPr>
+          <w:rFonts w:cs="TimesNewRomanPSMT"/>
+        </w:rPr>
+        <w:t>La commission de coordination des actions de prévention des expulsions locatives (CCAPEX) est systématiquement informée par l’organisme payeur des APL en vue de prévenir leurs éventuelles suspensions par une mobilisation coordonnée des outils de prévention (article 7-2 de la loi n° 90- 449 du 31 mai 1990 visant à la mise en œuvre du droit au logement).</w:t>
+      </w:r>
+    </w:p>
+    <w:p>
+      <w:pPr>
+        <w:jc w:val="both"/>
+        <w:rPr>
+          <w:rFonts w:cs="TimesNewRomanPSMT"/>
+        </w:rPr>
+      </w:pPr>
+    </w:p>
+    <w:p>
+      <w:pPr>
+        <w:jc w:val="both"/>
+      </w:pPr>
+      <w:r>
+        <w:rPr>
+          <w:rFonts w:cs="TimesNewRomanPSMT"/>
+        </w:rPr>
+        <w:t>La CCAPEX est réputée avoir été régulièrement saisie lorsque le bailleur a préalablement signalé l’impayé à l’organisme payeur des APL selon les modalités définies à l’article R. 824-4 précité.</w:t>
+      </w:r>
+    </w:p>
+    <w:p>
+      <w:pPr>
+        <w:jc w:val="both"/>
+        <w:rPr>
+          <w:rFonts w:cs="TimesNewRomanPS-BoldMT"/>
+          <w:b/>
+        </w:rPr>
+      </w:pPr>
+    </w:p>
+    <w:p>
+      <w:pPr>
+        <w:jc w:val="both"/>
+        <w:rPr>
+          <w:rFonts w:cs="TimesNewRomanPS-BoldMT"/>
+          <w:b/>
         </w:rPr>
       </w:pPr>
     </w:p>
@@ -3174,9 +4223,29 @@
       </w:pPr>
       <w:r>
         <w:rPr>
-          <w:rFonts w:cs="TimesNewRomanPSMT"/>
-        </w:rPr>
-        <w:t>Article 15.</w:t>
+          <w:rFonts w:cs="TimesNewRomanPS-BoldMT"/>
+          <w:b/>
+        </w:rPr>
+        <w:t>VI.-Dispositions relatives à l’application de la convention.</w:t>
+      </w:r>
+    </w:p>
+    <w:p>
+      <w:pPr>
+        <w:rPr>
+          <w:rFonts w:cs="TimesNewRomanPS-BoldMT"/>
+          <w:b/>
+        </w:rPr>
+      </w:pPr>
+    </w:p>
+    <w:p>
+      <w:pPr>
+        <w:jc w:val="center"/>
+      </w:pPr>
+      <w:r>
+        <w:rPr>
+          <w:rFonts w:cs="TimesNewRomanPSMT"/>
+        </w:rPr>
+        <w:t>Article 22.</w:t>
       </w:r>
     </w:p>
     <w:p>
@@ -3196,59 +4265,33 @@
           <w:i/>
           <w:iCs/>
         </w:rPr>
-        <w:t>Maintien dans les lieux et congé donné par le locataire.</w:t>
-      </w:r>
-    </w:p>
-    <w:p>
-      <w:pPr>
-        <w:jc w:val="both"/>
-        <w:rPr>
-          <w:rFonts w:cs="TimesNewRomanPSMT"/>
-        </w:rPr>
-      </w:pPr>
-    </w:p>
-    <w:p>
-      <w:pPr>
-        <w:jc w:val="both"/>
-      </w:pPr>
-      <w:r>
-        <w:rPr>
-          <w:rFonts w:cs="TimesNewRomanPSMT"/>
-        </w:rPr>
-        <w:lastRenderedPageBreak/>
-        <w:t>Pendant la durée de la convention, le locataire bénéficie du droit au maintien dans les lieux dans les conditions de l'article L. 353-15 du code de la construction et de l’habitation, dans la mesure où il se conforme aux obligations de l'article 7 de la loi du 6 juillet 1989 précitée, sauf dénonciation expresse du locataire dans les conditions des treizième à vingt-deuxième alinéas du I de l'article 15 de la loi du 6 juillet 1989 précitée.</w:t>
-      </w:r>
-    </w:p>
-    <w:p>
-      <w:pPr>
-        <w:jc w:val="both"/>
-        <w:rPr>
-          <w:rFonts w:cs="TimesNewRomanPSMT"/>
-        </w:rPr>
-      </w:pPr>
-    </w:p>
-    <w:p>
-      <w:pPr>
-        <w:jc w:val="both"/>
-      </w:pPr>
-      <w:r>
-        <w:rPr>
-          <w:rFonts w:cs="TimesNewRomanPSMT"/>
-        </w:rPr>
-        <w:t>Le locataire peut donner congé à tout moment. Il est redevable du loyer et des charges pendant la durée effective du délai de préavis, de jour à jour, sauf si le logement se trouve occupé avant la fin du préavis par un autre locataire en accord avec le bailleur</w:t>
-      </w:r>
-      <w:r>
-        <w:rPr>
-          <w:rFonts w:ascii="TimesNewRomanPSMT" w:hAnsi="TimesNewRomanPSMT" w:cs="TimesNewRomanPSMT"/>
-        </w:rPr>
-        <w:t>.</w:t>
-      </w:r>
-    </w:p>
-    <w:p>
-      <w:pPr>
-        <w:jc w:val="both"/>
-        <w:rPr>
-          <w:rFonts w:ascii="TimesNewRomanPSMT" w:hAnsi="TimesNewRomanPSMT" w:cs="TimesNewRomanPSMT"/>
+        <w:t>Contrôle.</w:t>
+      </w:r>
+    </w:p>
+    <w:p>
+      <w:pPr>
+        <w:jc w:val="both"/>
+        <w:rPr>
+          <w:rFonts w:cs="TimesNewRomanPSMT"/>
+        </w:rPr>
+      </w:pPr>
+    </w:p>
+    <w:p>
+      <w:pPr>
+        <w:jc w:val="both"/>
+      </w:pPr>
+      <w:r>
+        <w:rPr>
+          <w:rFonts w:cs="TimesNewRomanPSMT"/>
+        </w:rPr>
+        <w:t>Afin de permettre le contrôle de l'application de la présente convention, le bailleur fournit à tout moment à la demande du préfet ou de l’Agence nationale de contrôle du logement social toutes les informations et tous les documents nécessaires au plein exercice de ce contrôle.</w:t>
+      </w:r>
+    </w:p>
+    <w:p>
+      <w:pPr>
+        <w:jc w:val="both"/>
+        <w:rPr>
+          <w:rFonts w:cs="TimesNewRomanPSMT"/>
         </w:rPr>
       </w:pPr>
     </w:p>
@@ -3260,7 +4303,7 @@
         <w:rPr>
           <w:rFonts w:cs="TimesNewRomanPSMT"/>
         </w:rPr>
-        <w:t>Article 16.</w:t>
+        <w:t>Article 23.</w:t>
       </w:r>
     </w:p>
     <w:p>
@@ -3280,83 +4323,27 @@
           <w:i/>
           <w:iCs/>
         </w:rPr>
-        <w:t>Modalités du paiement du loyer.</w:t>
-      </w:r>
-    </w:p>
-    <w:p>
-      <w:pPr>
-        <w:jc w:val="both"/>
-        <w:rPr>
-          <w:rFonts w:cs="TimesNewRomanPSMT"/>
-        </w:rPr>
-      </w:pPr>
-    </w:p>
-    <w:p>
-      <w:pPr>
-        <w:jc w:val="both"/>
-      </w:pPr>
-      <w:r>
-        <w:rPr>
-          <w:rFonts w:cs="TimesNewRomanPSMT"/>
-        </w:rPr>
-        <w:t>Le loyer est payé mensuellement à terme échu.</w:t>
-      </w:r>
-    </w:p>
-    <w:p>
-      <w:pPr>
-        <w:jc w:val="both"/>
-        <w:rPr>
-          <w:rFonts w:cs="TimesNewRomanPSMT"/>
-        </w:rPr>
-      </w:pPr>
-    </w:p>
-    <w:p>
-      <w:pPr>
-        <w:jc w:val="both"/>
-      </w:pPr>
-      <w:r>
-        <w:rPr>
-          <w:rFonts w:cs="TimesNewRomanPSMT"/>
-        </w:rPr>
-        <w:t>Le bailleur indique sur la quittance le montant du loyer principal, du ou des loyers accessoires, du loyer maximum, des charges locatives et, le cas échéant, le montant de l'APL, de la réduction de loyer de solidarité et de la contribution pour le partage des économies de charges.</w:t>
-      </w:r>
-    </w:p>
-    <w:p>
-      <w:pPr>
-        <w:jc w:val="both"/>
-        <w:rPr>
-          <w:rFonts w:cs="TimesNewRomanPSMT"/>
-        </w:rPr>
-      </w:pPr>
-    </w:p>
-    <w:p>
-      <w:pPr>
-        <w:jc w:val="both"/>
-      </w:pPr>
-      <w:r>
-        <w:rPr>
-          <w:rFonts w:cs="TimesNewRomanPSMT"/>
-        </w:rPr>
-        <w:t>En application de l'article L. 832-2 du code de la construction et de l'habitation, pour chaque appel de loyer, le bailleur déduit s'il y a lieu le montant de l'APL qu'il perçoit pour le compte du locataire du montant du loyer et des dépenses accessoires de logement.</w:t>
-      </w:r>
-    </w:p>
-    <w:p>
-      <w:pPr>
-        <w:jc w:val="both"/>
-        <w:rPr>
-          <w:rFonts w:cs="TimesNewRomanPSMT"/>
-        </w:rPr>
-      </w:pPr>
-    </w:p>
-    <w:p>
-      <w:pPr>
-        <w:jc w:val="both"/>
-      </w:pPr>
-      <w:r>
-        <w:rPr>
-          <w:rFonts w:cs="TimesNewRomanPSMT"/>
-        </w:rPr>
-        <w:t>Lorsque l'organisme liquidateur de l'APL verse au bailleur des rappels d'aide personnalisée pour le compte de locataires, le bailleur affecte ces sommes au compte de ces derniers. Si après affectation il en résulte un surplus, le bailleur le reverse au locataire dans le délai d'un mois.</w:t>
+        <w:t>Révision de la convention.</w:t>
+      </w:r>
+    </w:p>
+    <w:p>
+      <w:pPr>
+        <w:jc w:val="both"/>
+        <w:rPr>
+          <w:rFonts w:cs="TimesNewRomanPSMT"/>
+        </w:rPr>
+      </w:pPr>
+    </w:p>
+    <w:p>
+      <w:pPr>
+        <w:jc w:val="both"/>
+      </w:pPr>
+      <w:r>
+        <w:rPr>
+          <w:rFonts w:cs="TimesNewRomanPSMT"/>
+        </w:rPr>
+        <w:lastRenderedPageBreak/>
+        <w:t>La présente convention pourra être révisée à la demande de l'une ou l'autre des parties par voie d'avenant.</w:t>
       </w:r>
     </w:p>
     <w:p>
@@ -3369,51 +4356,13 @@
     </w:p>
     <w:p>
       <w:pPr>
-        <w:jc w:val="both"/>
-      </w:pPr>
-      <w:r>
-        <w:rPr>
-          <w:rFonts w:cs="TimesNewRomanPSMT"/>
-        </w:rPr>
-        <w:t>En cas de retard du locataire dans le paiement du loyer et des charges locatives, le bailleur doit prendre toutes dispositions en vue de recouvrer sa créance.</w:t>
-      </w:r>
-    </w:p>
-    <w:p>
-      <w:pPr>
-        <w:jc w:val="both"/>
-        <w:rPr>
-          <w:rFonts w:cs="TimesNewRomanPSMT"/>
-        </w:rPr>
-      </w:pPr>
-    </w:p>
-    <w:p>
-      <w:pPr>
-        <w:jc w:val="both"/>
-      </w:pPr>
-      <w:r>
-        <w:rPr>
-          <w:rFonts w:cs="TimesNewRomanPSMT"/>
-        </w:rPr>
-        <w:t>En cas d'impayé constitué au sens de l'article R. 824-1 du code de la construction et de l’habitation, et lorsque l'APL est versée en tiers payant, le bailleur doit informer l’organisme payeur de la situation du locataire dans un délai de deux mois après la constitution de l’impayé.</w:t>
-      </w:r>
-    </w:p>
-    <w:p>
-      <w:pPr>
-        <w:jc w:val="both"/>
-        <w:rPr>
-          <w:rFonts w:cs="TimesNewRomanPSMT"/>
-        </w:rPr>
-      </w:pPr>
-    </w:p>
-    <w:p>
-      <w:pPr>
         <w:jc w:val="center"/>
       </w:pPr>
       <w:r>
         <w:rPr>
           <w:rFonts w:cs="TimesNewRomanPSMT"/>
         </w:rPr>
-        <w:t>Article 17.</w:t>
+        <w:t>Article 24.</w:t>
       </w:r>
     </w:p>
     <w:p>
@@ -3433,26 +4382,26 @@
           <w:i/>
           <w:iCs/>
         </w:rPr>
-        <w:t>Dépôt de garantie.</w:t>
-      </w:r>
-    </w:p>
-    <w:p>
-      <w:pPr>
-        <w:jc w:val="both"/>
-        <w:rPr>
-          <w:rFonts w:cs="TimesNewRomanPSMT"/>
-        </w:rPr>
-      </w:pPr>
-    </w:p>
-    <w:p>
-      <w:pPr>
-        <w:jc w:val="both"/>
-      </w:pPr>
-      <w:r>
-        <w:rPr>
-          <w:rFonts w:cs="TimesNewRomanPSMT"/>
-        </w:rPr>
-        <w:t>Le dépôt de garantie stipulé le cas échéant par le contrat de location pour garantir l'exécution de ses obligations locatives par le locataire ne peut être supérieur à un mois de loyer en principal.</w:t>
+        <w:t>Inexécution de la convention par le bailleur.</w:t>
+      </w:r>
+    </w:p>
+    <w:p>
+      <w:pPr>
+        <w:jc w:val="both"/>
+        <w:rPr>
+          <w:rFonts w:cs="TimesNewRomanPSMT"/>
+        </w:rPr>
+      </w:pPr>
+    </w:p>
+    <w:p>
+      <w:pPr>
+        <w:jc w:val="both"/>
+      </w:pPr>
+      <w:r>
+        <w:rPr>
+          <w:rFonts w:cs="TimesNewRomanPSMT"/>
+        </w:rPr>
+        <w:t>1°- En application de l'article 284 du code général des impôts, les bailleurs qui ont, au taux réduit de la taxe sur la valeur ajoutée, acquis un logement social ou imposé la livraison à soi-même d'un logement locatif social ou de travaux d'amélioration, de transformation ou d'aménagement portant sur un logement locatif social sont redevables d'un complément de taxe sur la valeur ajoutée égal à la différence entre le taux réduit et le taux normal lorsque les conditions de taxation de vente ou de livraison à soi-même au taux réduit ne sont pas ou plus remplies.</w:t>
       </w:r>
     </w:p>
     <w:p>
@@ -3466,6 +4415,112 @@
     <w:p>
       <w:pPr>
         <w:jc w:val="both"/>
+      </w:pPr>
+      <w:r>
+        <w:rPr>
+          <w:rFonts w:cs="TimesNewRomanPSMT"/>
+        </w:rPr>
+        <w:t>2°- En application de l'article L. 353-2 du code de la construction et de l'habitation, des sanctions administratives peuvent être mises en œuvre.</w:t>
+      </w:r>
+    </w:p>
+    <w:p>
+      <w:pPr>
+        <w:jc w:val="both"/>
+        <w:rPr>
+          <w:rFonts w:cs="TimesNewRomanPSMT"/>
+        </w:rPr>
+      </w:pPr>
+    </w:p>
+    <w:p>
+      <w:pPr>
+        <w:jc w:val="both"/>
+      </w:pPr>
+      <w:r>
+        <w:rPr>
+          <w:rFonts w:cs="TimesNewRomanPSMT"/>
+        </w:rPr>
+        <w:t>En application de l’article L. 353-11 du code de la construction et de l’habitation, le contrôle de l’application de la présente convention est assuré par l’Agence nationale de contrôle du logement social, que le préfet est tenu de saisir en cas de manquement constaté.</w:t>
+      </w:r>
+    </w:p>
+    <w:p>
+      <w:pPr>
+        <w:jc w:val="both"/>
+        <w:rPr>
+          <w:rFonts w:cs="TimesNewRomanPSMT"/>
+        </w:rPr>
+      </w:pPr>
+    </w:p>
+    <w:p>
+      <w:pPr>
+        <w:jc w:val="both"/>
+      </w:pPr>
+      <w:r>
+        <w:rPr>
+          <w:rFonts w:cs="TimesNewRomanPSMT"/>
+        </w:rPr>
+        <w:t>Lorsqu'un organisme ne respecte pas, pour un ou plusieurs logements, les engagements prévus par la convention, et après que l'organisme a été mis en mesure de présenter ses observations conformément aux dispositions de l'article L. 342-12 du code de la construction et de l’habitation ou, en cas de mise en demeure, à l'issue du délai mentionné à ce même article, l’Agence nationale de contrôle du logement social peut proposer au ministre chargé du logement de prononcer une sanction en application de l’article L. 342-14 du même code.</w:t>
+      </w:r>
+    </w:p>
+    <w:p>
+      <w:pPr>
+        <w:jc w:val="both"/>
+        <w:rPr>
+          <w:rFonts w:cs="TimesNewRomanPSMT"/>
+        </w:rPr>
+      </w:pPr>
+    </w:p>
+    <w:p>
+      <w:pPr>
+        <w:jc w:val="both"/>
+      </w:pPr>
+      <w:r>
+        <w:rPr>
+          <w:rFonts w:cs="TimesNewRomanPSMT"/>
+        </w:rPr>
+        <w:t>3°- En cas d'inexécution par le bailleur de ses engagements prévus par la convention, tels que notamment non-respect du loyer maximum ou en cas de fraude, dissimulation ou fausse déclaration à l'égard des organismes liquidateurs de l'APL, le préfet peut procéder à la résiliation de la présente convention aux torts du bailleur. Le préfet doit préalablement mettre en demeure l'organisme par lettre recommandée avec demande d'avis de réception. L'organisme doit dans un délai de deux mois soit satisfaire à ses obligations, soit formuler ses observations.</w:t>
+      </w:r>
+    </w:p>
+    <w:p>
+      <w:pPr>
+        <w:jc w:val="both"/>
+        <w:rPr>
+          <w:rFonts w:cs="TimesNewRomanPSMT"/>
+        </w:rPr>
+      </w:pPr>
+    </w:p>
+    <w:p>
+      <w:pPr>
+        <w:jc w:val="both"/>
+      </w:pPr>
+      <w:r>
+        <w:rPr>
+          <w:rFonts w:cs="TimesNewRomanPSMT"/>
+        </w:rPr>
+        <w:t>Lorsque le préfet écarte ces observations, sa décision doit être motivée.</w:t>
+      </w:r>
+    </w:p>
+    <w:p>
+      <w:pPr>
+        <w:jc w:val="both"/>
+        <w:rPr>
+          <w:rFonts w:cs="TimesNewRomanPSMT"/>
+        </w:rPr>
+      </w:pPr>
+    </w:p>
+    <w:p>
+      <w:pPr>
+        <w:jc w:val="both"/>
+      </w:pPr>
+      <w:r>
+        <w:rPr>
+          <w:rFonts w:cs="TimesNewRomanPSMT"/>
+        </w:rPr>
+        <w:t>Dans ce cas, il est fait application des dispositions prévues à l'article L. 353-6 du code de la construction et de l'habitation.</w:t>
+      </w:r>
+    </w:p>
+    <w:p>
+      <w:pPr>
+        <w:jc w:val="both"/>
         <w:rPr>
           <w:rFonts w:ascii="TimesNewRomanPSMT" w:hAnsi="TimesNewRomanPSMT" w:cs="TimesNewRomanPSMT"/>
         </w:rPr>
@@ -3477,401 +4532,26 @@
       </w:pPr>
       <w:r>
         <w:rPr>
-          <w:rFonts w:cs="TimesNewRomanPS-BoldMT"/>
-          <w:b/>
-        </w:rPr>
-        <w:t>IV.-Dispositions spécifiques au statut de résidence universitaire.</w:t>
-      </w:r>
-    </w:p>
-    <w:p>
-      <w:pPr>
-        <w:rPr>
-          <w:rFonts w:cs="TimesNewRomanPS-BoldMT"/>
-          <w:b/>
+          <w:rFonts w:cs="TimesNewRomanPSMT"/>
+        </w:rPr>
+        <w:t>Article 25.</w:t>
+      </w:r>
+    </w:p>
+    <w:p>
+      <w:pPr>
+        <w:rPr>
+          <w:rFonts w:cs="TimesNewRomanPSMT"/>
         </w:rPr>
       </w:pPr>
     </w:p>
     <w:p>
       <w:pPr>
         <w:jc w:val="center"/>
-      </w:pPr>
-      <w:r>
-        <w:rPr>
-          <w:rFonts w:cs="TimesNewRomanPSMT"/>
-        </w:rPr>
-        <w:lastRenderedPageBreak/>
-        <w:t>Article 18.</w:t>
-      </w:r>
-    </w:p>
-    <w:p>
-      <w:pPr>
-        <w:rPr>
-          <w:rFonts w:cs="TimesNewRomanPSMT"/>
-        </w:rPr>
-      </w:pPr>
-    </w:p>
-    <w:p>
-      <w:pPr>
-        <w:jc w:val="center"/>
-      </w:pPr>
-      <w:r>
         <w:rPr>
           <w:rFonts w:cs="TimesNewRomanPSMT"/>
           <w:i/>
           <w:iCs/>
         </w:rPr>
-        <w:t>Régime des rapports locatifs applicables aux logements.</w:t>
-      </w:r>
-    </w:p>
-    <w:p>
-      <w:pPr>
-        <w:jc w:val="both"/>
-        <w:rPr>
-          <w:rFonts w:cs="TimesNewRomanPSMT"/>
-        </w:rPr>
-      </w:pPr>
-    </w:p>
-    <w:p>
-      <w:pPr>
-        <w:jc w:val="both"/>
-      </w:pPr>
-      <w:r>
-        <w:rPr>
-          <w:rFonts w:cs="TimesNewRomanPSMT"/>
-        </w:rPr>
-        <w:t>Lorsque la présente convention est conclue en application de l’article L. 353-1 et du 3° de l’article L. 831-1 du code de la construction et de l'habitation pour une résidence universitaire définie à l'article L. 631-12 du même code, les logements de la résidence universitaire sont soumis aux dispositions de la loi n° 89-462 du 6 juillet 1989 tendant à améliorer les rapports locatifs, dans les conditions prévues par les III et VIII de l’article 40, aux dispositions du code de la construction et de l'habitation et aux stipulations de la présente convention.</w:t>
-      </w:r>
-    </w:p>
-    <w:p>
-      <w:pPr>
-        <w:jc w:val="both"/>
-        <w:rPr>
-          <w:rFonts w:cs="TimesNewRomanPSMT"/>
-        </w:rPr>
-      </w:pPr>
-    </w:p>
-    <w:p>
-      <w:pPr>
-        <w:jc w:val="both"/>
-      </w:pPr>
-      <w:r>
-        <w:rPr>
-          <w:rFonts w:cs="TimesNewRomanPSMT"/>
-        </w:rPr>
-        <w:t>Les stipulations particulières suivantes s’appliquent :</w:t>
-      </w:r>
-    </w:p>
-    <w:p>
-      <w:pPr>
-        <w:jc w:val="both"/>
-        <w:rPr>
-          <w:rFonts w:cs="TimesNewRomanPSMT"/>
-        </w:rPr>
-      </w:pPr>
-    </w:p>
-    <w:p>
-      <w:pPr>
-        <w:jc w:val="both"/>
-      </w:pPr>
-      <w:r>
-        <w:rPr>
-          <w:rFonts w:cs="TimesNewRomanPSMT"/>
-        </w:rPr>
-        <w:t>1°- Conditions de location des logements de la résidence universitaire.</w:t>
-      </w:r>
-    </w:p>
-    <w:p>
-      <w:pPr>
-        <w:jc w:val="both"/>
-        <w:rPr>
-          <w:rFonts w:cs="TimesNewRomanPSMT"/>
-        </w:rPr>
-      </w:pPr>
-    </w:p>
-    <w:p>
-      <w:pPr>
-        <w:jc w:val="both"/>
-      </w:pPr>
-      <w:r>
-        <w:rPr>
-          <w:rFonts w:cs="TimesNewRomanPSMT"/>
-        </w:rPr>
-        <w:t>Les logements sont loués nus ou meublés à des étudiants, des personnes de moins de trente ans en formation ou en stage et des personnes titulaires d'un contrat de professionnalisation ou d'apprentissage, à titre de résidence principale, et occupés au moins huit mois par an. A titre exceptionnel, des logements peuvent être loués à des enseignants et des chercheurs.</w:t>
-      </w:r>
-    </w:p>
-    <w:p>
-      <w:pPr>
-        <w:jc w:val="both"/>
-        <w:rPr>
-          <w:rFonts w:ascii="TimesNewRomanPSMT" w:hAnsi="TimesNewRomanPSMT" w:cs="TimesNewRomanPSMT"/>
-        </w:rPr>
-      </w:pPr>
-    </w:p>
-    <w:p>
-      <w:pPr>
-        <w:jc w:val="both"/>
-      </w:pPr>
-      <w:r>
-        <w:rPr>
-          <w:rFonts w:cs="TimesNewRomanPSMT"/>
-        </w:rPr>
-        <w:t>Les logements peuvent également être loués dans les conditions prévues aux quatrième et cinquième alinéas du I de l’article L. 442-8-1 du code de la construction et de l’habitation.</w:t>
-      </w:r>
-    </w:p>
-    <w:p>
-      <w:pPr>
-        <w:jc w:val="both"/>
-        <w:rPr>
-          <w:rFonts w:cs="TimesNewRomanPSMT"/>
-        </w:rPr>
-      </w:pPr>
-    </w:p>
-    <w:p>
-      <w:pPr>
-        <w:jc w:val="both"/>
-      </w:pPr>
-      <w:r>
-        <w:rPr>
-          <w:rFonts w:cs="TimesNewRomanPSMT"/>
-        </w:rPr>
-        <w:t>2°- Modalités de fixation et de révision du loyer pratiqué des logements de la résidence universitaire.</w:t>
-      </w:r>
-    </w:p>
-    <w:p>
-      <w:pPr>
-        <w:jc w:val="both"/>
-        <w:rPr>
-          <w:rFonts w:cs="TimesNewRomanPSMT"/>
-        </w:rPr>
-      </w:pPr>
-    </w:p>
-    <w:p>
-      <w:pPr>
-        <w:jc w:val="both"/>
-      </w:pPr>
-      <w:r>
-        <w:rPr>
-          <w:rFonts w:cs="TimesNewRomanPSMT"/>
-        </w:rPr>
-        <w:t>Le loyer pratiqué pour chaque logement est fixé dans la limite du loyer maximum prévu par la présente convention.</w:t>
-      </w:r>
-    </w:p>
-    <w:p>
-      <w:pPr>
-        <w:jc w:val="both"/>
-        <w:rPr>
-          <w:rFonts w:ascii="TimesNewRomanPSMT" w:hAnsi="TimesNewRomanPSMT" w:cs="TimesNewRomanPSMT"/>
-        </w:rPr>
-      </w:pPr>
-    </w:p>
-    <w:p>
-      <w:pPr>
-        <w:jc w:val="both"/>
-      </w:pPr>
-      <w:r>
-        <w:rPr>
-          <w:rFonts w:cs="TimesNewRomanPSMT"/>
-        </w:rPr>
-        <w:t>Il ne peut donner lieu à révision en cours de bail.</w:t>
-      </w:r>
-    </w:p>
-    <w:p>
-      <w:pPr>
-        <w:jc w:val="both"/>
-        <w:rPr>
-          <w:rFonts w:cs="TimesNewRomanPSMT"/>
-        </w:rPr>
-      </w:pPr>
-    </w:p>
-    <w:p>
-      <w:pPr>
-        <w:jc w:val="both"/>
-      </w:pPr>
-      <w:r>
-        <w:rPr>
-          <w:rFonts w:cs="TimesNewRomanPSMT"/>
-        </w:rPr>
-        <w:t>Si le contrat de location est renouvelé dans les conditions prévues au 3° ci-dessous, le loyer peut être réévalué conformément aux dispositions du code de la construction et de l’habitation.</w:t>
-      </w:r>
-    </w:p>
-    <w:p>
-      <w:pPr>
-        <w:jc w:val="both"/>
-        <w:rPr>
-          <w:rFonts w:cs="TimesNewRomanPSMT"/>
-        </w:rPr>
-      </w:pPr>
-    </w:p>
-    <w:p>
-      <w:pPr>
-        <w:jc w:val="both"/>
-      </w:pPr>
-      <w:r>
-        <w:rPr>
-          <w:rFonts w:cs="TimesNewRomanPSMT"/>
-        </w:rPr>
-        <w:t>3°- Durée du contrat et congé donné par le locataire.</w:t>
-      </w:r>
-    </w:p>
-    <w:p>
-      <w:pPr>
-        <w:jc w:val="both"/>
-        <w:rPr>
-          <w:rFonts w:cs="TimesNewRomanPSMT"/>
-        </w:rPr>
-      </w:pPr>
-    </w:p>
-    <w:p>
-      <w:pPr>
-        <w:jc w:val="both"/>
-      </w:pPr>
-      <w:r>
-        <w:rPr>
-          <w:rFonts w:cs="TimesNewRomanPSMT"/>
-        </w:rPr>
-        <w:t>Par dérogation à l’article 15 de la présente convention, les locataires ne bénéficient pas du droit au maintien dans les lieux.</w:t>
-      </w:r>
-    </w:p>
-    <w:p>
-      <w:pPr>
-        <w:jc w:val="both"/>
-        <w:rPr>
-          <w:rFonts w:cs="TimesNewRomanPSMT"/>
-        </w:rPr>
-      </w:pPr>
-    </w:p>
-    <w:p>
-      <w:pPr>
-        <w:jc w:val="both"/>
-      </w:pPr>
-      <w:r>
-        <w:rPr>
-          <w:rFonts w:cs="TimesNewRomanPSMT"/>
-        </w:rPr>
-        <w:t>Le contrat de location a une durée maximale d'un an. Il peut être renouvelé dès lors que l'occupant continue à remplir les conditions prévues par l’article L. 631-12 du code de la construction et de l’habitation, ainsi que les conditions de ressources requises pour l’attribution du logement. Le renouvellement donne lieu à la signature d’un nouveau contrat.</w:t>
-      </w:r>
-    </w:p>
-    <w:p>
-      <w:pPr>
-        <w:jc w:val="both"/>
-        <w:rPr>
-          <w:rFonts w:cs="TimesNewRomanPSMT"/>
-        </w:rPr>
-      </w:pPr>
-    </w:p>
-    <w:p>
-      <w:pPr>
-        <w:jc w:val="both"/>
-      </w:pPr>
-      <w:r>
-        <w:rPr>
-          <w:rFonts w:cs="TimesNewRomanPSMT"/>
-        </w:rPr>
-        <w:lastRenderedPageBreak/>
-        <w:t>Le locataire peut donner congé à tout moment, dans les conditions des treizième à vingt-deuxième alinéas du I de l'article 15 de la loi du 6 juillet 1989 précitée. Il est redevable du loyer et des charges pendant la durée effective du délai de préavis, de jour à jour, sauf si le logement se trouve occupé avant la fin du préavis par un autre locataire en accord avec le bailleur.</w:t>
-      </w:r>
-    </w:p>
-    <w:p>
-      <w:pPr>
-        <w:jc w:val="both"/>
-        <w:rPr>
-          <w:rFonts w:ascii="TimesNewRomanPSMT" w:hAnsi="TimesNewRomanPSMT" w:cs="TimesNewRomanPSMT"/>
-        </w:rPr>
-      </w:pPr>
-    </w:p>
-    <w:p>
-      <w:pPr>
-        <w:jc w:val="both"/>
-      </w:pPr>
-      <w:r>
-        <w:rPr>
-          <w:rFonts w:cs="TimesNewRomanPSMT"/>
-        </w:rPr>
-        <w:t>4°- Forfait de charges.</w:t>
-      </w:r>
-    </w:p>
-    <w:p>
-      <w:pPr>
-        <w:jc w:val="both"/>
-        <w:rPr>
-          <w:rFonts w:cs="TimesNewRomanPSMT"/>
-        </w:rPr>
-      </w:pPr>
-    </w:p>
-    <w:p>
-      <w:pPr>
-        <w:jc w:val="both"/>
-      </w:pPr>
-      <w:r>
-        <w:rPr>
-          <w:rFonts w:cs="TimesNewRomanPSMT"/>
-        </w:rPr>
-        <w:t>En application du VIII de l’article 40 de la loi du 6 juillet 1989 précitée, les charges locatives accessoires au loyer principal des logements de la résidence universitaire peuvent être récupérées par le bailleur sous la forme d'un forfait versé simultanément au loyer, dont le montant et la périodicité de versement sont définis au contrat et qui ne peut donner lieu à complément ou à régularisation ultérieure. Le montant du forfait de charges est fixé en fonction des montants exigibles par le bailleur en application de l'article 23 de la loi du 6 juillet 1989 précitée. Ce montant</w:t>
-      </w:r>
-      <w:r>
-        <w:t xml:space="preserve"> </w:t>
-      </w:r>
-      <w:r>
-        <w:rPr>
-          <w:rFonts w:cs="TimesNewRomanPSMT"/>
-        </w:rPr>
-        <w:t>ne doit pas être manifestement disproportionné au regard des charges dont le locataire ou, le cas échéant, le précédent locataire se serait acquitté.</w:t>
-      </w:r>
-    </w:p>
-    <w:p>
-      <w:pPr>
-        <w:jc w:val="both"/>
-        <w:rPr>
-          <w:rFonts w:cs="TimesNewRomanPSMT"/>
-        </w:rPr>
-      </w:pPr>
-    </w:p>
-    <w:p>
-      <w:pPr>
-        <w:jc w:val="both"/>
-      </w:pPr>
-      <w:r>
-        <w:rPr>
-          <w:rFonts w:cs="TimesNewRomanPSMT"/>
-        </w:rPr>
-        <w:t>Si le bailleur a opté pour cette modalité de récupération des charges, il indique sur la quittance le montant du forfait</w:t>
-      </w:r>
-      <w:r>
-        <w:rPr>
-          <w:rFonts w:ascii="TimesNewRomanPSMT" w:hAnsi="TimesNewRomanPSMT" w:cs="TimesNewRomanPSMT"/>
-        </w:rPr>
-        <w:t>.</w:t>
-      </w:r>
-    </w:p>
-    <w:p>
-      <w:pPr>
-        <w:jc w:val="both"/>
-        <w:rPr>
-          <w:rFonts w:ascii="TimesNewRomanPSMT" w:hAnsi="TimesNewRomanPSMT" w:cs="TimesNewRomanPSMT"/>
-        </w:rPr>
-      </w:pPr>
-    </w:p>
-    <w:p>
-      <w:pPr>
-        <w:jc w:val="center"/>
-      </w:pPr>
-      <w:r>
-        <w:rPr>
-          <w:rFonts w:cs="TimesNewRomanPSMT"/>
-        </w:rPr>
-        <w:t>Article 19.</w:t>
-      </w:r>
-    </w:p>
-    <w:p>
-      <w:pPr>
-        <w:rPr>
-          <w:rFonts w:cs="TimesNewRomanPSMT"/>
-        </w:rPr>
-      </w:pPr>
-    </w:p>
-    <w:p>
-      <w:pPr>
-        <w:jc w:val="center"/>
       </w:pPr>
       <w:r>
         <w:rPr>
@@ -3879,710 +4559,33 @@
           <w:i/>
           <w:iCs/>
         </w:rPr>
-        <w:t>Renonciation au statut de résidence universitaire.</w:t>
-      </w:r>
-    </w:p>
-    <w:p>
-      <w:pPr>
-        <w:jc w:val="both"/>
-        <w:rPr>
-          <w:rFonts w:cs="TimesNewRomanPSMT"/>
-        </w:rPr>
-      </w:pPr>
-    </w:p>
-    <w:p>
-      <w:pPr>
-        <w:jc w:val="both"/>
-      </w:pPr>
-      <w:r>
-        <w:rPr>
-          <w:rFonts w:cs="TimesNewRomanPSMT"/>
-        </w:rPr>
-        <w:t>En cas de renonciation au statut de résidence universitaire, les dispositions relatives aux résidences universitaires figurant dans la présente convention sont sans objet. La renonciation au statut de résidence universitaire est définitive et s'effectue par avenant, à l’initiative du bailleur. Cet avenant est sans effet sur les contrats de location en cours. A l’échéance de chacun de ces contrats, le logement concerné est loué dans les conditions de droit commun de la présente convention.</w:t>
-      </w:r>
-    </w:p>
-    <w:p>
-      <w:pPr>
-        <w:jc w:val="both"/>
-        <w:rPr>
-          <w:rFonts w:ascii="TimesNewRomanPSMT" w:hAnsi="TimesNewRomanPSMT" w:cs="TimesNewRomanPSMT"/>
-        </w:rPr>
-      </w:pPr>
-    </w:p>
-    <w:p>
-      <w:pPr>
-        <w:jc w:val="both"/>
-        <w:rPr>
-          <w:rFonts w:cs="TimesNewRomanPSMT"/>
-        </w:rPr>
-      </w:pPr>
-    </w:p>
-    <w:p>
-      <w:pPr>
-        <w:jc w:val="center"/>
-      </w:pPr>
-      <w:r>
-        <w:rPr>
-          <w:rFonts w:cs="TimesNewRomanPS-BoldMT"/>
-          <w:b/>
-        </w:rPr>
-        <w:t>V.-Engagements du bailleur à l'égard des organismes chargés de la liquidation et du paiement de l'APL.</w:t>
-      </w:r>
-    </w:p>
-    <w:p>
-      <w:pPr>
-        <w:rPr>
-          <w:rFonts w:cs="TimesNewRomanPS-BoldMT"/>
-          <w:b/>
-        </w:rPr>
-      </w:pPr>
-    </w:p>
-    <w:p>
-      <w:pPr>
-        <w:jc w:val="center"/>
-      </w:pPr>
-      <w:r>
-        <w:rPr>
-          <w:rFonts w:cs="TimesNewRomanPSMT"/>
-        </w:rPr>
-        <w:t>Article 20.</w:t>
-      </w:r>
-    </w:p>
-    <w:p>
-      <w:pPr>
-        <w:rPr>
-          <w:rFonts w:cs="TimesNewRomanPSMT"/>
-        </w:rPr>
-      </w:pPr>
-    </w:p>
-    <w:p>
-      <w:pPr>
-        <w:jc w:val="center"/>
-      </w:pPr>
-      <w:r>
-        <w:rPr>
-          <w:rFonts w:cs="TimesNewRomanPSMT"/>
-          <w:i/>
-          <w:iCs/>
-        </w:rPr>
-        <w:t>Obligations générales.</w:t>
-      </w:r>
-    </w:p>
-    <w:p>
-      <w:pPr>
-        <w:jc w:val="both"/>
-        <w:rPr>
-          <w:rFonts w:cs="TimesNewRomanPSMT"/>
-        </w:rPr>
-      </w:pPr>
-    </w:p>
-    <w:p>
-      <w:pPr>
-        <w:jc w:val="both"/>
-      </w:pPr>
-      <w:r>
-        <w:rPr>
-          <w:rFonts w:cs="TimesNewRomanPSMT"/>
-        </w:rPr>
-        <w:t>1° Pour chaque locataire demandeur de l'APL, le bailleur s’engage à favoriser l’utilisation des services dématérialisés mis à sa disposition par les organismes payeurs pour l’envoi des informations nécessaires à l’étude d’un droit à une aide au logement. En dernier ressort, il renseigne dès l'entrée en vigueur de la convention pour chaque locataire demandeur de l'APL, la partie de l'imprimé de demande d'APL qui le concerne.</w:t>
-      </w:r>
-    </w:p>
-    <w:p>
-      <w:pPr>
-        <w:jc w:val="both"/>
-        <w:rPr>
-          <w:rFonts w:cs="TimesNewRomanPSMT"/>
-        </w:rPr>
-      </w:pPr>
-    </w:p>
-    <w:p>
-      <w:pPr>
-        <w:jc w:val="both"/>
-      </w:pPr>
-      <w:r>
-        <w:rPr>
-          <w:rFonts w:cs="TimesNewRomanPSMT"/>
-        </w:rPr>
-        <w:t xml:space="preserve">2° Pour permettre le renouvellement des droits à l’APL au 1er janvier de chaque année, le bailleur fournit aux organismes liquidateurs de l'APL au plus tard le 15 novembre de chaque année, conformément à l'arrêté du 22 août 1986 relatif à la fixation des </w:t>
+        <w:t>Information des organismes chargés de la liquidation et du paiement des APL</w:t>
+      </w:r>
+    </w:p>
+    <w:p>
+      <w:pPr>
+        <w:jc w:val="both"/>
+        <w:rPr>
+          <w:rFonts w:cs="TimesNewRomanPSMT"/>
+        </w:rPr>
+      </w:pPr>
+    </w:p>
+    <w:p>
+      <w:pPr>
+        <w:jc w:val="both"/>
+      </w:pPr>
+      <w:r>
+        <w:rPr>
+          <w:rFonts w:cs="TimesNewRomanPSMT"/>
+        </w:rPr>
+        <w:t xml:space="preserve">Le préfet, ou, lorsqu'un établissement public de coopération intercommunale, un département, la métropole de Lyon ou la collectivité de Corse a signé une convention </w:t>
       </w:r>
       <w:r>
         <w:rPr>
           <w:rFonts w:cs="TimesNewRomanPSMT"/>
         </w:rPr>
         <w:lastRenderedPageBreak/>
-        <w:t>justifications nécessaires à l'obtention de l'aide personnalisée au logement et à son renouvellement :</w:t>
-      </w:r>
-    </w:p>
-    <w:p>
-      <w:pPr>
-        <w:jc w:val="both"/>
-        <w:rPr>
-          <w:rFonts w:cs="TimesNewRomanPSMT"/>
-        </w:rPr>
-      </w:pPr>
-    </w:p>
-    <w:p>
-      <w:pPr>
-        <w:jc w:val="both"/>
-      </w:pPr>
-      <w:r>
-        <w:rPr>
-          <w:rFonts w:cs="TimesNewRomanPSMT"/>
-        </w:rPr>
-        <w:t>- une attestation concernant le montant du loyer applicable à chaque logement concerné par la présente convention, à compter du 1er juillet de l’année en cours ;</w:t>
-      </w:r>
-    </w:p>
-    <w:p>
-      <w:pPr>
-        <w:jc w:val="both"/>
-        <w:rPr>
-          <w:rFonts w:cs="TimesNewRomanPSMT"/>
-        </w:rPr>
-      </w:pPr>
-    </w:p>
-    <w:p>
-      <w:pPr>
-        <w:jc w:val="both"/>
-      </w:pPr>
-      <w:r>
-        <w:rPr>
-          <w:rFonts w:cs="TimesNewRomanPSMT"/>
-        </w:rPr>
-        <w:t>- un document attestant que tous les bénéficiaires sont à jour de leurs obligations vis-à-vis du bailleur ou, le cas échéant, la liste des bénéficiaires d'APL non à jour en certifiant que cette liste est exhaustive. Ce document mentionne également la date à laquelle l’organisme payeur a été saisi en cas d’impayé constitué selon la définition fixée par l’article R. 824-1 du code de la construction et de l’habitation.</w:t>
-      </w:r>
-    </w:p>
-    <w:p>
-      <w:pPr>
-        <w:jc w:val="both"/>
-        <w:rPr>
-          <w:rFonts w:ascii="TimesNewRomanPSMT" w:hAnsi="TimesNewRomanPSMT" w:cs="TimesNewRomanPSMT"/>
-        </w:rPr>
-      </w:pPr>
-    </w:p>
-    <w:p>
-      <w:pPr>
-        <w:jc w:val="both"/>
-      </w:pPr>
-      <w:r>
-        <w:rPr>
-          <w:rFonts w:cs="TimesNewRomanPSMT"/>
-        </w:rPr>
-        <w:t>Ces transmissions peuvent s’effectuer grâce à un dispositif de collecte dématérialisé.</w:t>
-      </w:r>
-    </w:p>
-    <w:p>
-      <w:pPr>
-        <w:jc w:val="both"/>
-        <w:rPr>
-          <w:rFonts w:cs="TimesNewRomanPSMT"/>
-        </w:rPr>
-      </w:pPr>
-    </w:p>
-    <w:p>
-      <w:pPr>
-        <w:jc w:val="both"/>
-      </w:pPr>
-      <w:r>
-        <w:rPr>
-          <w:rFonts w:cs="TimesNewRomanPSMT"/>
-        </w:rPr>
-        <w:t>3° En outre, il fait part dans un délai maximum d'un mois aux organismes liquidateurs de l'APL des modifications affectant la situation locative du bénéficiaire (notamment colocation, résiliation de bail, décès).</w:t>
-      </w:r>
-    </w:p>
-    <w:p>
-      <w:pPr>
-        <w:jc w:val="both"/>
-        <w:rPr>
-          <w:rFonts w:ascii="TimesNewRomanPSMT" w:hAnsi="TimesNewRomanPSMT" w:cs="TimesNewRomanPSMT"/>
-        </w:rPr>
-      </w:pPr>
-    </w:p>
-    <w:p>
-      <w:pPr>
-        <w:jc w:val="center"/>
-      </w:pPr>
-      <w:r>
-        <w:rPr>
-          <w:rFonts w:cs="TimesNewRomanPSMT"/>
-        </w:rPr>
-        <w:t>Article 21.</w:t>
-      </w:r>
-    </w:p>
-    <w:p>
-      <w:pPr>
-        <w:rPr>
-          <w:rFonts w:cs="TimesNewRomanPSMT"/>
-        </w:rPr>
-      </w:pPr>
-    </w:p>
-    <w:p>
-      <w:pPr>
-        <w:jc w:val="center"/>
-      </w:pPr>
-      <w:r>
-        <w:rPr>
-          <w:rFonts w:cs="TimesNewRomanPSMT"/>
-          <w:i/>
-          <w:iCs/>
-        </w:rPr>
-        <w:t>Obligations en cas d’impayé.</w:t>
-      </w:r>
-    </w:p>
-    <w:p>
-      <w:pPr>
-        <w:jc w:val="both"/>
-        <w:rPr>
-          <w:rFonts w:cs="TimesNewRomanPSMT"/>
-        </w:rPr>
-      </w:pPr>
-    </w:p>
-    <w:p>
-      <w:pPr>
-        <w:jc w:val="both"/>
-      </w:pPr>
-      <w:r>
-        <w:rPr>
-          <w:rFonts w:cs="TimesNewRomanPSMT"/>
-        </w:rPr>
-        <w:t>En application des articles L. 824-1 et R. 824-4 du code de la construction et de l’habitation, le bailleur auprès duquel l'aide est versée signale à l’organisme payeur lorsqu’un allocataire ne règle pas la part de la dépense de logement restant à sa charge, dans un délai de deux mois après la constitution de l'impayé défini à l’article R. 824-1 du code de la construction et de l’habitation, sauf si la somme due a été réglée entre-temps en totalité. Le bailleur doit justifier qu'il poursuit par tous les moyens possibles le recouvrement de sa créance. En outre, il communique le montant de l'impayé constitué au moment de la saisine de l’organisme payeur.</w:t>
-      </w:r>
-    </w:p>
-    <w:p>
-      <w:pPr>
-        <w:jc w:val="both"/>
-        <w:rPr>
-          <w:rFonts w:ascii="TimesNewRomanPSMT" w:hAnsi="TimesNewRomanPSMT" w:cs="TimesNewRomanPSMT"/>
-        </w:rPr>
-      </w:pPr>
-    </w:p>
-    <w:p>
-      <w:pPr>
-        <w:jc w:val="both"/>
-      </w:pPr>
-      <w:r>
-        <w:rPr>
-          <w:rFonts w:cs="TimesNewRomanPSMT"/>
-        </w:rPr>
-        <w:t>Parallèlement, en cas d'impayé, le bailleur doit poursuivre le recouvrement de sa créance en notifiant au locataire défaillant par lettre recommandée avec accusé de réception le montant de cette créance. Il doit également informer le locataire de la saisine de l’organisme payeur.</w:t>
-      </w:r>
-    </w:p>
-    <w:p>
-      <w:pPr>
-        <w:jc w:val="both"/>
-        <w:rPr>
-          <w:rFonts w:cs="TimesNewRomanPSMT"/>
-        </w:rPr>
-      </w:pPr>
-    </w:p>
-    <w:p>
-      <w:pPr>
-        <w:jc w:val="both"/>
-      </w:pPr>
-      <w:r>
-        <w:rPr>
-          <w:rFonts w:cs="TimesNewRomanPSMT"/>
-        </w:rPr>
-        <w:t>La commission de coordination des actions de prévention des expulsions locatives (CCAPEX) est systématiquement informée par l’organisme payeur des APL en vue de prévenir leurs éventuelles suspensions par une mobilisation coordonnée des outils de prévention (article 7-2 de la loi n° 90- 449 du 31 mai 1990 visant à la mise en œuvre du droit au logement).</w:t>
-      </w:r>
-    </w:p>
-    <w:p>
-      <w:pPr>
-        <w:jc w:val="both"/>
-        <w:rPr>
-          <w:rFonts w:cs="TimesNewRomanPSMT"/>
-        </w:rPr>
-      </w:pPr>
-    </w:p>
-    <w:p>
-      <w:pPr>
-        <w:jc w:val="both"/>
-      </w:pPr>
-      <w:r>
-        <w:rPr>
-          <w:rFonts w:cs="TimesNewRomanPSMT"/>
-        </w:rPr>
-        <w:t>La CCAPEX est réputée avoir été régulièrement saisie lorsque le bailleur a préalablement signalé l’impayé à l’organisme payeur des APL selon les modalités définies à l’article R. 824-4 précité.</w:t>
-      </w:r>
-    </w:p>
-    <w:p>
-      <w:pPr>
-        <w:jc w:val="both"/>
-        <w:rPr>
-          <w:rFonts w:cs="TimesNewRomanPS-BoldMT"/>
-          <w:b/>
-        </w:rPr>
-      </w:pPr>
-    </w:p>
-    <w:p>
-      <w:pPr>
-        <w:jc w:val="both"/>
-        <w:rPr>
-          <w:rFonts w:cs="TimesNewRomanPS-BoldMT"/>
-          <w:b/>
-        </w:rPr>
-      </w:pPr>
-    </w:p>
-    <w:p>
-      <w:pPr>
-        <w:jc w:val="center"/>
-      </w:pPr>
-      <w:r>
-        <w:rPr>
-          <w:rFonts w:cs="TimesNewRomanPS-BoldMT"/>
-          <w:b/>
-        </w:rPr>
-        <w:t>VI.-Dispositions relatives à l’application de la convention.</w:t>
-      </w:r>
-    </w:p>
-    <w:p>
-      <w:pPr>
-        <w:rPr>
-          <w:rFonts w:cs="TimesNewRomanPS-BoldMT"/>
-          <w:b/>
-        </w:rPr>
-      </w:pPr>
-    </w:p>
-    <w:p>
-      <w:pPr>
-        <w:jc w:val="center"/>
-      </w:pPr>
-      <w:r>
-        <w:rPr>
-          <w:rFonts w:cs="TimesNewRomanPSMT"/>
-        </w:rPr>
-        <w:t>Article 22.</w:t>
-      </w:r>
-    </w:p>
-    <w:p>
-      <w:pPr>
-        <w:rPr>
-          <w:rFonts w:cs="TimesNewRomanPSMT"/>
-        </w:rPr>
-      </w:pPr>
-    </w:p>
-    <w:p>
-      <w:pPr>
-        <w:jc w:val="center"/>
-      </w:pPr>
-      <w:r>
-        <w:rPr>
-          <w:rFonts w:cs="TimesNewRomanPSMT"/>
-          <w:i/>
-          <w:iCs/>
-        </w:rPr>
-        <w:t>Contrôle.</w:t>
-      </w:r>
-    </w:p>
-    <w:p>
-      <w:pPr>
-        <w:jc w:val="both"/>
-        <w:rPr>
-          <w:rFonts w:cs="TimesNewRomanPSMT"/>
-        </w:rPr>
-      </w:pPr>
-    </w:p>
-    <w:p>
-      <w:pPr>
-        <w:jc w:val="both"/>
-      </w:pPr>
-      <w:r>
-        <w:rPr>
-          <w:rFonts w:cs="TimesNewRomanPSMT"/>
-        </w:rPr>
-        <w:t>Afin de permettre le contrôle de l'application de la présente convention, le bailleur fournit à tout moment à la demande du préfet ou de l’Agence nationale de contrôle du logement social toutes les informations et tous les documents nécessaires au plein exercice de ce contrôle.</w:t>
-      </w:r>
-    </w:p>
-    <w:p>
-      <w:pPr>
-        <w:jc w:val="both"/>
-        <w:rPr>
-          <w:rFonts w:cs="TimesNewRomanPSMT"/>
-        </w:rPr>
-      </w:pPr>
-    </w:p>
-    <w:p>
-      <w:pPr>
-        <w:jc w:val="center"/>
-      </w:pPr>
-      <w:r>
-        <w:rPr>
-          <w:rFonts w:cs="TimesNewRomanPSMT"/>
-        </w:rPr>
-        <w:t>Article 23.</w:t>
-      </w:r>
-    </w:p>
-    <w:p>
-      <w:pPr>
-        <w:rPr>
-          <w:rFonts w:cs="TimesNewRomanPSMT"/>
-        </w:rPr>
-      </w:pPr>
-    </w:p>
-    <w:p>
-      <w:pPr>
-        <w:jc w:val="center"/>
-      </w:pPr>
-      <w:r>
-        <w:rPr>
-          <w:rFonts w:cs="TimesNewRomanPSMT"/>
-          <w:i/>
-          <w:iCs/>
-        </w:rPr>
-        <w:t>Révision de la convention.</w:t>
-      </w:r>
-    </w:p>
-    <w:p>
-      <w:pPr>
-        <w:jc w:val="both"/>
-        <w:rPr>
-          <w:rFonts w:cs="TimesNewRomanPSMT"/>
-        </w:rPr>
-      </w:pPr>
-    </w:p>
-    <w:p>
-      <w:pPr>
-        <w:jc w:val="both"/>
-      </w:pPr>
-      <w:r>
-        <w:rPr>
-          <w:rFonts w:cs="TimesNewRomanPSMT"/>
-        </w:rPr>
-        <w:t>La présente convention pourra être révisée à la demande de l'une ou l'autre des parties par voie d'avenant.</w:t>
-      </w:r>
-    </w:p>
-    <w:p>
-      <w:pPr>
-        <w:jc w:val="both"/>
-        <w:rPr>
-          <w:rFonts w:ascii="TimesNewRomanPSMT" w:hAnsi="TimesNewRomanPSMT" w:cs="TimesNewRomanPSMT"/>
-        </w:rPr>
-      </w:pPr>
-    </w:p>
-    <w:p>
-      <w:pPr>
-        <w:jc w:val="center"/>
-      </w:pPr>
-      <w:r>
-        <w:rPr>
-          <w:rFonts w:cs="TimesNewRomanPSMT"/>
-        </w:rPr>
-        <w:t>Article 24.</w:t>
-      </w:r>
-    </w:p>
-    <w:p>
-      <w:pPr>
-        <w:rPr>
-          <w:rFonts w:cs="TimesNewRomanPSMT"/>
-        </w:rPr>
-      </w:pPr>
-    </w:p>
-    <w:p>
-      <w:pPr>
-        <w:jc w:val="center"/>
-      </w:pPr>
-      <w:r>
-        <w:rPr>
-          <w:rFonts w:cs="TimesNewRomanPSMT"/>
-          <w:i/>
-          <w:iCs/>
-        </w:rPr>
-        <w:t>Inexécution de la convention par le bailleur.</w:t>
-      </w:r>
-    </w:p>
-    <w:p>
-      <w:pPr>
-        <w:jc w:val="both"/>
-        <w:rPr>
-          <w:rFonts w:cs="TimesNewRomanPSMT"/>
-        </w:rPr>
-      </w:pPr>
-    </w:p>
-    <w:p>
-      <w:pPr>
-        <w:jc w:val="both"/>
-      </w:pPr>
-      <w:r>
-        <w:rPr>
-          <w:rFonts w:cs="TimesNewRomanPSMT"/>
-        </w:rPr>
-        <w:t>1°- En application de l'article 284 du code général des impôts, les bailleurs qui ont, au taux réduit de la taxe sur la valeur ajoutée, acquis un logement social ou imposé la livraison à soi-même d'un logement locatif social ou de travaux d'amélioration, de transformation ou d'aménagement portant sur un logement locatif social sont redevables d'un complément de taxe sur la valeur ajoutée égal à la différence entre le taux réduit et le taux normal lorsque les conditions de taxation de vente ou de livraison à soi-même au taux réduit ne sont pas ou plus remplies.</w:t>
-      </w:r>
-    </w:p>
-    <w:p>
-      <w:pPr>
-        <w:jc w:val="both"/>
-        <w:rPr>
-          <w:rFonts w:ascii="TimesNewRomanPSMT" w:hAnsi="TimesNewRomanPSMT" w:cs="TimesNewRomanPSMT"/>
-        </w:rPr>
-      </w:pPr>
-    </w:p>
-    <w:p>
-      <w:pPr>
-        <w:jc w:val="both"/>
-      </w:pPr>
-      <w:r>
-        <w:rPr>
-          <w:rFonts w:cs="TimesNewRomanPSMT"/>
-        </w:rPr>
-        <w:t>2°- En application de l'article L. 353-2 du code de la construction et de l'habitation, des sanctions administratives peuvent être mises en œuvre.</w:t>
-      </w:r>
-    </w:p>
-    <w:p>
-      <w:pPr>
-        <w:jc w:val="both"/>
-        <w:rPr>
-          <w:rFonts w:cs="TimesNewRomanPSMT"/>
-        </w:rPr>
-      </w:pPr>
-    </w:p>
-    <w:p>
-      <w:pPr>
-        <w:jc w:val="both"/>
-      </w:pPr>
-      <w:r>
-        <w:rPr>
-          <w:rFonts w:cs="TimesNewRomanPSMT"/>
-        </w:rPr>
-        <w:t>En application de l’article L. 353-11 du code de la construction et de l’habitation, le contrôle de l’application de la présente convention est assuré par l’Agence nationale de contrôle du logement social, que le préfet est tenu de saisir en cas de manquement constaté.</w:t>
-      </w:r>
-    </w:p>
-    <w:p>
-      <w:pPr>
-        <w:jc w:val="both"/>
-        <w:rPr>
-          <w:rFonts w:cs="TimesNewRomanPSMT"/>
-        </w:rPr>
-      </w:pPr>
-    </w:p>
-    <w:p>
-      <w:pPr>
-        <w:jc w:val="both"/>
-      </w:pPr>
-      <w:r>
-        <w:rPr>
-          <w:rFonts w:cs="TimesNewRomanPSMT"/>
-        </w:rPr>
-        <w:t>Lorsqu'un organisme ne respecte pas, pour un ou plusieurs logements, les engagements prévus par la convention, et après que l'organisme a été mis en mesure de présenter ses observations conformément aux dispositions de l'article L. 342-12 du code de la construction et de l’habitation ou, en cas de mise en demeure, à l'issue du délai mentionné à ce même article, l’Agence nationale de contrôle du logement social peut proposer au ministre chargé du logement de prononcer une sanction en application de l’article L. 342-14 du même code.</w:t>
-      </w:r>
-    </w:p>
-    <w:p>
-      <w:pPr>
-        <w:jc w:val="both"/>
-        <w:rPr>
-          <w:rFonts w:cs="TimesNewRomanPSMT"/>
-        </w:rPr>
-      </w:pPr>
-    </w:p>
-    <w:p>
-      <w:pPr>
-        <w:jc w:val="both"/>
-      </w:pPr>
-      <w:r>
-        <w:rPr>
-          <w:rFonts w:cs="TimesNewRomanPSMT"/>
-        </w:rPr>
-        <w:t>3°- En cas d'inexécution par le bailleur de ses engagements prévus par la convention, tels que notamment non-respect du loyer maximum ou en cas de fraude, dissimulation ou fausse déclaration à l'égard des organismes liquidateurs de l'APL, le préfet peut procéder à la résiliation de la présente convention aux torts du bailleur. Le préfet doit préalablement mettre en demeure l'organisme par lettre recommandée avec demande d'avis de réception. L'organisme doit dans un délai de deux mois soit satisfaire à ses obligations, soit formuler ses observations.</w:t>
-      </w:r>
-    </w:p>
-    <w:p>
-      <w:pPr>
-        <w:jc w:val="both"/>
-        <w:rPr>
-          <w:rFonts w:cs="TimesNewRomanPSMT"/>
-        </w:rPr>
-      </w:pPr>
-    </w:p>
-    <w:p>
-      <w:pPr>
-        <w:jc w:val="both"/>
-      </w:pPr>
-      <w:r>
-        <w:rPr>
-          <w:rFonts w:cs="TimesNewRomanPSMT"/>
-        </w:rPr>
-        <w:t>Lorsque le préfet écarte ces observations, sa décision doit être motivée.</w:t>
-      </w:r>
-    </w:p>
-    <w:p>
-      <w:pPr>
-        <w:jc w:val="both"/>
-        <w:rPr>
-          <w:rFonts w:cs="TimesNewRomanPSMT"/>
-        </w:rPr>
-      </w:pPr>
-    </w:p>
-    <w:p>
-      <w:pPr>
-        <w:jc w:val="both"/>
-      </w:pPr>
-      <w:r>
-        <w:rPr>
-          <w:rFonts w:cs="TimesNewRomanPSMT"/>
-        </w:rPr>
-        <w:t>Dans ce cas, il est fait application des dispositions prévues à l'article L. 353-6 du code de la construction et de l'habitation.</w:t>
-      </w:r>
-    </w:p>
-    <w:p>
-      <w:pPr>
-        <w:jc w:val="both"/>
-        <w:rPr>
-          <w:rFonts w:ascii="TimesNewRomanPSMT" w:hAnsi="TimesNewRomanPSMT" w:cs="TimesNewRomanPSMT"/>
-        </w:rPr>
-      </w:pPr>
-    </w:p>
-    <w:p>
-      <w:pPr>
-        <w:jc w:val="center"/>
-      </w:pPr>
-      <w:r>
-        <w:rPr>
-          <w:rFonts w:cs="TimesNewRomanPSMT"/>
-        </w:rPr>
-        <w:t>Article 25.</w:t>
-      </w:r>
-    </w:p>
-    <w:p>
-      <w:pPr>
-        <w:rPr>
-          <w:rFonts w:cs="TimesNewRomanPSMT"/>
-        </w:rPr>
-      </w:pPr>
-    </w:p>
-    <w:p>
-      <w:pPr>
-        <w:jc w:val="center"/>
-        <w:rPr>
-          <w:rFonts w:cs="TimesNewRomanPSMT"/>
-          <w:i/>
-          <w:iCs/>
-        </w:rPr>
-      </w:pPr>
-      <w:r>
-        <w:rPr>
-          <w:rFonts w:cs="TimesNewRomanPSMT"/>
-          <w:i/>
-          <w:iCs/>
-        </w:rPr>
-        <w:t>Information des organismes chargés de la liquidation et du paiement des APL</w:t>
-      </w:r>
-    </w:p>
-    <w:p>
-      <w:pPr>
-        <w:jc w:val="both"/>
-        <w:rPr>
-          <w:rFonts w:cs="TimesNewRomanPSMT"/>
-        </w:rPr>
-      </w:pPr>
-    </w:p>
-    <w:p>
-      <w:pPr>
-        <w:jc w:val="both"/>
-      </w:pPr>
-      <w:r>
-        <w:rPr>
-          <w:rFonts w:cs="TimesNewRomanPSMT"/>
-        </w:rPr>
-        <w:t>Le préfet, ou, lorsqu'un établissement public de coopération intercommunale, un département, la métropole de Lyon ou la collectivité de Corse a signé une convention mentionnée aux articles L. 301-5-1, L. 301-5-2, L. 3641-5, L. 5219-1, L. 5218-2 et L. 5217-2 précités, le président de l'établissement public de coopération intercommunale, du conseil départemental, de la métropole de Lyon ou du conseil exécutif de Corse transmet aux organismes chargés de la liquidation et du</w:t>
+        <w:t>mentionnée aux articles L. 301-5-1, L. 301-5-2, L. 3641-5, L. 5219-1, L. 5218-2 et L. 5217-2 précités, le président de l'établissement public de coopération intercommunale, du conseil départemental, de la métropole de Lyon ou du conseil exécutif de Corse transmet aux organismes chargés de la liquidation et du</w:t>
       </w:r>
     </w:p>
     <w:p>
@@ -15905,90 +15908,6 @@
 
 <file path=word/header3.xml><?xml version="1.0" encoding="utf-8"?>
 <w:hdr xmlns:wpc="http://schemas.microsoft.com/office/word/2010/wordprocessingCanvas" xmlns:cx="http://schemas.microsoft.com/office/drawing/2014/chartex" xmlns:cx1="http://schemas.microsoft.com/office/drawing/2015/9/8/chartex" xmlns:cx2="http://schemas.microsoft.com/office/drawing/2015/10/21/chartex" xmlns:cx3="http://schemas.microsoft.com/office/drawing/2016/5/9/chartex" xmlns:cx4="http://schemas.microsoft.com/office/drawing/2016/5/10/chartex" xmlns:cx5="http://schemas.microsoft.com/office/drawing/2016/5/11/chartex" xmlns:cx6="http://schemas.microsoft.com/office/drawing/2016/5/12/chartex" xmlns:cx7="http://schemas.microsoft.com/office/drawing/2016/5/13/chartex" xmlns:cx8="http://schemas.microsoft.com/office/drawing/2016/5/14/chartex" xmlns:mc="http://schemas.openxmlformats.org/markup-compatibility/2006" xmlns:aink="http://schemas.microsoft.com/office/drawing/2016/ink" xmlns:am3d="http://schemas.microsoft.com/office/drawing/2017/model3d" xmlns:o="urn:schemas-microsoft-com:office:office" xmlns:oel="http://schemas.microsoft.com/office/2019/extlst" xmlns:r="http://schemas.openxmlformats.org/officeDocument/2006/relationships" xmlns:m="http://schemas.openxmlformats.org/officeDocument/2006/math" xmlns:v="urn:schemas-microsoft-com:vml" xmlns:wp14="http://schemas.microsoft.com/office/word/2010/wordprocessingDrawing" xmlns:wp="http://schemas.openxmlformats.org/drawingml/2006/wordprocessingDrawing" xmlns:w10="urn:schemas-microsoft-com:office:word" xmlns:w="http://schemas.openxmlformats.org/wordprocessingml/2006/main" xmlns:w14="http://schemas.microsoft.com/office/word/2010/wordml" xmlns:w15="http://schemas.microsoft.com/office/word/2012/wordml" xmlns:w16cex="http://schemas.microsoft.com/office/word/2018/wordml/cex" xmlns:w16cid="http://schemas.microsoft.com/office/word/2016/wordml/cid" xmlns:w16="http://schemas.microsoft.com/office/word/2018/wordml" xmlns:w16du="http://schemas.microsoft.com/office/word/2023/wordml/word16du" xmlns:w16sdtdh="http://schemas.microsoft.com/office/word/2020/wordml/sdtdatahash" xmlns:w16sdtfl="http://schemas.microsoft.com/office/word/2024/wordml/sdtformatlock" xmlns:w16se="http://schemas.microsoft.com/office/word/2015/wordml/symex" xmlns:wpg="http://schemas.microsoft.com/office/word/2010/wordprocessingGroup" xmlns:wpi="http://schemas.microsoft.com/office/word/2010/wordprocessingInk" xmlns:wne="http://schemas.microsoft.com/office/word/2006/wordml" xmlns:wps="http://schemas.microsoft.com/office/word/2010/wordprocessingShape" mc:Ignorable="w14 w15 w16se w16cid w16 w16cex w16sdtdh w16sdtfl w16du wp14">
-  <w:tbl>
-    <w:tblPr>
-      <w:tblStyle w:val="Grilledutableau"/>
-      <w:tblW w:w="3440" w:type="dxa"/>
-      <w:jc w:val="center"/>
-      <w:tblLayout w:type="fixed"/>
-      <w:tblLook w:val="04A0" w:firstRow="1" w:lastRow="0" w:firstColumn="1" w:lastColumn="0" w:noHBand="0" w:noVBand="1"/>
-    </w:tblPr>
-    <w:tblGrid>
-      <w:gridCol w:w="3440"/>
-    </w:tblGrid>
-    <w:tr>
-      <w:trPr>
-        <w:jc w:val="center"/>
-      </w:trPr>
-      <w:tc>
-        <w:tcPr>
-          <w:tcW w:w="3440" w:type="dxa"/>
-          <w:tcBorders>
-            <w:right w:val="nil"/>
-          </w:tcBorders>
-        </w:tcPr>
-        <w:p>
-          <w:pPr>
-            <w:widowControl w:val="0"/>
-            <w:rPr>
-              <w:sz w:val="4"/>
-              <w:szCs w:val="4"/>
-            </w:rPr>
-          </w:pPr>
-        </w:p>
-        <w:p>
-          <w:pPr>
-            <w:widowControl w:val="0"/>
-            <w:rPr>
-              <w:sz w:val="20"/>
-              <w:szCs w:val="20"/>
-            </w:rPr>
-          </w:pPr>
-          <w:r>
-            <w:rPr>
-              <w:sz w:val="20"/>
-              <w:szCs w:val="20"/>
-            </w:rPr>
-            <w:t>DATE</w:t>
-          </w:r>
-        </w:p>
-        <w:p>
-          <w:pPr>
-            <w:widowControl w:val="0"/>
-            <w:rPr>
-              <w:sz w:val="20"/>
-              <w:szCs w:val="20"/>
-            </w:rPr>
-          </w:pPr>
-        </w:p>
-        <w:p>
-          <w:pPr>
-            <w:widowControl w:val="0"/>
-            <w:rPr>
-              <w:sz w:val="20"/>
-              <w:szCs w:val="20"/>
-            </w:rPr>
-          </w:pPr>
-        </w:p>
-        <w:p>
-          <w:pPr>
-            <w:widowControl w:val="0"/>
-            <w:rPr>
-              <w:sz w:val="20"/>
-              <w:szCs w:val="20"/>
-            </w:rPr>
-          </w:pPr>
-          <w:r>
-            <w:rPr>
-              <w:sz w:val="20"/>
-              <w:szCs w:val="20"/>
-            </w:rPr>
-            <w:t>VOL                      N°</w:t>
-          </w:r>
-        </w:p>
-      </w:tc>
-    </w:tr>
-  </w:tbl>
   <w:p>
     <w:pPr>
       <w:pStyle w:val="En-tte"/>
@@ -17731,6 +17650,7 @@
   <w:style w:type="character" w:default="1" w:styleId="Policepardfaut">
     <w:name w:val="Default Paragraph Font"/>
     <w:uiPriority w:val="1"/>
+    <w:semiHidden/>
     <w:unhideWhenUsed/>
   </w:style>
   <w:style w:type="table" w:default="1" w:styleId="TableauNormal">

</xml_diff>

<commit_message>
fix artefact spf on HLM-template.docx (#2178)
</commit_message>
<xml_diff>
--- a/documents/HLM-template.docx
+++ b/documents/HLM-template.docx
@@ -511,7 +511,6 @@
         <w:rPr>
           <w:rFonts w:cs="TimesNewRomanPSMT"/>
         </w:rPr>
-        <w:lastRenderedPageBreak/>
         <w:t xml:space="preserve">La présente convention a pour objet de fixer les droits et les obligations des parties prévus par les articles L. 353-1 à L. 353-17 du code de la construction et de l'habitation pour l'opération de </w:t>
       </w:r>
       <w:bookmarkStart w:id="11" w:name="NomProgramme2"/>
@@ -542,6 +541,7 @@
         <w:rPr>
           <w:rFonts w:cs="TimesNewRomanPSMT"/>
         </w:rPr>
+        <w:lastRenderedPageBreak/>
         <w:t>   {{ lot.nb_logements }} logement{{ lot.nb_logements|pl }} {{ lot.financement }}{% if not loop.last %},{% endif %}{% endfor %} {{adresse|inline_text_multiline }} à {{code_postal }},  {{ville }}</w:t>
       </w:r>
     </w:p>
@@ -860,8 +860,14 @@
         <w:rPr>
           <w:rFonts w:cs="TimesNewRomanPSMT"/>
         </w:rPr>
+        <w:t xml:space="preserve">Les logements objets de la présente convention sont soumis aux dispositions de la loi n° 89-462 du 6 juillet 1989 tendant à améliorer les rapports locatifs et portant modification de la loi n° 86-1290 du 23 décembre 1986, dans les conditions prévues par le III de son article 40 et le cas échéant le VIII du même article, aux dispositions </w:t>
+      </w:r>
+      <w:r>
+        <w:rPr>
+          <w:rFonts w:cs="TimesNewRomanPSMT"/>
+        </w:rPr>
         <w:lastRenderedPageBreak/>
-        <w:t>Les logements objets de la présente convention sont soumis aux dispositions de la loi n° 89-462 du 6 juillet 1989 tendant à améliorer les rapports locatifs et portant modification de la loi n° 86-1290 du 23 décembre 1986, dans les conditions prévues par le III de son article 40 et le cas échéant le VIII du même article, aux dispositions du code de la construction et de l'habitation et aux stipulations de la présente convention.</w:t>
+        <w:t>du code de la construction et de l'habitation et aux stipulations de la présente convention.</w:t>
       </w:r>
     </w:p>
     <w:p>
@@ -1151,51 +1157,45 @@
         <w:rPr>
           <w:rFonts w:cs="TimesNewRomanPSMT"/>
         </w:rPr>
-        <w:t xml:space="preserve">Les logements libres de toute occupation sont loués à des ménages dont les ressources annuelles n'excèdent pas les plafonds de ressources fixés à l'article R. 441-1 du code </w:t>
-      </w:r>
+        <w:t>Les logements libres de toute occupation sont loués à des ménages dont les ressources annuelles n'excèdent pas les plafonds de ressources fixés à l'article R. 441-1 du code de la construction et de l’habitation ou prévus au premier alinéa de l'article D. 331-12 du même code pour l'attribution des logements sociaux.</w:t>
+      </w:r>
+    </w:p>
+    <w:p>
+      <w:pPr>
+        <w:jc w:val="both"/>
+        <w:rPr>
+          <w:rFonts w:ascii="TimesNewRomanPSMT" w:hAnsi="TimesNewRomanPSMT" w:cs="TimesNewRomanPSMT"/>
+        </w:rPr>
+      </w:pPr>
+    </w:p>
+    <w:p>
+      <w:pPr>
+        <w:jc w:val="both"/>
+      </w:pPr>
+      <w:r>
+        <w:rPr>
+          <w:rFonts w:cs="TimesNewRomanPSMT"/>
+        </w:rPr>
+        <w:t>3°-Mixité sociale.</w:t>
+      </w:r>
+    </w:p>
+    <w:p>
+      <w:pPr>
+        <w:jc w:val="both"/>
+        <w:rPr>
+          <w:rFonts w:cs="TimesNewRomanPSMT"/>
+        </w:rPr>
+      </w:pPr>
+    </w:p>
+    <w:p>
+      <w:pPr>
+        <w:jc w:val="both"/>
+      </w:pPr>
       <w:r>
         <w:rPr>
           <w:rFonts w:cs="TimesNewRomanPSMT"/>
         </w:rPr>
         <w:lastRenderedPageBreak/>
-        <w:t>de la construction et de l’habitation ou prévus au premier alinéa de l'article D. 331-12 du même code pour l'attribution des logements sociaux.</w:t>
-      </w:r>
-    </w:p>
-    <w:p>
-      <w:pPr>
-        <w:jc w:val="both"/>
-        <w:rPr>
-          <w:rFonts w:ascii="TimesNewRomanPSMT" w:hAnsi="TimesNewRomanPSMT" w:cs="TimesNewRomanPSMT"/>
-        </w:rPr>
-      </w:pPr>
-    </w:p>
-    <w:p>
-      <w:pPr>
-        <w:jc w:val="both"/>
-      </w:pPr>
-      <w:r>
-        <w:rPr>
-          <w:rFonts w:cs="TimesNewRomanPSMT"/>
-        </w:rPr>
-        <w:t>3°-Mixité sociale.</w:t>
-      </w:r>
-    </w:p>
-    <w:p>
-      <w:pPr>
-        <w:jc w:val="both"/>
-        <w:rPr>
-          <w:rFonts w:cs="TimesNewRomanPSMT"/>
-        </w:rPr>
-      </w:pPr>
-    </w:p>
-    <w:p>
-      <w:pPr>
-        <w:jc w:val="both"/>
-      </w:pPr>
-      <w:r>
-        <w:rPr>
-          <w:rFonts w:cs="TimesNewRomanPSMT"/>
-        </w:rPr>
         <w:t>a) Lorsque l'opération a été financée dans les conditions de l'article D. 331-14 du code de la construction et de l’habitation autres que celles prévues au II de l'article D. 331-1 du même code et qu'elle bénéficie de subventions prévues aux 2° ou 3° de l'article R. 331-15 du même code, 30 % au moins des logements, soit</w:t>
       </w:r>
       <w:r>
@@ -1461,7 +1461,14 @@
         <w:rPr>
           <w:rFonts w:cs="TimesNewRomanPSMT"/>
         </w:rPr>
-        <w:t>4°-Cas d'une acquisition ou d'une convention sans travaux faisant suite à une nouvelle acquisition lorsque les loyers ne sont pas établis sur la base de la surface corrigée, résultant de l'application du décret n° 48-1766 du 22 novembre 1948 fixant les conditions de détermination de la surface corrigée des locaux d'habitation ou à usage professionnel et de l'article 4 du décret n° 60-1063 du 1er octobre 1960 modifiant le décret n° 48-1766 du 22 novembre 1948 fixant les conditions de détermination de la surface corrigée des locaux d'habitation ou à usage professionnel.</w:t>
+        <w:t xml:space="preserve">4°-Cas d'une acquisition ou d'une convention sans travaux faisant suite à une nouvelle acquisition lorsque les loyers ne sont pas établis sur la base de la surface corrigée, résultant de l'application du décret n° 48-1766 du 22 novembre 1948 fixant les conditions de détermination de la surface corrigée des locaux d'habitation ou à usage </w:t>
+      </w:r>
+      <w:r>
+        <w:rPr>
+          <w:rFonts w:cs="TimesNewRomanPSMT"/>
+        </w:rPr>
+        <w:lastRenderedPageBreak/>
+        <w:t>professionnel et de l'article 4 du décret n° 60-1063 du 1er octobre 1960 modifiant le décret n° 48-1766 du 22 novembre 1948 fixant les conditions de détermination de la surface corrigée des locaux d'habitation ou à usage professionnel.</w:t>
       </w:r>
     </w:p>
     <w:p>
@@ -1951,7 +1958,6 @@
         <w:rPr>
           <w:rFonts w:cs="TimesNewRomanPSMT"/>
         </w:rPr>
-        <w:lastRenderedPageBreak/>
         <w:t>Ce montant est majoré de 33 % pour les logements qui ont été attribués dans les conditions du b du 3° de l'article 8 de la présente convention.</w:t>
       </w:r>
     </w:p>
@@ -2365,14 +2371,7 @@
               <w:rPr>
                 <w:rFonts w:cs="TimesNewRomanPSMT"/>
               </w:rPr>
-              <w:t>get_lot_with_financement(‘PLUS’)%}{{co</w:t>
-            </w:r>
-            <w:r>
-              <w:rPr>
-                <w:rFonts w:cs="TimesNewRomanPSMT"/>
-              </w:rPr>
-              <w:lastRenderedPageBreak/>
-              <w:t>nvention.get_lot_with_financement(‘PLUS’).</w:t>
+              <w:t>get_lot_with_financement(‘PLUS’)%}{{convention.get_lot_with_financement(‘PLUS’).</w:t>
             </w:r>
             <w:r>
               <w:t xml:space="preserve"> </w:t>
@@ -2410,7 +2409,6 @@
               <w:rPr>
                 <w:rFonts w:cs="TimesNewRomanPSMT"/>
               </w:rPr>
-              <w:lastRenderedPageBreak/>
               <w:t>PLS</w:t>
             </w:r>
           </w:p>
@@ -2721,47 +2719,640 @@
           <w:i/>
           <w:iCs/>
         </w:rPr>
-        <w:t xml:space="preserve">Dispositions particulières relatives aux loyers pratiqués des logements conventionnés lors d'une acquisition ou d'une convention sans travaux faisant suite à une nouvelle acquisition lorsque les loyers ne sont pas établis sur la base de la surface corrigée, </w:t>
-      </w:r>
+        <w:t>Dispositions particulières relatives aux loyers pratiqués des logements conventionnés lors d'une acquisition ou d'une convention sans travaux faisant suite à une nouvelle acquisition lorsque les loyers ne sont pas établis sur la base de la surface corrigée, résultant de l'application du décret n° 48-1766 du 22 novembre 1948 fixant les conditions de détermination de la surface corrigée des locaux d'habitation ou à usage professionnel et de l'article 4 du décret n° 60-1063 du 1er octobre 1960 modifiant le décret n° 48-1766 du 22 novembre 1948 fixant les conditions de détermination de la surface corrigée des locaux d'habitation ou à usage professionnel</w:t>
+      </w:r>
+      <w:r>
+        <w:rPr>
+          <w:rFonts w:cs="TimesNewRomanPSMT"/>
+        </w:rPr>
+        <w:t>.</w:t>
+      </w:r>
+    </w:p>
+    <w:p>
+      <w:pPr>
+        <w:jc w:val="both"/>
+      </w:pPr>
+    </w:p>
+    <w:p>
+      <w:pPr>
+        <w:jc w:val="both"/>
+      </w:pPr>
+      <w:r>
+        <w:rPr>
+          <w:rFonts w:cs="TimesNewRomanPSMT"/>
+        </w:rPr>
+        <w:t>Durant le mois qui suit la signature de la convention, le bailleur informe les locataires ou occupants de bonne foi en place à la date de signature de la convention qu'ils disposent d'un délai de deux mois à compter de la réception de l'information pour présenter leurs justificatifs de revenus dans les conditions prévues pour l'attribution des logements sociaux et que ceux disposant de ressources</w:t>
+      </w:r>
+      <w:r>
+        <w:t xml:space="preserve"> </w:t>
+      </w:r>
+      <w:r>
+        <w:rPr>
+          <w:rFonts w:cs="TimesNewRomanPSMT"/>
+        </w:rPr>
+        <w:t xml:space="preserve">inférieures aux plafonds prévus </w:t>
+      </w:r>
+      <w:r>
+        <w:rPr>
+          <w:rFonts w:cs="TimesNewRomanPSMT"/>
+        </w:rPr>
+        <w:lastRenderedPageBreak/>
+        <w:t>à l'article D. 331-12 précité pour l'attribution des logements sociaux se verront appliquer, à partir de la réception par l'organisme des justificatifs et au plus tard le quatrième mois suivant la date de signature de la convention ou la date d'achèvement des travaux si celle-ci en prévoit, un nouveau loyer dans la limite du loyer maximum fixé au document prévu par l'article 1er de la présente convention. Avant l'application de ce nouveau loyer, le loyer maximum est celui mentionné à l'article 9 bis de la présente convention.</w:t>
+      </w:r>
+    </w:p>
+    <w:p>
+      <w:pPr>
+        <w:jc w:val="both"/>
+        <w:rPr>
+          <w:rFonts w:ascii="TimesNewRomanPSMT" w:hAnsi="TimesNewRomanPSMT" w:cs="TimesNewRomanPSMT"/>
+        </w:rPr>
+      </w:pPr>
+    </w:p>
+    <w:p>
+      <w:pPr>
+        <w:jc w:val="both"/>
+      </w:pPr>
+      <w:r>
+        <w:rPr>
+          <w:rFonts w:cs="TimesNewRomanPSMT"/>
+        </w:rPr>
+        <w:t>Le locataire ou occupant de bonne foi peut également présenter ces justificatifs à tout moment et bénéficier de la même mesure dès le mois qui suit la présentation de ces justificatifs.</w:t>
+      </w:r>
+    </w:p>
+    <w:p>
+      <w:pPr>
+        <w:jc w:val="both"/>
+        <w:rPr>
+          <w:rFonts w:cs="TimesNewRomanPSMT"/>
+        </w:rPr>
+      </w:pPr>
+    </w:p>
+    <w:p>
+      <w:pPr>
+        <w:jc w:val="both"/>
+      </w:pPr>
+      <w:r>
+        <w:rPr>
+          <w:rFonts w:cs="TimesNewRomanPSMT"/>
+        </w:rPr>
+        <w:t>Le loyer pratiqué applicable à chaque logement occupé par un locataire ou un occupant de bonne foi dont les ressources excèdent les plafonds de ressources prévus à l'article D. 331-12 précité pour l'attribution des logements sociaux au moment de l'acquisition ou qui n'a pas fourni d'informations sur le niveau de ses ressources ne peut excéder le loyer maximum fixé à l'article 9 bis de la présente convention. Il peut être révisé chaque année le 1er janvier dans les conditions prévues à l’article L. 353-9-3 précité.</w:t>
+      </w:r>
+    </w:p>
+    <w:p>
+      <w:pPr>
+        <w:jc w:val="both"/>
+        <w:rPr>
+          <w:rFonts w:ascii="TimesNewRomanPSMT" w:hAnsi="TimesNewRomanPSMT" w:cs="TimesNewRomanPSMT"/>
+        </w:rPr>
+      </w:pPr>
+    </w:p>
+    <w:p>
+      <w:pPr>
+        <w:jc w:val="both"/>
+        <w:rPr>
+          <w:rFonts w:ascii="TimesNewRomanPSMT" w:hAnsi="TimesNewRomanPSMT" w:cs="TimesNewRomanPSMT"/>
+        </w:rPr>
+      </w:pPr>
+    </w:p>
+    <w:p>
+      <w:pPr>
+        <w:jc w:val="center"/>
+      </w:pPr>
+      <w:r>
+        <w:rPr>
+          <w:rFonts w:cs="TimesNewRomanPS-BoldMT"/>
+          <w:b/>
+        </w:rPr>
+        <w:t>III.-Engagements du bailleur à l'égard des locataires.</w:t>
+      </w:r>
+    </w:p>
+    <w:p>
+      <w:pPr>
+        <w:rPr>
+          <w:rFonts w:cs="TimesNewRomanPS-BoldMT"/>
+          <w:b/>
+        </w:rPr>
+      </w:pPr>
+    </w:p>
+    <w:p>
+      <w:pPr>
+        <w:jc w:val="center"/>
+      </w:pPr>
+      <w:r>
+        <w:rPr>
+          <w:rFonts w:cs="TimesNewRomanPSMT"/>
+        </w:rPr>
+        <w:t>Article 11.</w:t>
+      </w:r>
+    </w:p>
+    <w:p>
+      <w:pPr>
+        <w:rPr>
+          <w:rFonts w:cs="TimesNewRomanPSMT"/>
+        </w:rPr>
+      </w:pPr>
+    </w:p>
+    <w:p>
+      <w:pPr>
+        <w:jc w:val="center"/>
+      </w:pPr>
       <w:r>
         <w:rPr>
           <w:rFonts w:cs="TimesNewRomanPSMT"/>
           <w:i/>
           <w:iCs/>
         </w:rPr>
+        <w:t>Établissement d'un bail conforme à la convention.</w:t>
+      </w:r>
+    </w:p>
+    <w:p>
+      <w:pPr>
+        <w:jc w:val="both"/>
+        <w:rPr>
+          <w:rFonts w:cs="TimesNewRomanPSMT"/>
+        </w:rPr>
+      </w:pPr>
+    </w:p>
+    <w:p>
+      <w:pPr>
+        <w:jc w:val="both"/>
+      </w:pPr>
+      <w:r>
+        <w:rPr>
+          <w:rFonts w:cs="TimesNewRomanPSMT"/>
+        </w:rPr>
+        <w:t>Le bail doit être conforme à la présente convention. Une copie de la convention est tenue en permanence à la disposition des locataires et de leurs associations qui peuvent en prendre connaissance chez le gardien ou, en l'absence d'un gardien, au siège du bailleur. Cette information est mentionnée à chaque locataire ou affichée de façon très apparente dans les parties communes de l'immeuble.</w:t>
+      </w:r>
+    </w:p>
+    <w:p>
+      <w:pPr>
+        <w:jc w:val="both"/>
+        <w:rPr>
+          <w:rFonts w:cs="TimesNewRomanPSMT"/>
+        </w:rPr>
+      </w:pPr>
+    </w:p>
+    <w:p>
+      <w:pPr>
+        <w:jc w:val="both"/>
+      </w:pPr>
+      <w:r>
+        <w:rPr>
+          <w:rFonts w:cs="TimesNewRomanPSMT"/>
+        </w:rPr>
+        <w:t>Le bailleur est tenu de remettre à chaque locataire un décompte de surface utile établi d'après le modèle type annexé à l'article D. 353-19 du code de la construction et de l’habitation. Dans l'hypothèse où cette surface serait modifiée, le bailleur est tenu de communiquer au locataire un nouveau décompte dans les deux mois précédant son application.</w:t>
+      </w:r>
+    </w:p>
+    <w:p>
+      <w:pPr>
+        <w:jc w:val="both"/>
+        <w:rPr>
+          <w:rFonts w:ascii="TimesNewRomanPSMT" w:hAnsi="TimesNewRomanPSMT" w:cs="TimesNewRomanPSMT"/>
+        </w:rPr>
+      </w:pPr>
+    </w:p>
+    <w:p>
+      <w:pPr>
+        <w:jc w:val="center"/>
+      </w:pPr>
+      <w:r>
+        <w:rPr>
+          <w:rFonts w:cs="TimesNewRomanPSMT"/>
+        </w:rPr>
+        <w:t>Article 12.</w:t>
+      </w:r>
+    </w:p>
+    <w:p>
+      <w:pPr>
+        <w:rPr>
+          <w:rFonts w:cs="TimesNewRomanPSMT"/>
+        </w:rPr>
+      </w:pPr>
+    </w:p>
+    <w:p>
+      <w:pPr>
+        <w:jc w:val="center"/>
+      </w:pPr>
+      <w:r>
+        <w:rPr>
+          <w:rFonts w:cs="TimesNewRomanPSMT"/>
+          <w:i/>
+          <w:iCs/>
+        </w:rPr>
+        <w:t>Travaux.</w:t>
+      </w:r>
+    </w:p>
+    <w:p>
+      <w:pPr>
+        <w:jc w:val="both"/>
+        <w:rPr>
+          <w:rFonts w:cs="TimesNewRomanPSMT"/>
+        </w:rPr>
+      </w:pPr>
+    </w:p>
+    <w:p>
+      <w:pPr>
+        <w:jc w:val="both"/>
+      </w:pPr>
+      <w:r>
+        <w:rPr>
+          <w:rFonts w:cs="TimesNewRomanPSMT"/>
+        </w:rPr>
+        <w:t>Lorsque l'exécution des travaux nécessite l'évacuation temporaire des lieux, l'organisme bailleur doit mettre provisoirement à la disposition du locataire un logement en bon état d'habitation remplissant des conditions d'hygiène normales, correspondant à ses besoins personnels ou familiaux et, le cas échéant, professionnels, ainsi qu'à ses possibilités. Il doit en outre être situé :</w:t>
+      </w:r>
+    </w:p>
+    <w:p>
+      <w:pPr>
+        <w:jc w:val="both"/>
+      </w:pPr>
+      <w:r>
+        <w:rPr>
+          <w:rFonts w:cs="TimesNewRomanPSMT"/>
+        </w:rPr>
+        <w:t>- dans le même arrondissement ou les arrondissements limitrophes ou les communes limitrophes de l'arrondissement où se trouve le local, objet de la reprise, si celui-ci est situé dans une commune divisée en arrondissements ;</w:t>
+      </w:r>
+    </w:p>
+    <w:p>
+      <w:pPr>
+        <w:jc w:val="both"/>
+        <w:rPr>
+          <w:rFonts w:cs="TimesNewRomanPSMT"/>
+        </w:rPr>
+      </w:pPr>
+    </w:p>
+    <w:p>
+      <w:pPr>
+        <w:jc w:val="both"/>
+      </w:pPr>
+      <w:r>
+        <w:rPr>
+          <w:rFonts w:cs="TimesNewRomanPSMT"/>
+        </w:rPr>
+        <w:t>- dans le même canton ou dans les cantons limitrophes de ce canton inclus dans la même commune ou dans les communes limitrophes de ce canton, si la commune est divisée en cantons ;</w:t>
+      </w:r>
+    </w:p>
+    <w:p>
+      <w:pPr>
+        <w:jc w:val="both"/>
+        <w:rPr>
+          <w:rFonts w:cs="TimesNewRomanPSMT"/>
+        </w:rPr>
+      </w:pPr>
+    </w:p>
+    <w:p>
+      <w:pPr>
+        <w:jc w:val="both"/>
+      </w:pPr>
+      <w:r>
+        <w:rPr>
+          <w:rFonts w:cs="TimesNewRomanPSMT"/>
+        </w:rPr>
+        <w:t>- dans les autres cas, sur le territoire de la même commune ou d'une commune limitrophe, sans pouvoir être éloigné de plus de cinq kilomètres.</w:t>
+      </w:r>
+    </w:p>
+    <w:p>
+      <w:pPr>
+        <w:jc w:val="both"/>
+        <w:rPr>
+          <w:rFonts w:ascii="TimesNewRomanPSMT" w:hAnsi="TimesNewRomanPSMT" w:cs="TimesNewRomanPSMT"/>
+        </w:rPr>
+      </w:pPr>
+    </w:p>
+    <w:p>
+      <w:pPr>
+        <w:jc w:val="center"/>
+      </w:pPr>
+      <w:r>
+        <w:rPr>
+          <w:rFonts w:cs="TimesNewRomanPSMT"/>
+        </w:rPr>
+        <w:t>Article 13.</w:t>
+      </w:r>
+    </w:p>
+    <w:p>
+      <w:pPr>
+        <w:rPr>
+          <w:rFonts w:cs="TimesNewRomanPSMT"/>
+        </w:rPr>
+      </w:pPr>
+    </w:p>
+    <w:p>
+      <w:pPr>
+        <w:jc w:val="center"/>
+      </w:pPr>
+      <w:r>
+        <w:rPr>
+          <w:rFonts w:cs="TimesNewRomanPSMT"/>
+          <w:i/>
+          <w:iCs/>
+        </w:rPr>
+        <w:t>Information des locataires en cas de changement de propriétaire.</w:t>
+      </w:r>
+    </w:p>
+    <w:p>
+      <w:pPr>
+        <w:jc w:val="both"/>
+        <w:rPr>
+          <w:rFonts w:cs="TimesNewRomanPSMT"/>
+        </w:rPr>
+      </w:pPr>
+    </w:p>
+    <w:p>
+      <w:pPr>
+        <w:jc w:val="both"/>
+      </w:pPr>
+      <w:r>
+        <w:rPr>
+          <w:rFonts w:cs="TimesNewRomanPSMT"/>
+        </w:rPr>
+        <w:t>En cas de mutation à titre gratuit ou onéreux, et en vue de l'information du préfet ou, le cas échéant, du président de l'établissement public de coopération intercommunale, du conseil départemental, de la métropole de Lyon ou du conseil exécutif de Corse, partie à la présente convention, des locataires et des organismes liquidateurs de l'APL, le ou les nouveaux propriétaires leur font connaître leur identification dans les conditions conformes soit à l'article 5, soit à l'article 6 du décret n° 55-22 du</w:t>
+      </w:r>
+    </w:p>
+    <w:p>
+      <w:pPr>
+        <w:jc w:val="both"/>
+      </w:pPr>
+      <w:r>
+        <w:rPr>
+          <w:rFonts w:cs="TimesNewRomanPSMT"/>
+        </w:rPr>
+        <w:t>4 janvier 1955 modifié, par acte extrajudiciaire, lettre recommandée avec demande d'avis de réception ou remise contre décharge dans un délai d'un mois à compter de ladite mutation.</w:t>
+      </w:r>
+    </w:p>
+    <w:p>
+      <w:pPr>
+        <w:jc w:val="both"/>
+        <w:rPr>
+          <w:rFonts w:ascii="TimesNewRomanPSMT" w:hAnsi="TimesNewRomanPSMT" w:cs="TimesNewRomanPSMT"/>
+        </w:rPr>
+      </w:pPr>
+    </w:p>
+    <w:p>
+      <w:pPr>
+        <w:jc w:val="center"/>
+      </w:pPr>
+      <w:r>
+        <w:rPr>
+          <w:rFonts w:cs="TimesNewRomanPSMT"/>
+        </w:rPr>
+        <w:t>Article 14.</w:t>
+      </w:r>
+    </w:p>
+    <w:p>
+      <w:pPr>
+        <w:rPr>
+          <w:rFonts w:cs="TimesNewRomanPSMT"/>
+        </w:rPr>
+      </w:pPr>
+    </w:p>
+    <w:p>
+      <w:pPr>
+        <w:jc w:val="center"/>
+      </w:pPr>
+      <w:r>
+        <w:rPr>
+          <w:rFonts w:cs="TimesNewRomanPSMT"/>
+          <w:i/>
+          <w:iCs/>
+        </w:rPr>
+        <w:t>Information des locataires en cas de modification ou de résiliation de la convention.</w:t>
+      </w:r>
+    </w:p>
+    <w:p>
+      <w:pPr>
+        <w:jc w:val="both"/>
+        <w:rPr>
+          <w:rFonts w:cs="TimesNewRomanPSMT"/>
+        </w:rPr>
+      </w:pPr>
+    </w:p>
+    <w:p>
+      <w:pPr>
+        <w:jc w:val="both"/>
+      </w:pPr>
+      <w:r>
+        <w:rPr>
+          <w:rFonts w:cs="TimesNewRomanPSMT"/>
+        </w:rPr>
+        <w:t>Le bailleur informe les locataires de toute modification apportée à la convention ayant des incidences sur leurs relations contractuelles.</w:t>
+      </w:r>
+    </w:p>
+    <w:p>
+      <w:pPr>
+        <w:jc w:val="both"/>
+        <w:rPr>
+          <w:rFonts w:cs="TimesNewRomanPSMT"/>
+        </w:rPr>
+      </w:pPr>
+    </w:p>
+    <w:p>
+      <w:pPr>
+        <w:jc w:val="both"/>
+      </w:pPr>
+      <w:r>
+        <w:rPr>
+          <w:rFonts w:cs="TimesNewRomanPSMT"/>
+        </w:rPr>
+        <w:t>Quelle qu'en soit la cause, le bailleur informe le locataire de la date prévue pour l'expiration de la convention. En cas de résiliation de la convention aux torts du bailleur, il porte à la connaissance des locataires la teneur de l'article L. 353-6 du code de la construction et de l'habitation.</w:t>
+      </w:r>
+    </w:p>
+    <w:p>
+      <w:pPr>
+        <w:jc w:val="both"/>
+        <w:rPr>
+          <w:rFonts w:cs="TimesNewRomanPSMT"/>
+        </w:rPr>
+      </w:pPr>
+    </w:p>
+    <w:p>
+      <w:pPr>
+        <w:jc w:val="center"/>
+      </w:pPr>
+      <w:r>
+        <w:rPr>
+          <w:rFonts w:cs="TimesNewRomanPSMT"/>
+        </w:rPr>
+        <w:t>Article 15.</w:t>
+      </w:r>
+    </w:p>
+    <w:p>
+      <w:pPr>
+        <w:rPr>
+          <w:rFonts w:cs="TimesNewRomanPSMT"/>
+        </w:rPr>
+      </w:pPr>
+    </w:p>
+    <w:p>
+      <w:pPr>
+        <w:jc w:val="center"/>
+      </w:pPr>
+      <w:r>
+        <w:rPr>
+          <w:rFonts w:cs="TimesNewRomanPSMT"/>
+          <w:i/>
+          <w:iCs/>
+        </w:rPr>
+        <w:t>Maintien dans les lieux et congé donné par le locataire.</w:t>
+      </w:r>
+    </w:p>
+    <w:p>
+      <w:pPr>
+        <w:jc w:val="both"/>
+        <w:rPr>
+          <w:rFonts w:cs="TimesNewRomanPSMT"/>
+        </w:rPr>
+      </w:pPr>
+    </w:p>
+    <w:p>
+      <w:pPr>
+        <w:jc w:val="both"/>
+      </w:pPr>
+      <w:r>
+        <w:rPr>
+          <w:rFonts w:cs="TimesNewRomanPSMT"/>
+        </w:rPr>
+        <w:t>Pendant la durée de la convention, le locataire bénéficie du droit au maintien dans les lieux dans les conditions de l'article L. 353-15 du code de la construction et de l’habitation, dans la mesure où il se conforme aux obligations de l'article 7 de la loi du 6 juillet 1989 précitée, sauf dénonciation expresse du locataire dans les conditions des treizième à vingt-deuxième alinéas du I de l'article 15 de la loi du 6 juillet 1989 précitée.</w:t>
+      </w:r>
+    </w:p>
+    <w:p>
+      <w:pPr>
+        <w:jc w:val="both"/>
+        <w:rPr>
+          <w:rFonts w:cs="TimesNewRomanPSMT"/>
+        </w:rPr>
+      </w:pPr>
+    </w:p>
+    <w:p>
+      <w:pPr>
+        <w:jc w:val="both"/>
+      </w:pPr>
+      <w:r>
+        <w:rPr>
+          <w:rFonts w:cs="TimesNewRomanPSMT"/>
+        </w:rPr>
+        <w:t>Le locataire peut donner congé à tout moment. Il est redevable du loyer et des charges pendant la durée effective du délai de préavis, de jour à jour, sauf si le logement se trouve occupé avant la fin du préavis par un autre locataire en accord avec le bailleur</w:t>
+      </w:r>
+      <w:r>
+        <w:rPr>
+          <w:rFonts w:ascii="TimesNewRomanPSMT" w:hAnsi="TimesNewRomanPSMT" w:cs="TimesNewRomanPSMT"/>
+        </w:rPr>
+        <w:t>.</w:t>
+      </w:r>
+    </w:p>
+    <w:p>
+      <w:pPr>
+        <w:jc w:val="both"/>
+        <w:rPr>
+          <w:rFonts w:ascii="TimesNewRomanPSMT" w:hAnsi="TimesNewRomanPSMT" w:cs="TimesNewRomanPSMT"/>
+        </w:rPr>
+      </w:pPr>
+    </w:p>
+    <w:p>
+      <w:pPr>
+        <w:jc w:val="center"/>
+      </w:pPr>
+      <w:r>
+        <w:rPr>
+          <w:rFonts w:cs="TimesNewRomanPSMT"/>
+        </w:rPr>
+        <w:t>Article 16.</w:t>
+      </w:r>
+    </w:p>
+    <w:p>
+      <w:pPr>
+        <w:rPr>
+          <w:rFonts w:cs="TimesNewRomanPSMT"/>
+        </w:rPr>
+      </w:pPr>
+    </w:p>
+    <w:p>
+      <w:pPr>
+        <w:jc w:val="center"/>
+      </w:pPr>
+      <w:r>
+        <w:rPr>
+          <w:rFonts w:cs="TimesNewRomanPSMT"/>
+          <w:i/>
+          <w:iCs/>
+        </w:rPr>
         <w:lastRenderedPageBreak/>
-        <w:t>résultant de l'application du décret n° 48-1766 du 22 novembre 1948 fixant les conditions de détermination de la surface corrigée des locaux d'habitation ou à usage professionnel et de l'article 4 du décret n° 60-1063 du 1er octobre 1960 modifiant le décret n° 48-1766 du 22 novembre 1948 fixant les conditions de détermination de la surface corrigée des locaux d'habitation ou à usage professionnel</w:t>
-      </w:r>
-      <w:r>
-        <w:rPr>
-          <w:rFonts w:cs="TimesNewRomanPSMT"/>
-        </w:rPr>
-        <w:t>.</w:t>
-      </w:r>
-    </w:p>
-    <w:p>
-      <w:pPr>
-        <w:jc w:val="both"/>
-      </w:pPr>
-    </w:p>
-    <w:p>
-      <w:pPr>
-        <w:jc w:val="both"/>
-      </w:pPr>
-      <w:r>
-        <w:rPr>
-          <w:rFonts w:cs="TimesNewRomanPSMT"/>
-        </w:rPr>
-        <w:t>Durant le mois qui suit la signature de la convention, le bailleur informe les locataires ou occupants de bonne foi en place à la date de signature de la convention qu'ils disposent d'un délai de deux mois à compter de la réception de l'information pour présenter leurs justificatifs de revenus dans les conditions prévues pour l'attribution des logements sociaux et que ceux disposant de ressources</w:t>
-      </w:r>
-      <w:r>
-        <w:t xml:space="preserve"> </w:t>
-      </w:r>
-      <w:r>
-        <w:rPr>
-          <w:rFonts w:cs="TimesNewRomanPSMT"/>
-        </w:rPr>
-        <w:t>inférieures aux plafonds prévus à l'article D. 331-12 précité pour l'attribution des logements sociaux se verront appliquer, à partir de la réception par l'organisme des justificatifs et au plus tard le quatrième mois suivant la date de signature de la convention ou la date d'achèvement des travaux si celle-ci en prévoit, un nouveau loyer dans la limite du loyer maximum fixé au document prévu par l'article 1er de la présente convention. Avant l'application de ce nouveau loyer, le loyer maximum est celui mentionné à l'article 9 bis de la présente convention.</w:t>
+        <w:t>Modalités du paiement du loyer.</w:t>
+      </w:r>
+    </w:p>
+    <w:p>
+      <w:pPr>
+        <w:jc w:val="both"/>
+        <w:rPr>
+          <w:rFonts w:cs="TimesNewRomanPSMT"/>
+        </w:rPr>
+      </w:pPr>
+    </w:p>
+    <w:p>
+      <w:pPr>
+        <w:jc w:val="both"/>
+      </w:pPr>
+      <w:r>
+        <w:rPr>
+          <w:rFonts w:cs="TimesNewRomanPSMT"/>
+        </w:rPr>
+        <w:t>Le loyer est payé mensuellement à terme échu.</w:t>
+      </w:r>
+    </w:p>
+    <w:p>
+      <w:pPr>
+        <w:jc w:val="both"/>
+        <w:rPr>
+          <w:rFonts w:cs="TimesNewRomanPSMT"/>
+        </w:rPr>
+      </w:pPr>
+    </w:p>
+    <w:p>
+      <w:pPr>
+        <w:jc w:val="both"/>
+      </w:pPr>
+      <w:r>
+        <w:rPr>
+          <w:rFonts w:cs="TimesNewRomanPSMT"/>
+        </w:rPr>
+        <w:t>Le bailleur indique sur la quittance le montant du loyer principal, du ou des loyers accessoires, du loyer maximum, des charges locatives et, le cas échéant, le montant de l'APL, de la réduction de loyer de solidarité et de la contribution pour le partage des économies de charges.</w:t>
+      </w:r>
+    </w:p>
+    <w:p>
+      <w:pPr>
+        <w:jc w:val="both"/>
+        <w:rPr>
+          <w:rFonts w:cs="TimesNewRomanPSMT"/>
+        </w:rPr>
+      </w:pPr>
+    </w:p>
+    <w:p>
+      <w:pPr>
+        <w:jc w:val="both"/>
+      </w:pPr>
+      <w:r>
+        <w:rPr>
+          <w:rFonts w:cs="TimesNewRomanPSMT"/>
+        </w:rPr>
+        <w:t>En application de l'article L. 832-2 du code de la construction et de l'habitation, pour chaque appel de loyer, le bailleur déduit s'il y a lieu le montant de l'APL qu'il perçoit pour le compte du locataire du montant du loyer et des dépenses accessoires de logement.</w:t>
+      </w:r>
+    </w:p>
+    <w:p>
+      <w:pPr>
+        <w:jc w:val="both"/>
+        <w:rPr>
+          <w:rFonts w:cs="TimesNewRomanPSMT"/>
+        </w:rPr>
+      </w:pPr>
+    </w:p>
+    <w:p>
+      <w:pPr>
+        <w:jc w:val="both"/>
+      </w:pPr>
+      <w:r>
+        <w:rPr>
+          <w:rFonts w:cs="TimesNewRomanPSMT"/>
+        </w:rPr>
+        <w:t>Lorsque l'organisme liquidateur de l'APL verse au bailleur des rappels d'aide personnalisée pour le compte de locataires, le bailleur affecte ces sommes au compte de ces derniers. Si après affectation il en résulte un surplus, le bailleur le reverse au locataire dans le délai d'un mois.</w:t>
       </w:r>
     </w:p>
     <w:p>
@@ -2780,26 +3371,84 @@
         <w:rPr>
           <w:rFonts w:cs="TimesNewRomanPSMT"/>
         </w:rPr>
-        <w:t>Le locataire ou occupant de bonne foi peut également présenter ces justificatifs à tout moment et bénéficier de la même mesure dès le mois qui suit la présentation de ces justificatifs.</w:t>
-      </w:r>
-    </w:p>
-    <w:p>
-      <w:pPr>
-        <w:jc w:val="both"/>
-        <w:rPr>
-          <w:rFonts w:cs="TimesNewRomanPSMT"/>
-        </w:rPr>
-      </w:pPr>
-    </w:p>
-    <w:p>
-      <w:pPr>
-        <w:jc w:val="both"/>
-      </w:pPr>
-      <w:r>
-        <w:rPr>
-          <w:rFonts w:cs="TimesNewRomanPSMT"/>
-        </w:rPr>
-        <w:t>Le loyer pratiqué applicable à chaque logement occupé par un locataire ou un occupant de bonne foi dont les ressources excèdent les plafonds de ressources prévus à l'article D. 331-12 précité pour l'attribution des logements sociaux au moment de l'acquisition ou qui n'a pas fourni d'informations sur le niveau de ses ressources ne peut excéder le loyer maximum fixé à l'article 9 bis de la présente convention. Il peut être révisé chaque année le 1er janvier dans les conditions prévues à l’article L. 353-9-3 précité.</w:t>
+        <w:t>En cas de retard du locataire dans le paiement du loyer et des charges locatives, le bailleur doit prendre toutes dispositions en vue de recouvrer sa créance.</w:t>
+      </w:r>
+    </w:p>
+    <w:p>
+      <w:pPr>
+        <w:jc w:val="both"/>
+        <w:rPr>
+          <w:rFonts w:cs="TimesNewRomanPSMT"/>
+        </w:rPr>
+      </w:pPr>
+    </w:p>
+    <w:p>
+      <w:pPr>
+        <w:jc w:val="both"/>
+      </w:pPr>
+      <w:r>
+        <w:rPr>
+          <w:rFonts w:cs="TimesNewRomanPSMT"/>
+        </w:rPr>
+        <w:t>En cas d'impayé constitué au sens de l'article R. 824-1 du code de la construction et de l’habitation, et lorsque l'APL est versée en tiers payant, le bailleur doit informer l’organisme payeur de la situation du locataire dans un délai de deux mois après la constitution de l’impayé.</w:t>
+      </w:r>
+    </w:p>
+    <w:p>
+      <w:pPr>
+        <w:jc w:val="both"/>
+        <w:rPr>
+          <w:rFonts w:cs="TimesNewRomanPSMT"/>
+        </w:rPr>
+      </w:pPr>
+    </w:p>
+    <w:p>
+      <w:pPr>
+        <w:jc w:val="center"/>
+      </w:pPr>
+      <w:r>
+        <w:rPr>
+          <w:rFonts w:cs="TimesNewRomanPSMT"/>
+        </w:rPr>
+        <w:t>Article 17.</w:t>
+      </w:r>
+    </w:p>
+    <w:p>
+      <w:pPr>
+        <w:rPr>
+          <w:rFonts w:cs="TimesNewRomanPSMT"/>
+        </w:rPr>
+      </w:pPr>
+    </w:p>
+    <w:p>
+      <w:pPr>
+        <w:jc w:val="center"/>
+      </w:pPr>
+      <w:r>
+        <w:rPr>
+          <w:rFonts w:cs="TimesNewRomanPSMT"/>
+          <w:i/>
+          <w:iCs/>
+        </w:rPr>
+        <w:t>Dépôt de garantie.</w:t>
+      </w:r>
+    </w:p>
+    <w:p>
+      <w:pPr>
+        <w:jc w:val="both"/>
+        <w:rPr>
+          <w:rFonts w:cs="TimesNewRomanPSMT"/>
+        </w:rPr>
+      </w:pPr>
+    </w:p>
+    <w:p>
+      <w:pPr>
+        <w:jc w:val="both"/>
+      </w:pPr>
+      <w:r>
+        <w:rPr>
+          <w:rFonts w:cs="TimesNewRomanPSMT"/>
+        </w:rPr>
+        <w:t>Le dépôt de garantie stipulé le cas échéant par le contrat de location pour garantir l'exécution de ses obligations locatives par le locataire ne peut être supérieur à un mois de loyer en principal.</w:t>
       </w:r>
     </w:p>
     <w:p>
@@ -2827,7 +3476,7 @@
           <w:rFonts w:cs="TimesNewRomanPS-BoldMT"/>
           <w:b/>
         </w:rPr>
-        <w:t>III.-Engagements du bailleur à l'égard des locataires.</w:t>
+        <w:t>IV.-Dispositions spécifiques au statut de résidence universitaire.</w:t>
       </w:r>
     </w:p>
     <w:p>
@@ -2846,7 +3495,7 @@
         <w:rPr>
           <w:rFonts w:cs="TimesNewRomanPSMT"/>
         </w:rPr>
-        <w:t>Article 11.</w:t>
+        <w:t>Article 18.</w:t>
       </w:r>
     </w:p>
     <w:p>
@@ -2866,45 +3515,84 @@
           <w:i/>
           <w:iCs/>
         </w:rPr>
-        <w:t>Établissement d'un bail conforme à la convention.</w:t>
-      </w:r>
-    </w:p>
-    <w:p>
-      <w:pPr>
-        <w:jc w:val="both"/>
-        <w:rPr>
-          <w:rFonts w:cs="TimesNewRomanPSMT"/>
-        </w:rPr>
-      </w:pPr>
-    </w:p>
-    <w:p>
-      <w:pPr>
-        <w:jc w:val="both"/>
-      </w:pPr>
-      <w:r>
-        <w:rPr>
-          <w:rFonts w:cs="TimesNewRomanPSMT"/>
-        </w:rPr>
-        <w:t>Le bail doit être conforme à la présente convention. Une copie de la convention est tenue en permanence à la disposition des locataires et de leurs associations qui peuvent en prendre connaissance chez le gardien ou, en l'absence d'un gardien, au siège du bailleur. Cette information est mentionnée à chaque locataire ou affichée de façon très apparente dans les parties communes de l'immeuble.</w:t>
-      </w:r>
-    </w:p>
-    <w:p>
-      <w:pPr>
-        <w:jc w:val="both"/>
-        <w:rPr>
-          <w:rFonts w:cs="TimesNewRomanPSMT"/>
-        </w:rPr>
-      </w:pPr>
-    </w:p>
-    <w:p>
-      <w:pPr>
-        <w:jc w:val="both"/>
-      </w:pPr>
-      <w:r>
-        <w:rPr>
-          <w:rFonts w:cs="TimesNewRomanPSMT"/>
-        </w:rPr>
-        <w:t>Le bailleur est tenu de remettre à chaque locataire un décompte de surface utile établi d'après le modèle type annexé à l'article D. 353-19 du code de la construction et de l’habitation. Dans l'hypothèse où cette surface serait modifiée, le bailleur est tenu de communiquer au locataire un nouveau décompte dans les deux mois précédant son application.</w:t>
+        <w:t>Régime des rapports locatifs applicables aux logements.</w:t>
+      </w:r>
+    </w:p>
+    <w:p>
+      <w:pPr>
+        <w:jc w:val="both"/>
+        <w:rPr>
+          <w:rFonts w:cs="TimesNewRomanPSMT"/>
+        </w:rPr>
+      </w:pPr>
+    </w:p>
+    <w:p>
+      <w:pPr>
+        <w:jc w:val="both"/>
+      </w:pPr>
+      <w:r>
+        <w:rPr>
+          <w:rFonts w:cs="TimesNewRomanPSMT"/>
+        </w:rPr>
+        <w:t>Lorsque la présente convention est conclue en application de l’article L. 353-1 et du 3° de l’article L. 831-1 du code de la construction et de l'habitation pour une résidence universitaire définie à l'article L. 631-12 du même code, les logements de la résidence universitaire sont soumis aux dispositions de la loi n° 89-462 du 6 juillet 1989 tendant à améliorer les rapports locatifs, dans les conditions prévues par les III et VIII de l’article 40, aux dispositions du code de la construction et de l'habitation et aux stipulations de la présente convention.</w:t>
+      </w:r>
+    </w:p>
+    <w:p>
+      <w:pPr>
+        <w:jc w:val="both"/>
+        <w:rPr>
+          <w:rFonts w:cs="TimesNewRomanPSMT"/>
+        </w:rPr>
+      </w:pPr>
+    </w:p>
+    <w:p>
+      <w:pPr>
+        <w:jc w:val="both"/>
+      </w:pPr>
+      <w:r>
+        <w:rPr>
+          <w:rFonts w:cs="TimesNewRomanPSMT"/>
+        </w:rPr>
+        <w:lastRenderedPageBreak/>
+        <w:t>Les stipulations particulières suivantes s’appliquent :</w:t>
+      </w:r>
+    </w:p>
+    <w:p>
+      <w:pPr>
+        <w:jc w:val="both"/>
+        <w:rPr>
+          <w:rFonts w:cs="TimesNewRomanPSMT"/>
+        </w:rPr>
+      </w:pPr>
+    </w:p>
+    <w:p>
+      <w:pPr>
+        <w:jc w:val="both"/>
+      </w:pPr>
+      <w:r>
+        <w:rPr>
+          <w:rFonts w:cs="TimesNewRomanPSMT"/>
+        </w:rPr>
+        <w:t>1°- Conditions de location des logements de la résidence universitaire.</w:t>
+      </w:r>
+    </w:p>
+    <w:p>
+      <w:pPr>
+        <w:jc w:val="both"/>
+        <w:rPr>
+          <w:rFonts w:cs="TimesNewRomanPSMT"/>
+        </w:rPr>
+      </w:pPr>
+    </w:p>
+    <w:p>
+      <w:pPr>
+        <w:jc w:val="both"/>
+      </w:pPr>
+      <w:r>
+        <w:rPr>
+          <w:rFonts w:cs="TimesNewRomanPSMT"/>
+        </w:rPr>
+        <w:t>Les logements sont loués nus ou meublés à des étudiants, des personnes de moins de trente ans en formation ou en stage et des personnes titulaires d'un contrat de professionnalisation ou d'apprentissage, à titre de résidence principale, et occupés au moins huit mois par an. A titre exceptionnel, des logements peuvent être loués à des enseignants et des chercheurs.</w:t>
       </w:r>
     </w:p>
     <w:p>
@@ -2917,13 +3605,263 @@
     </w:p>
     <w:p>
       <w:pPr>
+        <w:jc w:val="both"/>
+      </w:pPr>
+      <w:r>
+        <w:rPr>
+          <w:rFonts w:cs="TimesNewRomanPSMT"/>
+        </w:rPr>
+        <w:t>Les logements peuvent également être loués dans les conditions prévues aux quatrième et cinquième alinéas du I de l’article L. 442-8-1 du code de la construction et de l’habitation.</w:t>
+      </w:r>
+    </w:p>
+    <w:p>
+      <w:pPr>
+        <w:jc w:val="both"/>
+        <w:rPr>
+          <w:rFonts w:cs="TimesNewRomanPSMT"/>
+        </w:rPr>
+      </w:pPr>
+    </w:p>
+    <w:p>
+      <w:pPr>
+        <w:jc w:val="both"/>
+      </w:pPr>
+      <w:r>
+        <w:rPr>
+          <w:rFonts w:cs="TimesNewRomanPSMT"/>
+        </w:rPr>
+        <w:t>2°- Modalités de fixation et de révision du loyer pratiqué des logements de la résidence universitaire.</w:t>
+      </w:r>
+    </w:p>
+    <w:p>
+      <w:pPr>
+        <w:jc w:val="both"/>
+        <w:rPr>
+          <w:rFonts w:cs="TimesNewRomanPSMT"/>
+        </w:rPr>
+      </w:pPr>
+    </w:p>
+    <w:p>
+      <w:pPr>
+        <w:jc w:val="both"/>
+      </w:pPr>
+      <w:r>
+        <w:rPr>
+          <w:rFonts w:cs="TimesNewRomanPSMT"/>
+        </w:rPr>
+        <w:t>Le loyer pratiqué pour chaque logement est fixé dans la limite du loyer maximum prévu par la présente convention.</w:t>
+      </w:r>
+    </w:p>
+    <w:p>
+      <w:pPr>
+        <w:jc w:val="both"/>
+        <w:rPr>
+          <w:rFonts w:ascii="TimesNewRomanPSMT" w:hAnsi="TimesNewRomanPSMT" w:cs="TimesNewRomanPSMT"/>
+        </w:rPr>
+      </w:pPr>
+    </w:p>
+    <w:p>
+      <w:pPr>
+        <w:jc w:val="both"/>
+      </w:pPr>
+      <w:r>
+        <w:rPr>
+          <w:rFonts w:cs="TimesNewRomanPSMT"/>
+        </w:rPr>
+        <w:t>Il ne peut donner lieu à révision en cours de bail.</w:t>
+      </w:r>
+    </w:p>
+    <w:p>
+      <w:pPr>
+        <w:jc w:val="both"/>
+        <w:rPr>
+          <w:rFonts w:cs="TimesNewRomanPSMT"/>
+        </w:rPr>
+      </w:pPr>
+    </w:p>
+    <w:p>
+      <w:pPr>
+        <w:jc w:val="both"/>
+      </w:pPr>
+      <w:r>
+        <w:rPr>
+          <w:rFonts w:cs="TimesNewRomanPSMT"/>
+        </w:rPr>
+        <w:t>Si le contrat de location est renouvelé dans les conditions prévues au 3° ci-dessous, le loyer peut être réévalué conformément aux dispositions du code de la construction et de l’habitation.</w:t>
+      </w:r>
+    </w:p>
+    <w:p>
+      <w:pPr>
+        <w:jc w:val="both"/>
+        <w:rPr>
+          <w:rFonts w:cs="TimesNewRomanPSMT"/>
+        </w:rPr>
+      </w:pPr>
+    </w:p>
+    <w:p>
+      <w:pPr>
+        <w:jc w:val="both"/>
+      </w:pPr>
+      <w:r>
+        <w:rPr>
+          <w:rFonts w:cs="TimesNewRomanPSMT"/>
+        </w:rPr>
+        <w:t>3°- Durée du contrat et congé donné par le locataire.</w:t>
+      </w:r>
+    </w:p>
+    <w:p>
+      <w:pPr>
+        <w:jc w:val="both"/>
+        <w:rPr>
+          <w:rFonts w:cs="TimesNewRomanPSMT"/>
+        </w:rPr>
+      </w:pPr>
+    </w:p>
+    <w:p>
+      <w:pPr>
+        <w:jc w:val="both"/>
+      </w:pPr>
+      <w:r>
+        <w:rPr>
+          <w:rFonts w:cs="TimesNewRomanPSMT"/>
+        </w:rPr>
+        <w:t>Par dérogation à l’article 15 de la présente convention, les locataires ne bénéficient pas du droit au maintien dans les lieux.</w:t>
+      </w:r>
+    </w:p>
+    <w:p>
+      <w:pPr>
+        <w:jc w:val="both"/>
+        <w:rPr>
+          <w:rFonts w:cs="TimesNewRomanPSMT"/>
+        </w:rPr>
+      </w:pPr>
+    </w:p>
+    <w:p>
+      <w:pPr>
+        <w:jc w:val="both"/>
+      </w:pPr>
+      <w:r>
+        <w:rPr>
+          <w:rFonts w:cs="TimesNewRomanPSMT"/>
+        </w:rPr>
+        <w:t>Le contrat de location a une durée maximale d'un an. Il peut être renouvelé dès lors que l'occupant continue à remplir les conditions prévues par l’article L. 631-12 du code de la construction et de l’habitation, ainsi que les conditions de ressources requises pour l’attribution du logement. Le renouvellement donne lieu à la signature d’un nouveau contrat.</w:t>
+      </w:r>
+    </w:p>
+    <w:p>
+      <w:pPr>
+        <w:jc w:val="both"/>
+        <w:rPr>
+          <w:rFonts w:cs="TimesNewRomanPSMT"/>
+        </w:rPr>
+      </w:pPr>
+    </w:p>
+    <w:p>
+      <w:pPr>
+        <w:jc w:val="both"/>
+      </w:pPr>
+      <w:r>
+        <w:rPr>
+          <w:rFonts w:cs="TimesNewRomanPSMT"/>
+        </w:rPr>
+        <w:t>Le locataire peut donner congé à tout moment, dans les conditions des treizième à vingt-deuxième alinéas du I de l'article 15 de la loi du 6 juillet 1989 précitée. Il est redevable du loyer et des charges pendant la durée effective du délai de préavis, de jour à jour, sauf si le logement se trouve occupé avant la fin du préavis par un autre locataire en accord avec le bailleur.</w:t>
+      </w:r>
+    </w:p>
+    <w:p>
+      <w:pPr>
+        <w:jc w:val="both"/>
+        <w:rPr>
+          <w:rFonts w:ascii="TimesNewRomanPSMT" w:hAnsi="TimesNewRomanPSMT" w:cs="TimesNewRomanPSMT"/>
+        </w:rPr>
+      </w:pPr>
+    </w:p>
+    <w:p>
+      <w:pPr>
+        <w:jc w:val="both"/>
+      </w:pPr>
+      <w:r>
+        <w:rPr>
+          <w:rFonts w:cs="TimesNewRomanPSMT"/>
+        </w:rPr>
+        <w:t>4°- Forfait de charges.</w:t>
+      </w:r>
+    </w:p>
+    <w:p>
+      <w:pPr>
+        <w:jc w:val="both"/>
+        <w:rPr>
+          <w:rFonts w:cs="TimesNewRomanPSMT"/>
+        </w:rPr>
+      </w:pPr>
+    </w:p>
+    <w:p>
+      <w:pPr>
+        <w:jc w:val="both"/>
+      </w:pPr>
+      <w:r>
+        <w:rPr>
+          <w:rFonts w:cs="TimesNewRomanPSMT"/>
+        </w:rPr>
+        <w:t xml:space="preserve">En application du VIII de l’article 40 de la loi du 6 juillet 1989 précitée, les charges locatives accessoires au loyer principal des logements de la résidence universitaire peuvent être récupérées par le bailleur sous la forme d'un forfait versé simultanément au loyer, dont le montant et la périodicité de versement sont définis au contrat et qui ne peut donner lieu à complément ou à régularisation ultérieure. Le montant du forfait de </w:t>
+      </w:r>
+      <w:r>
+        <w:rPr>
+          <w:rFonts w:cs="TimesNewRomanPSMT"/>
+        </w:rPr>
+        <w:lastRenderedPageBreak/>
+        <w:t>charges est fixé en fonction des montants exigibles par le bailleur en application de l'article 23 de la loi du 6 juillet 1989 précitée. Ce montant</w:t>
+      </w:r>
+      <w:r>
+        <w:t xml:space="preserve"> </w:t>
+      </w:r>
+      <w:r>
+        <w:rPr>
+          <w:rFonts w:cs="TimesNewRomanPSMT"/>
+        </w:rPr>
+        <w:t>ne doit pas être manifestement disproportionné au regard des charges dont le locataire ou, le cas échéant, le précédent locataire se serait acquitté.</w:t>
+      </w:r>
+    </w:p>
+    <w:p>
+      <w:pPr>
+        <w:jc w:val="both"/>
+        <w:rPr>
+          <w:rFonts w:cs="TimesNewRomanPSMT"/>
+        </w:rPr>
+      </w:pPr>
+    </w:p>
+    <w:p>
+      <w:pPr>
+        <w:jc w:val="both"/>
+      </w:pPr>
+      <w:r>
+        <w:rPr>
+          <w:rFonts w:cs="TimesNewRomanPSMT"/>
+        </w:rPr>
+        <w:t>Si le bailleur a opté pour cette modalité de récupération des charges, il indique sur la quittance le montant du forfait</w:t>
+      </w:r>
+      <w:r>
+        <w:rPr>
+          <w:rFonts w:ascii="TimesNewRomanPSMT" w:hAnsi="TimesNewRomanPSMT" w:cs="TimesNewRomanPSMT"/>
+        </w:rPr>
+        <w:t>.</w:t>
+      </w:r>
+    </w:p>
+    <w:p>
+      <w:pPr>
+        <w:jc w:val="both"/>
+        <w:rPr>
+          <w:rFonts w:ascii="TimesNewRomanPSMT" w:hAnsi="TimesNewRomanPSMT" w:cs="TimesNewRomanPSMT"/>
+        </w:rPr>
+      </w:pPr>
+    </w:p>
+    <w:p>
+      <w:pPr>
         <w:jc w:val="center"/>
       </w:pPr>
       <w:r>
         <w:rPr>
           <w:rFonts w:cs="TimesNewRomanPSMT"/>
         </w:rPr>
-        <w:t>Article 12.</w:t>
+        <w:t>Article 19.</w:t>
       </w:r>
     </w:p>
     <w:p>
@@ -2943,75 +3881,26 @@
           <w:i/>
           <w:iCs/>
         </w:rPr>
-        <w:t>Travaux.</w:t>
-      </w:r>
-    </w:p>
-    <w:p>
-      <w:pPr>
-        <w:jc w:val="both"/>
-        <w:rPr>
-          <w:rFonts w:cs="TimesNewRomanPSMT"/>
-        </w:rPr>
-      </w:pPr>
-    </w:p>
-    <w:p>
-      <w:pPr>
-        <w:jc w:val="both"/>
-      </w:pPr>
-      <w:r>
-        <w:rPr>
-          <w:rFonts w:cs="TimesNewRomanPSMT"/>
-        </w:rPr>
-        <w:t>Lorsque l'exécution des travaux nécessite l'évacuation temporaire des lieux, l'organisme bailleur doit mettre provisoirement à la disposition du locataire un logement en bon état d'habitation remplissant des conditions d'hygiène normales, correspondant à ses besoins personnels ou familiaux et, le cas échéant, professionnels, ainsi qu'à ses possibilités. Il doit en outre être situé :</w:t>
-      </w:r>
-    </w:p>
-    <w:p>
-      <w:pPr>
-        <w:jc w:val="both"/>
-      </w:pPr>
-      <w:r>
-        <w:rPr>
-          <w:rFonts w:cs="TimesNewRomanPSMT"/>
-        </w:rPr>
-        <w:t>- dans le même arrondissement ou les arrondissements limitrophes ou les communes limitrophes de l'arrondissement où se trouve le local, objet de la reprise, si celui-ci est situé dans une commune divisée en arrondissements ;</w:t>
-      </w:r>
-    </w:p>
-    <w:p>
-      <w:pPr>
-        <w:jc w:val="both"/>
-        <w:rPr>
-          <w:rFonts w:cs="TimesNewRomanPSMT"/>
-        </w:rPr>
-      </w:pPr>
-    </w:p>
-    <w:p>
-      <w:pPr>
-        <w:jc w:val="both"/>
-      </w:pPr>
-      <w:r>
-        <w:rPr>
-          <w:rFonts w:cs="TimesNewRomanPSMT"/>
-        </w:rPr>
-        <w:t>- dans le même canton ou dans les cantons limitrophes de ce canton inclus dans la même commune ou dans les communes limitrophes de ce canton, si la commune est divisée en cantons ;</w:t>
-      </w:r>
-    </w:p>
-    <w:p>
-      <w:pPr>
-        <w:jc w:val="both"/>
-        <w:rPr>
-          <w:rFonts w:cs="TimesNewRomanPSMT"/>
-        </w:rPr>
-      </w:pPr>
-    </w:p>
-    <w:p>
-      <w:pPr>
-        <w:jc w:val="both"/>
-      </w:pPr>
-      <w:r>
-        <w:rPr>
-          <w:rFonts w:cs="TimesNewRomanPSMT"/>
-        </w:rPr>
-        <w:t>- dans les autres cas, sur le territoire de la même commune ou d'une commune limitrophe, sans pouvoir être éloigné de plus de cinq kilomètres.</w:t>
+        <w:t>Renonciation au statut de résidence universitaire.</w:t>
+      </w:r>
+    </w:p>
+    <w:p>
+      <w:pPr>
+        <w:jc w:val="both"/>
+        <w:rPr>
+          <w:rFonts w:cs="TimesNewRomanPSMT"/>
+        </w:rPr>
+      </w:pPr>
+    </w:p>
+    <w:p>
+      <w:pPr>
+        <w:jc w:val="both"/>
+      </w:pPr>
+      <w:r>
+        <w:rPr>
+          <w:rFonts w:cs="TimesNewRomanPSMT"/>
+        </w:rPr>
+        <w:t>En cas de renonciation au statut de résidence universitaire, les dispositions relatives aux résidences universitaires figurant dans la présente convention sont sans objet. La renonciation au statut de résidence universitaire est définitive et s'effectue par avenant, à l’initiative du bailleur. Cet avenant est sans effet sur les contrats de location en cours. A l’échéance de chacun de ces contrats, le logement concerné est loué dans les conditions de droit commun de la présente convention.</w:t>
       </w:r>
     </w:p>
     <w:p>
@@ -3024,13 +3913,41 @@
     </w:p>
     <w:p>
       <w:pPr>
+        <w:jc w:val="both"/>
+        <w:rPr>
+          <w:rFonts w:cs="TimesNewRomanPSMT"/>
+        </w:rPr>
+      </w:pPr>
+    </w:p>
+    <w:p>
+      <w:pPr>
         <w:jc w:val="center"/>
       </w:pPr>
       <w:r>
         <w:rPr>
-          <w:rFonts w:cs="TimesNewRomanPSMT"/>
-        </w:rPr>
-        <w:t>Article 13.</w:t>
+          <w:rFonts w:cs="TimesNewRomanPS-BoldMT"/>
+          <w:b/>
+        </w:rPr>
+        <w:t>V.-Engagements du bailleur à l'égard des organismes chargés de la liquidation et du paiement de l'APL.</w:t>
+      </w:r>
+    </w:p>
+    <w:p>
+      <w:pPr>
+        <w:rPr>
+          <w:rFonts w:cs="TimesNewRomanPS-BoldMT"/>
+          <w:b/>
+        </w:rPr>
+      </w:pPr>
+    </w:p>
+    <w:p>
+      <w:pPr>
+        <w:jc w:val="center"/>
+      </w:pPr>
+      <w:r>
+        <w:rPr>
+          <w:rFonts w:cs="TimesNewRomanPSMT"/>
+        </w:rPr>
+        <w:t>Article 20.</w:t>
       </w:r>
     </w:p>
     <w:p>
@@ -3050,37 +3967,83 @@
           <w:i/>
           <w:iCs/>
         </w:rPr>
-        <w:t>Information des locataires en cas de changement de propriétaire.</w:t>
-      </w:r>
-    </w:p>
-    <w:p>
-      <w:pPr>
-        <w:jc w:val="both"/>
-        <w:rPr>
-          <w:rFonts w:cs="TimesNewRomanPSMT"/>
-        </w:rPr>
-      </w:pPr>
-    </w:p>
-    <w:p>
-      <w:pPr>
-        <w:jc w:val="both"/>
-      </w:pPr>
-      <w:r>
-        <w:rPr>
-          <w:rFonts w:cs="TimesNewRomanPSMT"/>
-        </w:rPr>
-        <w:t>En cas de mutation à titre gratuit ou onéreux, et en vue de l'information du préfet ou, le cas échéant, du président de l'établissement public de coopération intercommunale, du conseil départemental, de la métropole de Lyon ou du conseil exécutif de Corse, partie à la présente convention, des locataires et des organismes liquidateurs de l'APL, le ou les nouveaux propriétaires leur font connaître leur identification dans les conditions conformes soit à l'article 5, soit à l'article 6 du décret n° 55-22 du</w:t>
-      </w:r>
-    </w:p>
-    <w:p>
-      <w:pPr>
-        <w:jc w:val="both"/>
-      </w:pPr>
-      <w:r>
-        <w:rPr>
-          <w:rFonts w:cs="TimesNewRomanPSMT"/>
-        </w:rPr>
-        <w:t>4 janvier 1955 modifié, par acte extrajudiciaire, lettre recommandée avec demande d'avis de réception ou remise contre décharge dans un délai d'un mois à compter de ladite mutation.</w:t>
+        <w:t>Obligations générales.</w:t>
+      </w:r>
+    </w:p>
+    <w:p>
+      <w:pPr>
+        <w:jc w:val="both"/>
+        <w:rPr>
+          <w:rFonts w:cs="TimesNewRomanPSMT"/>
+        </w:rPr>
+      </w:pPr>
+    </w:p>
+    <w:p>
+      <w:pPr>
+        <w:jc w:val="both"/>
+      </w:pPr>
+      <w:r>
+        <w:rPr>
+          <w:rFonts w:cs="TimesNewRomanPSMT"/>
+        </w:rPr>
+        <w:t>1° Pour chaque locataire demandeur de l'APL, le bailleur s’engage à favoriser l’utilisation des services dématérialisés mis à sa disposition par les organismes payeurs pour l’envoi des informations nécessaires à l’étude d’un droit à une aide au logement. En dernier ressort, il renseigne dès l'entrée en vigueur de la convention pour chaque locataire demandeur de l'APL, la partie de l'imprimé de demande d'APL qui le concerne.</w:t>
+      </w:r>
+    </w:p>
+    <w:p>
+      <w:pPr>
+        <w:jc w:val="both"/>
+        <w:rPr>
+          <w:rFonts w:cs="TimesNewRomanPSMT"/>
+        </w:rPr>
+      </w:pPr>
+    </w:p>
+    <w:p>
+      <w:pPr>
+        <w:jc w:val="both"/>
+      </w:pPr>
+      <w:r>
+        <w:rPr>
+          <w:rFonts w:cs="TimesNewRomanPSMT"/>
+        </w:rPr>
+        <w:t>2° Pour permettre le renouvellement des droits à l’APL au 1er janvier de chaque année, le bailleur fournit aux organismes liquidateurs de l'APL au plus tard le 15 novembre de chaque année, conformément à l'arrêté du 22 août 1986 relatif à la fixation des justifications nécessaires à l'obtention de l'aide personnalisée au logement et à son renouvellement :</w:t>
+      </w:r>
+    </w:p>
+    <w:p>
+      <w:pPr>
+        <w:jc w:val="both"/>
+        <w:rPr>
+          <w:rFonts w:cs="TimesNewRomanPSMT"/>
+        </w:rPr>
+      </w:pPr>
+    </w:p>
+    <w:p>
+      <w:pPr>
+        <w:jc w:val="both"/>
+      </w:pPr>
+      <w:r>
+        <w:rPr>
+          <w:rFonts w:cs="TimesNewRomanPSMT"/>
+        </w:rPr>
+        <w:t>- une attestation concernant le montant du loyer applicable à chaque logement concerné par la présente convention, à compter du 1er juillet de l’année en cours ;</w:t>
+      </w:r>
+    </w:p>
+    <w:p>
+      <w:pPr>
+        <w:jc w:val="both"/>
+        <w:rPr>
+          <w:rFonts w:cs="TimesNewRomanPSMT"/>
+        </w:rPr>
+      </w:pPr>
+    </w:p>
+    <w:p>
+      <w:pPr>
+        <w:jc w:val="both"/>
+      </w:pPr>
+      <w:r>
+        <w:rPr>
+          <w:rFonts w:cs="TimesNewRomanPSMT"/>
+        </w:rPr>
+        <w:t>- un document attestant que tous les bénéficiaires sont à jour de leurs obligations vis-à-vis du bailleur ou, le cas échéant, la liste des bénéficiaires d'APL non à jour en certifiant que cette liste est exhaustive. Ce document mentionne également la date à laquelle l’organisme payeur a été saisi en cas d’impayé constitué selon la définition fixée par l’article R. 824-1 du code de la construction et de l’habitation.</w:t>
       </w:r>
     </w:p>
     <w:p>
@@ -3093,13 +4056,51 @@
     </w:p>
     <w:p>
       <w:pPr>
+        <w:jc w:val="both"/>
+      </w:pPr>
+      <w:r>
+        <w:rPr>
+          <w:rFonts w:cs="TimesNewRomanPSMT"/>
+        </w:rPr>
+        <w:t>Ces transmissions peuvent s’effectuer grâce à un dispositif de collecte dématérialisé.</w:t>
+      </w:r>
+    </w:p>
+    <w:p>
+      <w:pPr>
+        <w:jc w:val="both"/>
+        <w:rPr>
+          <w:rFonts w:cs="TimesNewRomanPSMT"/>
+        </w:rPr>
+      </w:pPr>
+    </w:p>
+    <w:p>
+      <w:pPr>
+        <w:jc w:val="both"/>
+      </w:pPr>
+      <w:r>
+        <w:rPr>
+          <w:rFonts w:cs="TimesNewRomanPSMT"/>
+        </w:rPr>
+        <w:t>3° En outre, il fait part dans un délai maximum d'un mois aux organismes liquidateurs de l'APL des modifications affectant la situation locative du bénéficiaire (notamment colocation, résiliation de bail, décès).</w:t>
+      </w:r>
+    </w:p>
+    <w:p>
+      <w:pPr>
+        <w:jc w:val="both"/>
+        <w:rPr>
+          <w:rFonts w:ascii="TimesNewRomanPSMT" w:hAnsi="TimesNewRomanPSMT" w:cs="TimesNewRomanPSMT"/>
+        </w:rPr>
+      </w:pPr>
+    </w:p>
+    <w:p>
+      <w:pPr>
         <w:jc w:val="center"/>
       </w:pPr>
       <w:r>
         <w:rPr>
           <w:rFonts w:cs="TimesNewRomanPSMT"/>
         </w:rPr>
-        <w:t>Article 14.</w:t>
+        <w:t>Article 21.</w:t>
       </w:r>
     </w:p>
     <w:p>
@@ -3119,52 +4120,100 @@
           <w:i/>
           <w:iCs/>
         </w:rPr>
-        <w:t>Information des locataires en cas de modification ou de résiliation de la convention.</w:t>
-      </w:r>
-    </w:p>
-    <w:p>
-      <w:pPr>
-        <w:jc w:val="both"/>
-        <w:rPr>
-          <w:rFonts w:cs="TimesNewRomanPSMT"/>
-        </w:rPr>
-      </w:pPr>
-    </w:p>
-    <w:p>
-      <w:pPr>
-        <w:jc w:val="both"/>
-      </w:pPr>
-      <w:r>
-        <w:rPr>
-          <w:rFonts w:cs="TimesNewRomanPSMT"/>
-        </w:rPr>
-        <w:t>Le bailleur informe les locataires de toute modification apportée à la convention ayant des incidences sur leurs relations contractuelles.</w:t>
-      </w:r>
-    </w:p>
-    <w:p>
-      <w:pPr>
-        <w:jc w:val="both"/>
-        <w:rPr>
-          <w:rFonts w:cs="TimesNewRomanPSMT"/>
-        </w:rPr>
-      </w:pPr>
-    </w:p>
-    <w:p>
-      <w:pPr>
-        <w:jc w:val="both"/>
-      </w:pPr>
-      <w:r>
-        <w:rPr>
-          <w:rFonts w:cs="TimesNewRomanPSMT"/>
-        </w:rPr>
-        <w:t>Quelle qu'en soit la cause, le bailleur informe le locataire de la date prévue pour l'expiration de la convention. En cas de résiliation de la convention aux torts du bailleur, il porte à la connaissance des locataires la teneur de l'article L. 353-6 du code de la construction et de l'habitation.</w:t>
-      </w:r>
-    </w:p>
-    <w:p>
-      <w:pPr>
-        <w:jc w:val="both"/>
-        <w:rPr>
-          <w:rFonts w:cs="TimesNewRomanPSMT"/>
+        <w:t>Obligations en cas d’impayé.</w:t>
+      </w:r>
+    </w:p>
+    <w:p>
+      <w:pPr>
+        <w:jc w:val="both"/>
+        <w:rPr>
+          <w:rFonts w:cs="TimesNewRomanPSMT"/>
+        </w:rPr>
+      </w:pPr>
+    </w:p>
+    <w:p>
+      <w:pPr>
+        <w:jc w:val="both"/>
+      </w:pPr>
+      <w:r>
+        <w:rPr>
+          <w:rFonts w:cs="TimesNewRomanPSMT"/>
+        </w:rPr>
+        <w:t>En application des articles L. 824-1 et R. 824-4 du code de la construction et de l’habitation, le bailleur auprès duquel l'aide est versée signale à l’organisme payeur lorsqu’un allocataire ne règle pas la part de la dépense de logement restant à sa charge, dans un délai de deux mois après la constitution de l'impayé défini à l’article R. 824-1 du code de la construction et de l’habitation, sauf si la somme due a été réglée entre-temps en totalité. Le bailleur doit justifier qu'il poursuit par tous les moyens possibles le recouvrement de sa créance. En outre, il communique le montant de l'impayé constitué au moment de la saisine de l’organisme payeur.</w:t>
+      </w:r>
+    </w:p>
+    <w:p>
+      <w:pPr>
+        <w:jc w:val="both"/>
+        <w:rPr>
+          <w:rFonts w:ascii="TimesNewRomanPSMT" w:hAnsi="TimesNewRomanPSMT" w:cs="TimesNewRomanPSMT"/>
+        </w:rPr>
+      </w:pPr>
+    </w:p>
+    <w:p>
+      <w:pPr>
+        <w:jc w:val="both"/>
+      </w:pPr>
+      <w:r>
+        <w:rPr>
+          <w:rFonts w:cs="TimesNewRomanPSMT"/>
+        </w:rPr>
+        <w:t>Parallèlement, en cas d'impayé, le bailleur doit poursuivre le recouvrement de sa créance en notifiant au locataire défaillant par lettre recommandée avec accusé de réception le montant de cette créance. Il doit également informer le locataire de la saisine de l’organisme payeur.</w:t>
+      </w:r>
+    </w:p>
+    <w:p>
+      <w:pPr>
+        <w:jc w:val="both"/>
+        <w:rPr>
+          <w:rFonts w:cs="TimesNewRomanPSMT"/>
+        </w:rPr>
+      </w:pPr>
+    </w:p>
+    <w:p>
+      <w:pPr>
+        <w:jc w:val="both"/>
+      </w:pPr>
+      <w:r>
+        <w:rPr>
+          <w:rFonts w:cs="TimesNewRomanPSMT"/>
+        </w:rPr>
+        <w:t>La commission de coordination des actions de prévention des expulsions locatives (CCAPEX) est systématiquement informée par l’organisme payeur des APL en vue de prévenir leurs éventuelles suspensions par une mobilisation coordonnée des outils de prévention (article 7-2 de la loi n° 90- 449 du 31 mai 1990 visant à la mise en œuvre du droit au logement).</w:t>
+      </w:r>
+    </w:p>
+    <w:p>
+      <w:pPr>
+        <w:jc w:val="both"/>
+        <w:rPr>
+          <w:rFonts w:cs="TimesNewRomanPSMT"/>
+        </w:rPr>
+      </w:pPr>
+    </w:p>
+    <w:p>
+      <w:pPr>
+        <w:jc w:val="both"/>
+      </w:pPr>
+      <w:r>
+        <w:rPr>
+          <w:rFonts w:cs="TimesNewRomanPSMT"/>
+        </w:rPr>
+        <w:t>La CCAPEX est réputée avoir été régulièrement saisie lorsque le bailleur a préalablement signalé l’impayé à l’organisme payeur des APL selon les modalités définies à l’article R. 824-4 précité.</w:t>
+      </w:r>
+    </w:p>
+    <w:p>
+      <w:pPr>
+        <w:jc w:val="both"/>
+        <w:rPr>
+          <w:rFonts w:cs="TimesNewRomanPS-BoldMT"/>
+          <w:b/>
+        </w:rPr>
+      </w:pPr>
+    </w:p>
+    <w:p>
+      <w:pPr>
+        <w:jc w:val="both"/>
+        <w:rPr>
+          <w:rFonts w:cs="TimesNewRomanPS-BoldMT"/>
+          <w:b/>
         </w:rPr>
       </w:pPr>
     </w:p>
@@ -3174,9 +4223,29 @@
       </w:pPr>
       <w:r>
         <w:rPr>
-          <w:rFonts w:cs="TimesNewRomanPSMT"/>
-        </w:rPr>
-        <w:t>Article 15.</w:t>
+          <w:rFonts w:cs="TimesNewRomanPS-BoldMT"/>
+          <w:b/>
+        </w:rPr>
+        <w:t>VI.-Dispositions relatives à l’application de la convention.</w:t>
+      </w:r>
+    </w:p>
+    <w:p>
+      <w:pPr>
+        <w:rPr>
+          <w:rFonts w:cs="TimesNewRomanPS-BoldMT"/>
+          <w:b/>
+        </w:rPr>
+      </w:pPr>
+    </w:p>
+    <w:p>
+      <w:pPr>
+        <w:jc w:val="center"/>
+      </w:pPr>
+      <w:r>
+        <w:rPr>
+          <w:rFonts w:cs="TimesNewRomanPSMT"/>
+        </w:rPr>
+        <w:t>Article 22.</w:t>
       </w:r>
     </w:p>
     <w:p>
@@ -3196,59 +4265,33 @@
           <w:i/>
           <w:iCs/>
         </w:rPr>
-        <w:t>Maintien dans les lieux et congé donné par le locataire.</w:t>
-      </w:r>
-    </w:p>
-    <w:p>
-      <w:pPr>
-        <w:jc w:val="both"/>
-        <w:rPr>
-          <w:rFonts w:cs="TimesNewRomanPSMT"/>
-        </w:rPr>
-      </w:pPr>
-    </w:p>
-    <w:p>
-      <w:pPr>
-        <w:jc w:val="both"/>
-      </w:pPr>
-      <w:r>
-        <w:rPr>
-          <w:rFonts w:cs="TimesNewRomanPSMT"/>
-        </w:rPr>
-        <w:lastRenderedPageBreak/>
-        <w:t>Pendant la durée de la convention, le locataire bénéficie du droit au maintien dans les lieux dans les conditions de l'article L. 353-15 du code de la construction et de l’habitation, dans la mesure où il se conforme aux obligations de l'article 7 de la loi du 6 juillet 1989 précitée, sauf dénonciation expresse du locataire dans les conditions des treizième à vingt-deuxième alinéas du I de l'article 15 de la loi du 6 juillet 1989 précitée.</w:t>
-      </w:r>
-    </w:p>
-    <w:p>
-      <w:pPr>
-        <w:jc w:val="both"/>
-        <w:rPr>
-          <w:rFonts w:cs="TimesNewRomanPSMT"/>
-        </w:rPr>
-      </w:pPr>
-    </w:p>
-    <w:p>
-      <w:pPr>
-        <w:jc w:val="both"/>
-      </w:pPr>
-      <w:r>
-        <w:rPr>
-          <w:rFonts w:cs="TimesNewRomanPSMT"/>
-        </w:rPr>
-        <w:t>Le locataire peut donner congé à tout moment. Il est redevable du loyer et des charges pendant la durée effective du délai de préavis, de jour à jour, sauf si le logement se trouve occupé avant la fin du préavis par un autre locataire en accord avec le bailleur</w:t>
-      </w:r>
-      <w:r>
-        <w:rPr>
-          <w:rFonts w:ascii="TimesNewRomanPSMT" w:hAnsi="TimesNewRomanPSMT" w:cs="TimesNewRomanPSMT"/>
-        </w:rPr>
-        <w:t>.</w:t>
-      </w:r>
-    </w:p>
-    <w:p>
-      <w:pPr>
-        <w:jc w:val="both"/>
-        <w:rPr>
-          <w:rFonts w:ascii="TimesNewRomanPSMT" w:hAnsi="TimesNewRomanPSMT" w:cs="TimesNewRomanPSMT"/>
+        <w:t>Contrôle.</w:t>
+      </w:r>
+    </w:p>
+    <w:p>
+      <w:pPr>
+        <w:jc w:val="both"/>
+        <w:rPr>
+          <w:rFonts w:cs="TimesNewRomanPSMT"/>
+        </w:rPr>
+      </w:pPr>
+    </w:p>
+    <w:p>
+      <w:pPr>
+        <w:jc w:val="both"/>
+      </w:pPr>
+      <w:r>
+        <w:rPr>
+          <w:rFonts w:cs="TimesNewRomanPSMT"/>
+        </w:rPr>
+        <w:t>Afin de permettre le contrôle de l'application de la présente convention, le bailleur fournit à tout moment à la demande du préfet ou de l’Agence nationale de contrôle du logement social toutes les informations et tous les documents nécessaires au plein exercice de ce contrôle.</w:t>
+      </w:r>
+    </w:p>
+    <w:p>
+      <w:pPr>
+        <w:jc w:val="both"/>
+        <w:rPr>
+          <w:rFonts w:cs="TimesNewRomanPSMT"/>
         </w:rPr>
       </w:pPr>
     </w:p>
@@ -3260,7 +4303,7 @@
         <w:rPr>
           <w:rFonts w:cs="TimesNewRomanPSMT"/>
         </w:rPr>
-        <w:t>Article 16.</w:t>
+        <w:t>Article 23.</w:t>
       </w:r>
     </w:p>
     <w:p>
@@ -3280,83 +4323,27 @@
           <w:i/>
           <w:iCs/>
         </w:rPr>
-        <w:t>Modalités du paiement du loyer.</w:t>
-      </w:r>
-    </w:p>
-    <w:p>
-      <w:pPr>
-        <w:jc w:val="both"/>
-        <w:rPr>
-          <w:rFonts w:cs="TimesNewRomanPSMT"/>
-        </w:rPr>
-      </w:pPr>
-    </w:p>
-    <w:p>
-      <w:pPr>
-        <w:jc w:val="both"/>
-      </w:pPr>
-      <w:r>
-        <w:rPr>
-          <w:rFonts w:cs="TimesNewRomanPSMT"/>
-        </w:rPr>
-        <w:t>Le loyer est payé mensuellement à terme échu.</w:t>
-      </w:r>
-    </w:p>
-    <w:p>
-      <w:pPr>
-        <w:jc w:val="both"/>
-        <w:rPr>
-          <w:rFonts w:cs="TimesNewRomanPSMT"/>
-        </w:rPr>
-      </w:pPr>
-    </w:p>
-    <w:p>
-      <w:pPr>
-        <w:jc w:val="both"/>
-      </w:pPr>
-      <w:r>
-        <w:rPr>
-          <w:rFonts w:cs="TimesNewRomanPSMT"/>
-        </w:rPr>
-        <w:t>Le bailleur indique sur la quittance le montant du loyer principal, du ou des loyers accessoires, du loyer maximum, des charges locatives et, le cas échéant, le montant de l'APL, de la réduction de loyer de solidarité et de la contribution pour le partage des économies de charges.</w:t>
-      </w:r>
-    </w:p>
-    <w:p>
-      <w:pPr>
-        <w:jc w:val="both"/>
-        <w:rPr>
-          <w:rFonts w:cs="TimesNewRomanPSMT"/>
-        </w:rPr>
-      </w:pPr>
-    </w:p>
-    <w:p>
-      <w:pPr>
-        <w:jc w:val="both"/>
-      </w:pPr>
-      <w:r>
-        <w:rPr>
-          <w:rFonts w:cs="TimesNewRomanPSMT"/>
-        </w:rPr>
-        <w:t>En application de l'article L. 832-2 du code de la construction et de l'habitation, pour chaque appel de loyer, le bailleur déduit s'il y a lieu le montant de l'APL qu'il perçoit pour le compte du locataire du montant du loyer et des dépenses accessoires de logement.</w:t>
-      </w:r>
-    </w:p>
-    <w:p>
-      <w:pPr>
-        <w:jc w:val="both"/>
-        <w:rPr>
-          <w:rFonts w:cs="TimesNewRomanPSMT"/>
-        </w:rPr>
-      </w:pPr>
-    </w:p>
-    <w:p>
-      <w:pPr>
-        <w:jc w:val="both"/>
-      </w:pPr>
-      <w:r>
-        <w:rPr>
-          <w:rFonts w:cs="TimesNewRomanPSMT"/>
-        </w:rPr>
-        <w:t>Lorsque l'organisme liquidateur de l'APL verse au bailleur des rappels d'aide personnalisée pour le compte de locataires, le bailleur affecte ces sommes au compte de ces derniers. Si après affectation il en résulte un surplus, le bailleur le reverse au locataire dans le délai d'un mois.</w:t>
+        <w:t>Révision de la convention.</w:t>
+      </w:r>
+    </w:p>
+    <w:p>
+      <w:pPr>
+        <w:jc w:val="both"/>
+        <w:rPr>
+          <w:rFonts w:cs="TimesNewRomanPSMT"/>
+        </w:rPr>
+      </w:pPr>
+    </w:p>
+    <w:p>
+      <w:pPr>
+        <w:jc w:val="both"/>
+      </w:pPr>
+      <w:r>
+        <w:rPr>
+          <w:rFonts w:cs="TimesNewRomanPSMT"/>
+        </w:rPr>
+        <w:lastRenderedPageBreak/>
+        <w:t>La présente convention pourra être révisée à la demande de l'une ou l'autre des parties par voie d'avenant.</w:t>
       </w:r>
     </w:p>
     <w:p>
@@ -3369,51 +4356,13 @@
     </w:p>
     <w:p>
       <w:pPr>
-        <w:jc w:val="both"/>
-      </w:pPr>
-      <w:r>
-        <w:rPr>
-          <w:rFonts w:cs="TimesNewRomanPSMT"/>
-        </w:rPr>
-        <w:t>En cas de retard du locataire dans le paiement du loyer et des charges locatives, le bailleur doit prendre toutes dispositions en vue de recouvrer sa créance.</w:t>
-      </w:r>
-    </w:p>
-    <w:p>
-      <w:pPr>
-        <w:jc w:val="both"/>
-        <w:rPr>
-          <w:rFonts w:cs="TimesNewRomanPSMT"/>
-        </w:rPr>
-      </w:pPr>
-    </w:p>
-    <w:p>
-      <w:pPr>
-        <w:jc w:val="both"/>
-      </w:pPr>
-      <w:r>
-        <w:rPr>
-          <w:rFonts w:cs="TimesNewRomanPSMT"/>
-        </w:rPr>
-        <w:t>En cas d'impayé constitué au sens de l'article R. 824-1 du code de la construction et de l’habitation, et lorsque l'APL est versée en tiers payant, le bailleur doit informer l’organisme payeur de la situation du locataire dans un délai de deux mois après la constitution de l’impayé.</w:t>
-      </w:r>
-    </w:p>
-    <w:p>
-      <w:pPr>
-        <w:jc w:val="both"/>
-        <w:rPr>
-          <w:rFonts w:cs="TimesNewRomanPSMT"/>
-        </w:rPr>
-      </w:pPr>
-    </w:p>
-    <w:p>
-      <w:pPr>
         <w:jc w:val="center"/>
       </w:pPr>
       <w:r>
         <w:rPr>
           <w:rFonts w:cs="TimesNewRomanPSMT"/>
         </w:rPr>
-        <w:t>Article 17.</w:t>
+        <w:t>Article 24.</w:t>
       </w:r>
     </w:p>
     <w:p>
@@ -3433,26 +4382,26 @@
           <w:i/>
           <w:iCs/>
         </w:rPr>
-        <w:t>Dépôt de garantie.</w:t>
-      </w:r>
-    </w:p>
-    <w:p>
-      <w:pPr>
-        <w:jc w:val="both"/>
-        <w:rPr>
-          <w:rFonts w:cs="TimesNewRomanPSMT"/>
-        </w:rPr>
-      </w:pPr>
-    </w:p>
-    <w:p>
-      <w:pPr>
-        <w:jc w:val="both"/>
-      </w:pPr>
-      <w:r>
-        <w:rPr>
-          <w:rFonts w:cs="TimesNewRomanPSMT"/>
-        </w:rPr>
-        <w:t>Le dépôt de garantie stipulé le cas échéant par le contrat de location pour garantir l'exécution de ses obligations locatives par le locataire ne peut être supérieur à un mois de loyer en principal.</w:t>
+        <w:t>Inexécution de la convention par le bailleur.</w:t>
+      </w:r>
+    </w:p>
+    <w:p>
+      <w:pPr>
+        <w:jc w:val="both"/>
+        <w:rPr>
+          <w:rFonts w:cs="TimesNewRomanPSMT"/>
+        </w:rPr>
+      </w:pPr>
+    </w:p>
+    <w:p>
+      <w:pPr>
+        <w:jc w:val="both"/>
+      </w:pPr>
+      <w:r>
+        <w:rPr>
+          <w:rFonts w:cs="TimesNewRomanPSMT"/>
+        </w:rPr>
+        <w:t>1°- En application de l'article 284 du code général des impôts, les bailleurs qui ont, au taux réduit de la taxe sur la valeur ajoutée, acquis un logement social ou imposé la livraison à soi-même d'un logement locatif social ou de travaux d'amélioration, de transformation ou d'aménagement portant sur un logement locatif social sont redevables d'un complément de taxe sur la valeur ajoutée égal à la différence entre le taux réduit et le taux normal lorsque les conditions de taxation de vente ou de livraison à soi-même au taux réduit ne sont pas ou plus remplies.</w:t>
       </w:r>
     </w:p>
     <w:p>
@@ -3466,6 +4415,112 @@
     <w:p>
       <w:pPr>
         <w:jc w:val="both"/>
+      </w:pPr>
+      <w:r>
+        <w:rPr>
+          <w:rFonts w:cs="TimesNewRomanPSMT"/>
+        </w:rPr>
+        <w:t>2°- En application de l'article L. 353-2 du code de la construction et de l'habitation, des sanctions administratives peuvent être mises en œuvre.</w:t>
+      </w:r>
+    </w:p>
+    <w:p>
+      <w:pPr>
+        <w:jc w:val="both"/>
+        <w:rPr>
+          <w:rFonts w:cs="TimesNewRomanPSMT"/>
+        </w:rPr>
+      </w:pPr>
+    </w:p>
+    <w:p>
+      <w:pPr>
+        <w:jc w:val="both"/>
+      </w:pPr>
+      <w:r>
+        <w:rPr>
+          <w:rFonts w:cs="TimesNewRomanPSMT"/>
+        </w:rPr>
+        <w:t>En application de l’article L. 353-11 du code de la construction et de l’habitation, le contrôle de l’application de la présente convention est assuré par l’Agence nationale de contrôle du logement social, que le préfet est tenu de saisir en cas de manquement constaté.</w:t>
+      </w:r>
+    </w:p>
+    <w:p>
+      <w:pPr>
+        <w:jc w:val="both"/>
+        <w:rPr>
+          <w:rFonts w:cs="TimesNewRomanPSMT"/>
+        </w:rPr>
+      </w:pPr>
+    </w:p>
+    <w:p>
+      <w:pPr>
+        <w:jc w:val="both"/>
+      </w:pPr>
+      <w:r>
+        <w:rPr>
+          <w:rFonts w:cs="TimesNewRomanPSMT"/>
+        </w:rPr>
+        <w:t>Lorsqu'un organisme ne respecte pas, pour un ou plusieurs logements, les engagements prévus par la convention, et après que l'organisme a été mis en mesure de présenter ses observations conformément aux dispositions de l'article L. 342-12 du code de la construction et de l’habitation ou, en cas de mise en demeure, à l'issue du délai mentionné à ce même article, l’Agence nationale de contrôle du logement social peut proposer au ministre chargé du logement de prononcer une sanction en application de l’article L. 342-14 du même code.</w:t>
+      </w:r>
+    </w:p>
+    <w:p>
+      <w:pPr>
+        <w:jc w:val="both"/>
+        <w:rPr>
+          <w:rFonts w:cs="TimesNewRomanPSMT"/>
+        </w:rPr>
+      </w:pPr>
+    </w:p>
+    <w:p>
+      <w:pPr>
+        <w:jc w:val="both"/>
+      </w:pPr>
+      <w:r>
+        <w:rPr>
+          <w:rFonts w:cs="TimesNewRomanPSMT"/>
+        </w:rPr>
+        <w:t>3°- En cas d'inexécution par le bailleur de ses engagements prévus par la convention, tels que notamment non-respect du loyer maximum ou en cas de fraude, dissimulation ou fausse déclaration à l'égard des organismes liquidateurs de l'APL, le préfet peut procéder à la résiliation de la présente convention aux torts du bailleur. Le préfet doit préalablement mettre en demeure l'organisme par lettre recommandée avec demande d'avis de réception. L'organisme doit dans un délai de deux mois soit satisfaire à ses obligations, soit formuler ses observations.</w:t>
+      </w:r>
+    </w:p>
+    <w:p>
+      <w:pPr>
+        <w:jc w:val="both"/>
+        <w:rPr>
+          <w:rFonts w:cs="TimesNewRomanPSMT"/>
+        </w:rPr>
+      </w:pPr>
+    </w:p>
+    <w:p>
+      <w:pPr>
+        <w:jc w:val="both"/>
+      </w:pPr>
+      <w:r>
+        <w:rPr>
+          <w:rFonts w:cs="TimesNewRomanPSMT"/>
+        </w:rPr>
+        <w:t>Lorsque le préfet écarte ces observations, sa décision doit être motivée.</w:t>
+      </w:r>
+    </w:p>
+    <w:p>
+      <w:pPr>
+        <w:jc w:val="both"/>
+        <w:rPr>
+          <w:rFonts w:cs="TimesNewRomanPSMT"/>
+        </w:rPr>
+      </w:pPr>
+    </w:p>
+    <w:p>
+      <w:pPr>
+        <w:jc w:val="both"/>
+      </w:pPr>
+      <w:r>
+        <w:rPr>
+          <w:rFonts w:cs="TimesNewRomanPSMT"/>
+        </w:rPr>
+        <w:t>Dans ce cas, il est fait application des dispositions prévues à l'article L. 353-6 du code de la construction et de l'habitation.</w:t>
+      </w:r>
+    </w:p>
+    <w:p>
+      <w:pPr>
+        <w:jc w:val="both"/>
         <w:rPr>
           <w:rFonts w:ascii="TimesNewRomanPSMT" w:hAnsi="TimesNewRomanPSMT" w:cs="TimesNewRomanPSMT"/>
         </w:rPr>
@@ -3477,401 +4532,26 @@
       </w:pPr>
       <w:r>
         <w:rPr>
-          <w:rFonts w:cs="TimesNewRomanPS-BoldMT"/>
-          <w:b/>
-        </w:rPr>
-        <w:t>IV.-Dispositions spécifiques au statut de résidence universitaire.</w:t>
-      </w:r>
-    </w:p>
-    <w:p>
-      <w:pPr>
-        <w:rPr>
-          <w:rFonts w:cs="TimesNewRomanPS-BoldMT"/>
-          <w:b/>
+          <w:rFonts w:cs="TimesNewRomanPSMT"/>
+        </w:rPr>
+        <w:t>Article 25.</w:t>
+      </w:r>
+    </w:p>
+    <w:p>
+      <w:pPr>
+        <w:rPr>
+          <w:rFonts w:cs="TimesNewRomanPSMT"/>
         </w:rPr>
       </w:pPr>
     </w:p>
     <w:p>
       <w:pPr>
         <w:jc w:val="center"/>
-      </w:pPr>
-      <w:r>
-        <w:rPr>
-          <w:rFonts w:cs="TimesNewRomanPSMT"/>
-        </w:rPr>
-        <w:lastRenderedPageBreak/>
-        <w:t>Article 18.</w:t>
-      </w:r>
-    </w:p>
-    <w:p>
-      <w:pPr>
-        <w:rPr>
-          <w:rFonts w:cs="TimesNewRomanPSMT"/>
-        </w:rPr>
-      </w:pPr>
-    </w:p>
-    <w:p>
-      <w:pPr>
-        <w:jc w:val="center"/>
-      </w:pPr>
-      <w:r>
         <w:rPr>
           <w:rFonts w:cs="TimesNewRomanPSMT"/>
           <w:i/>
           <w:iCs/>
         </w:rPr>
-        <w:t>Régime des rapports locatifs applicables aux logements.</w:t>
-      </w:r>
-    </w:p>
-    <w:p>
-      <w:pPr>
-        <w:jc w:val="both"/>
-        <w:rPr>
-          <w:rFonts w:cs="TimesNewRomanPSMT"/>
-        </w:rPr>
-      </w:pPr>
-    </w:p>
-    <w:p>
-      <w:pPr>
-        <w:jc w:val="both"/>
-      </w:pPr>
-      <w:r>
-        <w:rPr>
-          <w:rFonts w:cs="TimesNewRomanPSMT"/>
-        </w:rPr>
-        <w:t>Lorsque la présente convention est conclue en application de l’article L. 353-1 et du 3° de l’article L. 831-1 du code de la construction et de l'habitation pour une résidence universitaire définie à l'article L. 631-12 du même code, les logements de la résidence universitaire sont soumis aux dispositions de la loi n° 89-462 du 6 juillet 1989 tendant à améliorer les rapports locatifs, dans les conditions prévues par les III et VIII de l’article 40, aux dispositions du code de la construction et de l'habitation et aux stipulations de la présente convention.</w:t>
-      </w:r>
-    </w:p>
-    <w:p>
-      <w:pPr>
-        <w:jc w:val="both"/>
-        <w:rPr>
-          <w:rFonts w:cs="TimesNewRomanPSMT"/>
-        </w:rPr>
-      </w:pPr>
-    </w:p>
-    <w:p>
-      <w:pPr>
-        <w:jc w:val="both"/>
-      </w:pPr>
-      <w:r>
-        <w:rPr>
-          <w:rFonts w:cs="TimesNewRomanPSMT"/>
-        </w:rPr>
-        <w:t>Les stipulations particulières suivantes s’appliquent :</w:t>
-      </w:r>
-    </w:p>
-    <w:p>
-      <w:pPr>
-        <w:jc w:val="both"/>
-        <w:rPr>
-          <w:rFonts w:cs="TimesNewRomanPSMT"/>
-        </w:rPr>
-      </w:pPr>
-    </w:p>
-    <w:p>
-      <w:pPr>
-        <w:jc w:val="both"/>
-      </w:pPr>
-      <w:r>
-        <w:rPr>
-          <w:rFonts w:cs="TimesNewRomanPSMT"/>
-        </w:rPr>
-        <w:t>1°- Conditions de location des logements de la résidence universitaire.</w:t>
-      </w:r>
-    </w:p>
-    <w:p>
-      <w:pPr>
-        <w:jc w:val="both"/>
-        <w:rPr>
-          <w:rFonts w:cs="TimesNewRomanPSMT"/>
-        </w:rPr>
-      </w:pPr>
-    </w:p>
-    <w:p>
-      <w:pPr>
-        <w:jc w:val="both"/>
-      </w:pPr>
-      <w:r>
-        <w:rPr>
-          <w:rFonts w:cs="TimesNewRomanPSMT"/>
-        </w:rPr>
-        <w:t>Les logements sont loués nus ou meublés à des étudiants, des personnes de moins de trente ans en formation ou en stage et des personnes titulaires d'un contrat de professionnalisation ou d'apprentissage, à titre de résidence principale, et occupés au moins huit mois par an. A titre exceptionnel, des logements peuvent être loués à des enseignants et des chercheurs.</w:t>
-      </w:r>
-    </w:p>
-    <w:p>
-      <w:pPr>
-        <w:jc w:val="both"/>
-        <w:rPr>
-          <w:rFonts w:ascii="TimesNewRomanPSMT" w:hAnsi="TimesNewRomanPSMT" w:cs="TimesNewRomanPSMT"/>
-        </w:rPr>
-      </w:pPr>
-    </w:p>
-    <w:p>
-      <w:pPr>
-        <w:jc w:val="both"/>
-      </w:pPr>
-      <w:r>
-        <w:rPr>
-          <w:rFonts w:cs="TimesNewRomanPSMT"/>
-        </w:rPr>
-        <w:t>Les logements peuvent également être loués dans les conditions prévues aux quatrième et cinquième alinéas du I de l’article L. 442-8-1 du code de la construction et de l’habitation.</w:t>
-      </w:r>
-    </w:p>
-    <w:p>
-      <w:pPr>
-        <w:jc w:val="both"/>
-        <w:rPr>
-          <w:rFonts w:cs="TimesNewRomanPSMT"/>
-        </w:rPr>
-      </w:pPr>
-    </w:p>
-    <w:p>
-      <w:pPr>
-        <w:jc w:val="both"/>
-      </w:pPr>
-      <w:r>
-        <w:rPr>
-          <w:rFonts w:cs="TimesNewRomanPSMT"/>
-        </w:rPr>
-        <w:t>2°- Modalités de fixation et de révision du loyer pratiqué des logements de la résidence universitaire.</w:t>
-      </w:r>
-    </w:p>
-    <w:p>
-      <w:pPr>
-        <w:jc w:val="both"/>
-        <w:rPr>
-          <w:rFonts w:cs="TimesNewRomanPSMT"/>
-        </w:rPr>
-      </w:pPr>
-    </w:p>
-    <w:p>
-      <w:pPr>
-        <w:jc w:val="both"/>
-      </w:pPr>
-      <w:r>
-        <w:rPr>
-          <w:rFonts w:cs="TimesNewRomanPSMT"/>
-        </w:rPr>
-        <w:t>Le loyer pratiqué pour chaque logement est fixé dans la limite du loyer maximum prévu par la présente convention.</w:t>
-      </w:r>
-    </w:p>
-    <w:p>
-      <w:pPr>
-        <w:jc w:val="both"/>
-        <w:rPr>
-          <w:rFonts w:ascii="TimesNewRomanPSMT" w:hAnsi="TimesNewRomanPSMT" w:cs="TimesNewRomanPSMT"/>
-        </w:rPr>
-      </w:pPr>
-    </w:p>
-    <w:p>
-      <w:pPr>
-        <w:jc w:val="both"/>
-      </w:pPr>
-      <w:r>
-        <w:rPr>
-          <w:rFonts w:cs="TimesNewRomanPSMT"/>
-        </w:rPr>
-        <w:t>Il ne peut donner lieu à révision en cours de bail.</w:t>
-      </w:r>
-    </w:p>
-    <w:p>
-      <w:pPr>
-        <w:jc w:val="both"/>
-        <w:rPr>
-          <w:rFonts w:cs="TimesNewRomanPSMT"/>
-        </w:rPr>
-      </w:pPr>
-    </w:p>
-    <w:p>
-      <w:pPr>
-        <w:jc w:val="both"/>
-      </w:pPr>
-      <w:r>
-        <w:rPr>
-          <w:rFonts w:cs="TimesNewRomanPSMT"/>
-        </w:rPr>
-        <w:t>Si le contrat de location est renouvelé dans les conditions prévues au 3° ci-dessous, le loyer peut être réévalué conformément aux dispositions du code de la construction et de l’habitation.</w:t>
-      </w:r>
-    </w:p>
-    <w:p>
-      <w:pPr>
-        <w:jc w:val="both"/>
-        <w:rPr>
-          <w:rFonts w:cs="TimesNewRomanPSMT"/>
-        </w:rPr>
-      </w:pPr>
-    </w:p>
-    <w:p>
-      <w:pPr>
-        <w:jc w:val="both"/>
-      </w:pPr>
-      <w:r>
-        <w:rPr>
-          <w:rFonts w:cs="TimesNewRomanPSMT"/>
-        </w:rPr>
-        <w:t>3°- Durée du contrat et congé donné par le locataire.</w:t>
-      </w:r>
-    </w:p>
-    <w:p>
-      <w:pPr>
-        <w:jc w:val="both"/>
-        <w:rPr>
-          <w:rFonts w:cs="TimesNewRomanPSMT"/>
-        </w:rPr>
-      </w:pPr>
-    </w:p>
-    <w:p>
-      <w:pPr>
-        <w:jc w:val="both"/>
-      </w:pPr>
-      <w:r>
-        <w:rPr>
-          <w:rFonts w:cs="TimesNewRomanPSMT"/>
-        </w:rPr>
-        <w:t>Par dérogation à l’article 15 de la présente convention, les locataires ne bénéficient pas du droit au maintien dans les lieux.</w:t>
-      </w:r>
-    </w:p>
-    <w:p>
-      <w:pPr>
-        <w:jc w:val="both"/>
-        <w:rPr>
-          <w:rFonts w:cs="TimesNewRomanPSMT"/>
-        </w:rPr>
-      </w:pPr>
-    </w:p>
-    <w:p>
-      <w:pPr>
-        <w:jc w:val="both"/>
-      </w:pPr>
-      <w:r>
-        <w:rPr>
-          <w:rFonts w:cs="TimesNewRomanPSMT"/>
-        </w:rPr>
-        <w:t>Le contrat de location a une durée maximale d'un an. Il peut être renouvelé dès lors que l'occupant continue à remplir les conditions prévues par l’article L. 631-12 du code de la construction et de l’habitation, ainsi que les conditions de ressources requises pour l’attribution du logement. Le renouvellement donne lieu à la signature d’un nouveau contrat.</w:t>
-      </w:r>
-    </w:p>
-    <w:p>
-      <w:pPr>
-        <w:jc w:val="both"/>
-        <w:rPr>
-          <w:rFonts w:cs="TimesNewRomanPSMT"/>
-        </w:rPr>
-      </w:pPr>
-    </w:p>
-    <w:p>
-      <w:pPr>
-        <w:jc w:val="both"/>
-      </w:pPr>
-      <w:r>
-        <w:rPr>
-          <w:rFonts w:cs="TimesNewRomanPSMT"/>
-        </w:rPr>
-        <w:lastRenderedPageBreak/>
-        <w:t>Le locataire peut donner congé à tout moment, dans les conditions des treizième à vingt-deuxième alinéas du I de l'article 15 de la loi du 6 juillet 1989 précitée. Il est redevable du loyer et des charges pendant la durée effective du délai de préavis, de jour à jour, sauf si le logement se trouve occupé avant la fin du préavis par un autre locataire en accord avec le bailleur.</w:t>
-      </w:r>
-    </w:p>
-    <w:p>
-      <w:pPr>
-        <w:jc w:val="both"/>
-        <w:rPr>
-          <w:rFonts w:ascii="TimesNewRomanPSMT" w:hAnsi="TimesNewRomanPSMT" w:cs="TimesNewRomanPSMT"/>
-        </w:rPr>
-      </w:pPr>
-    </w:p>
-    <w:p>
-      <w:pPr>
-        <w:jc w:val="both"/>
-      </w:pPr>
-      <w:r>
-        <w:rPr>
-          <w:rFonts w:cs="TimesNewRomanPSMT"/>
-        </w:rPr>
-        <w:t>4°- Forfait de charges.</w:t>
-      </w:r>
-    </w:p>
-    <w:p>
-      <w:pPr>
-        <w:jc w:val="both"/>
-        <w:rPr>
-          <w:rFonts w:cs="TimesNewRomanPSMT"/>
-        </w:rPr>
-      </w:pPr>
-    </w:p>
-    <w:p>
-      <w:pPr>
-        <w:jc w:val="both"/>
-      </w:pPr>
-      <w:r>
-        <w:rPr>
-          <w:rFonts w:cs="TimesNewRomanPSMT"/>
-        </w:rPr>
-        <w:t>En application du VIII de l’article 40 de la loi du 6 juillet 1989 précitée, les charges locatives accessoires au loyer principal des logements de la résidence universitaire peuvent être récupérées par le bailleur sous la forme d'un forfait versé simultanément au loyer, dont le montant et la périodicité de versement sont définis au contrat et qui ne peut donner lieu à complément ou à régularisation ultérieure. Le montant du forfait de charges est fixé en fonction des montants exigibles par le bailleur en application de l'article 23 de la loi du 6 juillet 1989 précitée. Ce montant</w:t>
-      </w:r>
-      <w:r>
-        <w:t xml:space="preserve"> </w:t>
-      </w:r>
-      <w:r>
-        <w:rPr>
-          <w:rFonts w:cs="TimesNewRomanPSMT"/>
-        </w:rPr>
-        <w:t>ne doit pas être manifestement disproportionné au regard des charges dont le locataire ou, le cas échéant, le précédent locataire se serait acquitté.</w:t>
-      </w:r>
-    </w:p>
-    <w:p>
-      <w:pPr>
-        <w:jc w:val="both"/>
-        <w:rPr>
-          <w:rFonts w:cs="TimesNewRomanPSMT"/>
-        </w:rPr>
-      </w:pPr>
-    </w:p>
-    <w:p>
-      <w:pPr>
-        <w:jc w:val="both"/>
-      </w:pPr>
-      <w:r>
-        <w:rPr>
-          <w:rFonts w:cs="TimesNewRomanPSMT"/>
-        </w:rPr>
-        <w:t>Si le bailleur a opté pour cette modalité de récupération des charges, il indique sur la quittance le montant du forfait</w:t>
-      </w:r>
-      <w:r>
-        <w:rPr>
-          <w:rFonts w:ascii="TimesNewRomanPSMT" w:hAnsi="TimesNewRomanPSMT" w:cs="TimesNewRomanPSMT"/>
-        </w:rPr>
-        <w:t>.</w:t>
-      </w:r>
-    </w:p>
-    <w:p>
-      <w:pPr>
-        <w:jc w:val="both"/>
-        <w:rPr>
-          <w:rFonts w:ascii="TimesNewRomanPSMT" w:hAnsi="TimesNewRomanPSMT" w:cs="TimesNewRomanPSMT"/>
-        </w:rPr>
-      </w:pPr>
-    </w:p>
-    <w:p>
-      <w:pPr>
-        <w:jc w:val="center"/>
-      </w:pPr>
-      <w:r>
-        <w:rPr>
-          <w:rFonts w:cs="TimesNewRomanPSMT"/>
-        </w:rPr>
-        <w:t>Article 19.</w:t>
-      </w:r>
-    </w:p>
-    <w:p>
-      <w:pPr>
-        <w:rPr>
-          <w:rFonts w:cs="TimesNewRomanPSMT"/>
-        </w:rPr>
-      </w:pPr>
-    </w:p>
-    <w:p>
-      <w:pPr>
-        <w:jc w:val="center"/>
       </w:pPr>
       <w:r>
         <w:rPr>
@@ -3879,710 +4559,33 @@
           <w:i/>
           <w:iCs/>
         </w:rPr>
-        <w:t>Renonciation au statut de résidence universitaire.</w:t>
-      </w:r>
-    </w:p>
-    <w:p>
-      <w:pPr>
-        <w:jc w:val="both"/>
-        <w:rPr>
-          <w:rFonts w:cs="TimesNewRomanPSMT"/>
-        </w:rPr>
-      </w:pPr>
-    </w:p>
-    <w:p>
-      <w:pPr>
-        <w:jc w:val="both"/>
-      </w:pPr>
-      <w:r>
-        <w:rPr>
-          <w:rFonts w:cs="TimesNewRomanPSMT"/>
-        </w:rPr>
-        <w:t>En cas de renonciation au statut de résidence universitaire, les dispositions relatives aux résidences universitaires figurant dans la présente convention sont sans objet. La renonciation au statut de résidence universitaire est définitive et s'effectue par avenant, à l’initiative du bailleur. Cet avenant est sans effet sur les contrats de location en cours. A l’échéance de chacun de ces contrats, le logement concerné est loué dans les conditions de droit commun de la présente convention.</w:t>
-      </w:r>
-    </w:p>
-    <w:p>
-      <w:pPr>
-        <w:jc w:val="both"/>
-        <w:rPr>
-          <w:rFonts w:ascii="TimesNewRomanPSMT" w:hAnsi="TimesNewRomanPSMT" w:cs="TimesNewRomanPSMT"/>
-        </w:rPr>
-      </w:pPr>
-    </w:p>
-    <w:p>
-      <w:pPr>
-        <w:jc w:val="both"/>
-        <w:rPr>
-          <w:rFonts w:cs="TimesNewRomanPSMT"/>
-        </w:rPr>
-      </w:pPr>
-    </w:p>
-    <w:p>
-      <w:pPr>
-        <w:jc w:val="center"/>
-      </w:pPr>
-      <w:r>
-        <w:rPr>
-          <w:rFonts w:cs="TimesNewRomanPS-BoldMT"/>
-          <w:b/>
-        </w:rPr>
-        <w:t>V.-Engagements du bailleur à l'égard des organismes chargés de la liquidation et du paiement de l'APL.</w:t>
-      </w:r>
-    </w:p>
-    <w:p>
-      <w:pPr>
-        <w:rPr>
-          <w:rFonts w:cs="TimesNewRomanPS-BoldMT"/>
-          <w:b/>
-        </w:rPr>
-      </w:pPr>
-    </w:p>
-    <w:p>
-      <w:pPr>
-        <w:jc w:val="center"/>
-      </w:pPr>
-      <w:r>
-        <w:rPr>
-          <w:rFonts w:cs="TimesNewRomanPSMT"/>
-        </w:rPr>
-        <w:t>Article 20.</w:t>
-      </w:r>
-    </w:p>
-    <w:p>
-      <w:pPr>
-        <w:rPr>
-          <w:rFonts w:cs="TimesNewRomanPSMT"/>
-        </w:rPr>
-      </w:pPr>
-    </w:p>
-    <w:p>
-      <w:pPr>
-        <w:jc w:val="center"/>
-      </w:pPr>
-      <w:r>
-        <w:rPr>
-          <w:rFonts w:cs="TimesNewRomanPSMT"/>
-          <w:i/>
-          <w:iCs/>
-        </w:rPr>
-        <w:t>Obligations générales.</w:t>
-      </w:r>
-    </w:p>
-    <w:p>
-      <w:pPr>
-        <w:jc w:val="both"/>
-        <w:rPr>
-          <w:rFonts w:cs="TimesNewRomanPSMT"/>
-        </w:rPr>
-      </w:pPr>
-    </w:p>
-    <w:p>
-      <w:pPr>
-        <w:jc w:val="both"/>
-      </w:pPr>
-      <w:r>
-        <w:rPr>
-          <w:rFonts w:cs="TimesNewRomanPSMT"/>
-        </w:rPr>
-        <w:t>1° Pour chaque locataire demandeur de l'APL, le bailleur s’engage à favoriser l’utilisation des services dématérialisés mis à sa disposition par les organismes payeurs pour l’envoi des informations nécessaires à l’étude d’un droit à une aide au logement. En dernier ressort, il renseigne dès l'entrée en vigueur de la convention pour chaque locataire demandeur de l'APL, la partie de l'imprimé de demande d'APL qui le concerne.</w:t>
-      </w:r>
-    </w:p>
-    <w:p>
-      <w:pPr>
-        <w:jc w:val="both"/>
-        <w:rPr>
-          <w:rFonts w:cs="TimesNewRomanPSMT"/>
-        </w:rPr>
-      </w:pPr>
-    </w:p>
-    <w:p>
-      <w:pPr>
-        <w:jc w:val="both"/>
-      </w:pPr>
-      <w:r>
-        <w:rPr>
-          <w:rFonts w:cs="TimesNewRomanPSMT"/>
-        </w:rPr>
-        <w:t xml:space="preserve">2° Pour permettre le renouvellement des droits à l’APL au 1er janvier de chaque année, le bailleur fournit aux organismes liquidateurs de l'APL au plus tard le 15 novembre de chaque année, conformément à l'arrêté du 22 août 1986 relatif à la fixation des </w:t>
+        <w:t>Information des organismes chargés de la liquidation et du paiement des APL</w:t>
+      </w:r>
+    </w:p>
+    <w:p>
+      <w:pPr>
+        <w:jc w:val="both"/>
+        <w:rPr>
+          <w:rFonts w:cs="TimesNewRomanPSMT"/>
+        </w:rPr>
+      </w:pPr>
+    </w:p>
+    <w:p>
+      <w:pPr>
+        <w:jc w:val="both"/>
+      </w:pPr>
+      <w:r>
+        <w:rPr>
+          <w:rFonts w:cs="TimesNewRomanPSMT"/>
+        </w:rPr>
+        <w:t xml:space="preserve">Le préfet, ou, lorsqu'un établissement public de coopération intercommunale, un département, la métropole de Lyon ou la collectivité de Corse a signé une convention </w:t>
       </w:r>
       <w:r>
         <w:rPr>
           <w:rFonts w:cs="TimesNewRomanPSMT"/>
         </w:rPr>
         <w:lastRenderedPageBreak/>
-        <w:t>justifications nécessaires à l'obtention de l'aide personnalisée au logement et à son renouvellement :</w:t>
-      </w:r>
-    </w:p>
-    <w:p>
-      <w:pPr>
-        <w:jc w:val="both"/>
-        <w:rPr>
-          <w:rFonts w:cs="TimesNewRomanPSMT"/>
-        </w:rPr>
-      </w:pPr>
-    </w:p>
-    <w:p>
-      <w:pPr>
-        <w:jc w:val="both"/>
-      </w:pPr>
-      <w:r>
-        <w:rPr>
-          <w:rFonts w:cs="TimesNewRomanPSMT"/>
-        </w:rPr>
-        <w:t>- une attestation concernant le montant du loyer applicable à chaque logement concerné par la présente convention, à compter du 1er juillet de l’année en cours ;</w:t>
-      </w:r>
-    </w:p>
-    <w:p>
-      <w:pPr>
-        <w:jc w:val="both"/>
-        <w:rPr>
-          <w:rFonts w:cs="TimesNewRomanPSMT"/>
-        </w:rPr>
-      </w:pPr>
-    </w:p>
-    <w:p>
-      <w:pPr>
-        <w:jc w:val="both"/>
-      </w:pPr>
-      <w:r>
-        <w:rPr>
-          <w:rFonts w:cs="TimesNewRomanPSMT"/>
-        </w:rPr>
-        <w:t>- un document attestant que tous les bénéficiaires sont à jour de leurs obligations vis-à-vis du bailleur ou, le cas échéant, la liste des bénéficiaires d'APL non à jour en certifiant que cette liste est exhaustive. Ce document mentionne également la date à laquelle l’organisme payeur a été saisi en cas d’impayé constitué selon la définition fixée par l’article R. 824-1 du code de la construction et de l’habitation.</w:t>
-      </w:r>
-    </w:p>
-    <w:p>
-      <w:pPr>
-        <w:jc w:val="both"/>
-        <w:rPr>
-          <w:rFonts w:ascii="TimesNewRomanPSMT" w:hAnsi="TimesNewRomanPSMT" w:cs="TimesNewRomanPSMT"/>
-        </w:rPr>
-      </w:pPr>
-    </w:p>
-    <w:p>
-      <w:pPr>
-        <w:jc w:val="both"/>
-      </w:pPr>
-      <w:r>
-        <w:rPr>
-          <w:rFonts w:cs="TimesNewRomanPSMT"/>
-        </w:rPr>
-        <w:t>Ces transmissions peuvent s’effectuer grâce à un dispositif de collecte dématérialisé.</w:t>
-      </w:r>
-    </w:p>
-    <w:p>
-      <w:pPr>
-        <w:jc w:val="both"/>
-        <w:rPr>
-          <w:rFonts w:cs="TimesNewRomanPSMT"/>
-        </w:rPr>
-      </w:pPr>
-    </w:p>
-    <w:p>
-      <w:pPr>
-        <w:jc w:val="both"/>
-      </w:pPr>
-      <w:r>
-        <w:rPr>
-          <w:rFonts w:cs="TimesNewRomanPSMT"/>
-        </w:rPr>
-        <w:t>3° En outre, il fait part dans un délai maximum d'un mois aux organismes liquidateurs de l'APL des modifications affectant la situation locative du bénéficiaire (notamment colocation, résiliation de bail, décès).</w:t>
-      </w:r>
-    </w:p>
-    <w:p>
-      <w:pPr>
-        <w:jc w:val="both"/>
-        <w:rPr>
-          <w:rFonts w:ascii="TimesNewRomanPSMT" w:hAnsi="TimesNewRomanPSMT" w:cs="TimesNewRomanPSMT"/>
-        </w:rPr>
-      </w:pPr>
-    </w:p>
-    <w:p>
-      <w:pPr>
-        <w:jc w:val="center"/>
-      </w:pPr>
-      <w:r>
-        <w:rPr>
-          <w:rFonts w:cs="TimesNewRomanPSMT"/>
-        </w:rPr>
-        <w:t>Article 21.</w:t>
-      </w:r>
-    </w:p>
-    <w:p>
-      <w:pPr>
-        <w:rPr>
-          <w:rFonts w:cs="TimesNewRomanPSMT"/>
-        </w:rPr>
-      </w:pPr>
-    </w:p>
-    <w:p>
-      <w:pPr>
-        <w:jc w:val="center"/>
-      </w:pPr>
-      <w:r>
-        <w:rPr>
-          <w:rFonts w:cs="TimesNewRomanPSMT"/>
-          <w:i/>
-          <w:iCs/>
-        </w:rPr>
-        <w:t>Obligations en cas d’impayé.</w:t>
-      </w:r>
-    </w:p>
-    <w:p>
-      <w:pPr>
-        <w:jc w:val="both"/>
-        <w:rPr>
-          <w:rFonts w:cs="TimesNewRomanPSMT"/>
-        </w:rPr>
-      </w:pPr>
-    </w:p>
-    <w:p>
-      <w:pPr>
-        <w:jc w:val="both"/>
-      </w:pPr>
-      <w:r>
-        <w:rPr>
-          <w:rFonts w:cs="TimesNewRomanPSMT"/>
-        </w:rPr>
-        <w:t>En application des articles L. 824-1 et R. 824-4 du code de la construction et de l’habitation, le bailleur auprès duquel l'aide est versée signale à l’organisme payeur lorsqu’un allocataire ne règle pas la part de la dépense de logement restant à sa charge, dans un délai de deux mois après la constitution de l'impayé défini à l’article R. 824-1 du code de la construction et de l’habitation, sauf si la somme due a été réglée entre-temps en totalité. Le bailleur doit justifier qu'il poursuit par tous les moyens possibles le recouvrement de sa créance. En outre, il communique le montant de l'impayé constitué au moment de la saisine de l’organisme payeur.</w:t>
-      </w:r>
-    </w:p>
-    <w:p>
-      <w:pPr>
-        <w:jc w:val="both"/>
-        <w:rPr>
-          <w:rFonts w:ascii="TimesNewRomanPSMT" w:hAnsi="TimesNewRomanPSMT" w:cs="TimesNewRomanPSMT"/>
-        </w:rPr>
-      </w:pPr>
-    </w:p>
-    <w:p>
-      <w:pPr>
-        <w:jc w:val="both"/>
-      </w:pPr>
-      <w:r>
-        <w:rPr>
-          <w:rFonts w:cs="TimesNewRomanPSMT"/>
-        </w:rPr>
-        <w:t>Parallèlement, en cas d'impayé, le bailleur doit poursuivre le recouvrement de sa créance en notifiant au locataire défaillant par lettre recommandée avec accusé de réception le montant de cette créance. Il doit également informer le locataire de la saisine de l’organisme payeur.</w:t>
-      </w:r>
-    </w:p>
-    <w:p>
-      <w:pPr>
-        <w:jc w:val="both"/>
-        <w:rPr>
-          <w:rFonts w:cs="TimesNewRomanPSMT"/>
-        </w:rPr>
-      </w:pPr>
-    </w:p>
-    <w:p>
-      <w:pPr>
-        <w:jc w:val="both"/>
-      </w:pPr>
-      <w:r>
-        <w:rPr>
-          <w:rFonts w:cs="TimesNewRomanPSMT"/>
-        </w:rPr>
-        <w:t>La commission de coordination des actions de prévention des expulsions locatives (CCAPEX) est systématiquement informée par l’organisme payeur des APL en vue de prévenir leurs éventuelles suspensions par une mobilisation coordonnée des outils de prévention (article 7-2 de la loi n° 90- 449 du 31 mai 1990 visant à la mise en œuvre du droit au logement).</w:t>
-      </w:r>
-    </w:p>
-    <w:p>
-      <w:pPr>
-        <w:jc w:val="both"/>
-        <w:rPr>
-          <w:rFonts w:cs="TimesNewRomanPSMT"/>
-        </w:rPr>
-      </w:pPr>
-    </w:p>
-    <w:p>
-      <w:pPr>
-        <w:jc w:val="both"/>
-      </w:pPr>
-      <w:r>
-        <w:rPr>
-          <w:rFonts w:cs="TimesNewRomanPSMT"/>
-        </w:rPr>
-        <w:t>La CCAPEX est réputée avoir été régulièrement saisie lorsque le bailleur a préalablement signalé l’impayé à l’organisme payeur des APL selon les modalités définies à l’article R. 824-4 précité.</w:t>
-      </w:r>
-    </w:p>
-    <w:p>
-      <w:pPr>
-        <w:jc w:val="both"/>
-        <w:rPr>
-          <w:rFonts w:cs="TimesNewRomanPS-BoldMT"/>
-          <w:b/>
-        </w:rPr>
-      </w:pPr>
-    </w:p>
-    <w:p>
-      <w:pPr>
-        <w:jc w:val="both"/>
-        <w:rPr>
-          <w:rFonts w:cs="TimesNewRomanPS-BoldMT"/>
-          <w:b/>
-        </w:rPr>
-      </w:pPr>
-    </w:p>
-    <w:p>
-      <w:pPr>
-        <w:jc w:val="center"/>
-      </w:pPr>
-      <w:r>
-        <w:rPr>
-          <w:rFonts w:cs="TimesNewRomanPS-BoldMT"/>
-          <w:b/>
-        </w:rPr>
-        <w:t>VI.-Dispositions relatives à l’application de la convention.</w:t>
-      </w:r>
-    </w:p>
-    <w:p>
-      <w:pPr>
-        <w:rPr>
-          <w:rFonts w:cs="TimesNewRomanPS-BoldMT"/>
-          <w:b/>
-        </w:rPr>
-      </w:pPr>
-    </w:p>
-    <w:p>
-      <w:pPr>
-        <w:jc w:val="center"/>
-      </w:pPr>
-      <w:r>
-        <w:rPr>
-          <w:rFonts w:cs="TimesNewRomanPSMT"/>
-        </w:rPr>
-        <w:t>Article 22.</w:t>
-      </w:r>
-    </w:p>
-    <w:p>
-      <w:pPr>
-        <w:rPr>
-          <w:rFonts w:cs="TimesNewRomanPSMT"/>
-        </w:rPr>
-      </w:pPr>
-    </w:p>
-    <w:p>
-      <w:pPr>
-        <w:jc w:val="center"/>
-      </w:pPr>
-      <w:r>
-        <w:rPr>
-          <w:rFonts w:cs="TimesNewRomanPSMT"/>
-          <w:i/>
-          <w:iCs/>
-        </w:rPr>
-        <w:t>Contrôle.</w:t>
-      </w:r>
-    </w:p>
-    <w:p>
-      <w:pPr>
-        <w:jc w:val="both"/>
-        <w:rPr>
-          <w:rFonts w:cs="TimesNewRomanPSMT"/>
-        </w:rPr>
-      </w:pPr>
-    </w:p>
-    <w:p>
-      <w:pPr>
-        <w:jc w:val="both"/>
-      </w:pPr>
-      <w:r>
-        <w:rPr>
-          <w:rFonts w:cs="TimesNewRomanPSMT"/>
-        </w:rPr>
-        <w:t>Afin de permettre le contrôle de l'application de la présente convention, le bailleur fournit à tout moment à la demande du préfet ou de l’Agence nationale de contrôle du logement social toutes les informations et tous les documents nécessaires au plein exercice de ce contrôle.</w:t>
-      </w:r>
-    </w:p>
-    <w:p>
-      <w:pPr>
-        <w:jc w:val="both"/>
-        <w:rPr>
-          <w:rFonts w:cs="TimesNewRomanPSMT"/>
-        </w:rPr>
-      </w:pPr>
-    </w:p>
-    <w:p>
-      <w:pPr>
-        <w:jc w:val="center"/>
-      </w:pPr>
-      <w:r>
-        <w:rPr>
-          <w:rFonts w:cs="TimesNewRomanPSMT"/>
-        </w:rPr>
-        <w:t>Article 23.</w:t>
-      </w:r>
-    </w:p>
-    <w:p>
-      <w:pPr>
-        <w:rPr>
-          <w:rFonts w:cs="TimesNewRomanPSMT"/>
-        </w:rPr>
-      </w:pPr>
-    </w:p>
-    <w:p>
-      <w:pPr>
-        <w:jc w:val="center"/>
-      </w:pPr>
-      <w:r>
-        <w:rPr>
-          <w:rFonts w:cs="TimesNewRomanPSMT"/>
-          <w:i/>
-          <w:iCs/>
-        </w:rPr>
-        <w:t>Révision de la convention.</w:t>
-      </w:r>
-    </w:p>
-    <w:p>
-      <w:pPr>
-        <w:jc w:val="both"/>
-        <w:rPr>
-          <w:rFonts w:cs="TimesNewRomanPSMT"/>
-        </w:rPr>
-      </w:pPr>
-    </w:p>
-    <w:p>
-      <w:pPr>
-        <w:jc w:val="both"/>
-      </w:pPr>
-      <w:r>
-        <w:rPr>
-          <w:rFonts w:cs="TimesNewRomanPSMT"/>
-        </w:rPr>
-        <w:t>La présente convention pourra être révisée à la demande de l'une ou l'autre des parties par voie d'avenant.</w:t>
-      </w:r>
-    </w:p>
-    <w:p>
-      <w:pPr>
-        <w:jc w:val="both"/>
-        <w:rPr>
-          <w:rFonts w:ascii="TimesNewRomanPSMT" w:hAnsi="TimesNewRomanPSMT" w:cs="TimesNewRomanPSMT"/>
-        </w:rPr>
-      </w:pPr>
-    </w:p>
-    <w:p>
-      <w:pPr>
-        <w:jc w:val="center"/>
-      </w:pPr>
-      <w:r>
-        <w:rPr>
-          <w:rFonts w:cs="TimesNewRomanPSMT"/>
-        </w:rPr>
-        <w:t>Article 24.</w:t>
-      </w:r>
-    </w:p>
-    <w:p>
-      <w:pPr>
-        <w:rPr>
-          <w:rFonts w:cs="TimesNewRomanPSMT"/>
-        </w:rPr>
-      </w:pPr>
-    </w:p>
-    <w:p>
-      <w:pPr>
-        <w:jc w:val="center"/>
-      </w:pPr>
-      <w:r>
-        <w:rPr>
-          <w:rFonts w:cs="TimesNewRomanPSMT"/>
-          <w:i/>
-          <w:iCs/>
-        </w:rPr>
-        <w:t>Inexécution de la convention par le bailleur.</w:t>
-      </w:r>
-    </w:p>
-    <w:p>
-      <w:pPr>
-        <w:jc w:val="both"/>
-        <w:rPr>
-          <w:rFonts w:cs="TimesNewRomanPSMT"/>
-        </w:rPr>
-      </w:pPr>
-    </w:p>
-    <w:p>
-      <w:pPr>
-        <w:jc w:val="both"/>
-      </w:pPr>
-      <w:r>
-        <w:rPr>
-          <w:rFonts w:cs="TimesNewRomanPSMT"/>
-        </w:rPr>
-        <w:t>1°- En application de l'article 284 du code général des impôts, les bailleurs qui ont, au taux réduit de la taxe sur la valeur ajoutée, acquis un logement social ou imposé la livraison à soi-même d'un logement locatif social ou de travaux d'amélioration, de transformation ou d'aménagement portant sur un logement locatif social sont redevables d'un complément de taxe sur la valeur ajoutée égal à la différence entre le taux réduit et le taux normal lorsque les conditions de taxation de vente ou de livraison à soi-même au taux réduit ne sont pas ou plus remplies.</w:t>
-      </w:r>
-    </w:p>
-    <w:p>
-      <w:pPr>
-        <w:jc w:val="both"/>
-        <w:rPr>
-          <w:rFonts w:ascii="TimesNewRomanPSMT" w:hAnsi="TimesNewRomanPSMT" w:cs="TimesNewRomanPSMT"/>
-        </w:rPr>
-      </w:pPr>
-    </w:p>
-    <w:p>
-      <w:pPr>
-        <w:jc w:val="both"/>
-      </w:pPr>
-      <w:r>
-        <w:rPr>
-          <w:rFonts w:cs="TimesNewRomanPSMT"/>
-        </w:rPr>
-        <w:t>2°- En application de l'article L. 353-2 du code de la construction et de l'habitation, des sanctions administratives peuvent être mises en œuvre.</w:t>
-      </w:r>
-    </w:p>
-    <w:p>
-      <w:pPr>
-        <w:jc w:val="both"/>
-        <w:rPr>
-          <w:rFonts w:cs="TimesNewRomanPSMT"/>
-        </w:rPr>
-      </w:pPr>
-    </w:p>
-    <w:p>
-      <w:pPr>
-        <w:jc w:val="both"/>
-      </w:pPr>
-      <w:r>
-        <w:rPr>
-          <w:rFonts w:cs="TimesNewRomanPSMT"/>
-        </w:rPr>
-        <w:t>En application de l’article L. 353-11 du code de la construction et de l’habitation, le contrôle de l’application de la présente convention est assuré par l’Agence nationale de contrôle du logement social, que le préfet est tenu de saisir en cas de manquement constaté.</w:t>
-      </w:r>
-    </w:p>
-    <w:p>
-      <w:pPr>
-        <w:jc w:val="both"/>
-        <w:rPr>
-          <w:rFonts w:cs="TimesNewRomanPSMT"/>
-        </w:rPr>
-      </w:pPr>
-    </w:p>
-    <w:p>
-      <w:pPr>
-        <w:jc w:val="both"/>
-      </w:pPr>
-      <w:r>
-        <w:rPr>
-          <w:rFonts w:cs="TimesNewRomanPSMT"/>
-        </w:rPr>
-        <w:t>Lorsqu'un organisme ne respecte pas, pour un ou plusieurs logements, les engagements prévus par la convention, et après que l'organisme a été mis en mesure de présenter ses observations conformément aux dispositions de l'article L. 342-12 du code de la construction et de l’habitation ou, en cas de mise en demeure, à l'issue du délai mentionné à ce même article, l’Agence nationale de contrôle du logement social peut proposer au ministre chargé du logement de prononcer une sanction en application de l’article L. 342-14 du même code.</w:t>
-      </w:r>
-    </w:p>
-    <w:p>
-      <w:pPr>
-        <w:jc w:val="both"/>
-        <w:rPr>
-          <w:rFonts w:cs="TimesNewRomanPSMT"/>
-        </w:rPr>
-      </w:pPr>
-    </w:p>
-    <w:p>
-      <w:pPr>
-        <w:jc w:val="both"/>
-      </w:pPr>
-      <w:r>
-        <w:rPr>
-          <w:rFonts w:cs="TimesNewRomanPSMT"/>
-        </w:rPr>
-        <w:t>3°- En cas d'inexécution par le bailleur de ses engagements prévus par la convention, tels que notamment non-respect du loyer maximum ou en cas de fraude, dissimulation ou fausse déclaration à l'égard des organismes liquidateurs de l'APL, le préfet peut procéder à la résiliation de la présente convention aux torts du bailleur. Le préfet doit préalablement mettre en demeure l'organisme par lettre recommandée avec demande d'avis de réception. L'organisme doit dans un délai de deux mois soit satisfaire à ses obligations, soit formuler ses observations.</w:t>
-      </w:r>
-    </w:p>
-    <w:p>
-      <w:pPr>
-        <w:jc w:val="both"/>
-        <w:rPr>
-          <w:rFonts w:cs="TimesNewRomanPSMT"/>
-        </w:rPr>
-      </w:pPr>
-    </w:p>
-    <w:p>
-      <w:pPr>
-        <w:jc w:val="both"/>
-      </w:pPr>
-      <w:r>
-        <w:rPr>
-          <w:rFonts w:cs="TimesNewRomanPSMT"/>
-        </w:rPr>
-        <w:t>Lorsque le préfet écarte ces observations, sa décision doit être motivée.</w:t>
-      </w:r>
-    </w:p>
-    <w:p>
-      <w:pPr>
-        <w:jc w:val="both"/>
-        <w:rPr>
-          <w:rFonts w:cs="TimesNewRomanPSMT"/>
-        </w:rPr>
-      </w:pPr>
-    </w:p>
-    <w:p>
-      <w:pPr>
-        <w:jc w:val="both"/>
-      </w:pPr>
-      <w:r>
-        <w:rPr>
-          <w:rFonts w:cs="TimesNewRomanPSMT"/>
-        </w:rPr>
-        <w:t>Dans ce cas, il est fait application des dispositions prévues à l'article L. 353-6 du code de la construction et de l'habitation.</w:t>
-      </w:r>
-    </w:p>
-    <w:p>
-      <w:pPr>
-        <w:jc w:val="both"/>
-        <w:rPr>
-          <w:rFonts w:ascii="TimesNewRomanPSMT" w:hAnsi="TimesNewRomanPSMT" w:cs="TimesNewRomanPSMT"/>
-        </w:rPr>
-      </w:pPr>
-    </w:p>
-    <w:p>
-      <w:pPr>
-        <w:jc w:val="center"/>
-      </w:pPr>
-      <w:r>
-        <w:rPr>
-          <w:rFonts w:cs="TimesNewRomanPSMT"/>
-        </w:rPr>
-        <w:t>Article 25.</w:t>
-      </w:r>
-    </w:p>
-    <w:p>
-      <w:pPr>
-        <w:rPr>
-          <w:rFonts w:cs="TimesNewRomanPSMT"/>
-        </w:rPr>
-      </w:pPr>
-    </w:p>
-    <w:p>
-      <w:pPr>
-        <w:jc w:val="center"/>
-        <w:rPr>
-          <w:rFonts w:cs="TimesNewRomanPSMT"/>
-          <w:i/>
-          <w:iCs/>
-        </w:rPr>
-      </w:pPr>
-      <w:r>
-        <w:rPr>
-          <w:rFonts w:cs="TimesNewRomanPSMT"/>
-          <w:i/>
-          <w:iCs/>
-        </w:rPr>
-        <w:t>Information des organismes chargés de la liquidation et du paiement des APL</w:t>
-      </w:r>
-    </w:p>
-    <w:p>
-      <w:pPr>
-        <w:jc w:val="both"/>
-        <w:rPr>
-          <w:rFonts w:cs="TimesNewRomanPSMT"/>
-        </w:rPr>
-      </w:pPr>
-    </w:p>
-    <w:p>
-      <w:pPr>
-        <w:jc w:val="both"/>
-      </w:pPr>
-      <w:r>
-        <w:rPr>
-          <w:rFonts w:cs="TimesNewRomanPSMT"/>
-        </w:rPr>
-        <w:t>Le préfet, ou, lorsqu'un établissement public de coopération intercommunale, un département, la métropole de Lyon ou la collectivité de Corse a signé une convention mentionnée aux articles L. 301-5-1, L. 301-5-2, L. 3641-5, L. 5219-1, L. 5218-2 et L. 5217-2 précités, le président de l'établissement public de coopération intercommunale, du conseil départemental, de la métropole de Lyon ou du conseil exécutif de Corse transmet aux organismes chargés de la liquidation et du</w:t>
+        <w:t>mentionnée aux articles L. 301-5-1, L. 301-5-2, L. 3641-5, L. 5219-1, L. 5218-2 et L. 5217-2 précités, le président de l'établissement public de coopération intercommunale, du conseil départemental, de la métropole de Lyon ou du conseil exécutif de Corse transmet aux organismes chargés de la liquidation et du</w:t>
       </w:r>
     </w:p>
     <w:p>
@@ -15905,90 +15908,6 @@
 
 <file path=word/header3.xml><?xml version="1.0" encoding="utf-8"?>
 <w:hdr xmlns:wpc="http://schemas.microsoft.com/office/word/2010/wordprocessingCanvas" xmlns:cx="http://schemas.microsoft.com/office/drawing/2014/chartex" xmlns:cx1="http://schemas.microsoft.com/office/drawing/2015/9/8/chartex" xmlns:cx2="http://schemas.microsoft.com/office/drawing/2015/10/21/chartex" xmlns:cx3="http://schemas.microsoft.com/office/drawing/2016/5/9/chartex" xmlns:cx4="http://schemas.microsoft.com/office/drawing/2016/5/10/chartex" xmlns:cx5="http://schemas.microsoft.com/office/drawing/2016/5/11/chartex" xmlns:cx6="http://schemas.microsoft.com/office/drawing/2016/5/12/chartex" xmlns:cx7="http://schemas.microsoft.com/office/drawing/2016/5/13/chartex" xmlns:cx8="http://schemas.microsoft.com/office/drawing/2016/5/14/chartex" xmlns:mc="http://schemas.openxmlformats.org/markup-compatibility/2006" xmlns:aink="http://schemas.microsoft.com/office/drawing/2016/ink" xmlns:am3d="http://schemas.microsoft.com/office/drawing/2017/model3d" xmlns:o="urn:schemas-microsoft-com:office:office" xmlns:oel="http://schemas.microsoft.com/office/2019/extlst" xmlns:r="http://schemas.openxmlformats.org/officeDocument/2006/relationships" xmlns:m="http://schemas.openxmlformats.org/officeDocument/2006/math" xmlns:v="urn:schemas-microsoft-com:vml" xmlns:wp14="http://schemas.microsoft.com/office/word/2010/wordprocessingDrawing" xmlns:wp="http://schemas.openxmlformats.org/drawingml/2006/wordprocessingDrawing" xmlns:w10="urn:schemas-microsoft-com:office:word" xmlns:w="http://schemas.openxmlformats.org/wordprocessingml/2006/main" xmlns:w14="http://schemas.microsoft.com/office/word/2010/wordml" xmlns:w15="http://schemas.microsoft.com/office/word/2012/wordml" xmlns:w16cex="http://schemas.microsoft.com/office/word/2018/wordml/cex" xmlns:w16cid="http://schemas.microsoft.com/office/word/2016/wordml/cid" xmlns:w16="http://schemas.microsoft.com/office/word/2018/wordml" xmlns:w16du="http://schemas.microsoft.com/office/word/2023/wordml/word16du" xmlns:w16sdtdh="http://schemas.microsoft.com/office/word/2020/wordml/sdtdatahash" xmlns:w16sdtfl="http://schemas.microsoft.com/office/word/2024/wordml/sdtformatlock" xmlns:w16se="http://schemas.microsoft.com/office/word/2015/wordml/symex" xmlns:wpg="http://schemas.microsoft.com/office/word/2010/wordprocessingGroup" xmlns:wpi="http://schemas.microsoft.com/office/word/2010/wordprocessingInk" xmlns:wne="http://schemas.microsoft.com/office/word/2006/wordml" xmlns:wps="http://schemas.microsoft.com/office/word/2010/wordprocessingShape" mc:Ignorable="w14 w15 w16se w16cid w16 w16cex w16sdtdh w16sdtfl w16du wp14">
-  <w:tbl>
-    <w:tblPr>
-      <w:tblStyle w:val="Grilledutableau"/>
-      <w:tblW w:w="3440" w:type="dxa"/>
-      <w:jc w:val="center"/>
-      <w:tblLayout w:type="fixed"/>
-      <w:tblLook w:val="04A0" w:firstRow="1" w:lastRow="0" w:firstColumn="1" w:lastColumn="0" w:noHBand="0" w:noVBand="1"/>
-    </w:tblPr>
-    <w:tblGrid>
-      <w:gridCol w:w="3440"/>
-    </w:tblGrid>
-    <w:tr>
-      <w:trPr>
-        <w:jc w:val="center"/>
-      </w:trPr>
-      <w:tc>
-        <w:tcPr>
-          <w:tcW w:w="3440" w:type="dxa"/>
-          <w:tcBorders>
-            <w:right w:val="nil"/>
-          </w:tcBorders>
-        </w:tcPr>
-        <w:p>
-          <w:pPr>
-            <w:widowControl w:val="0"/>
-            <w:rPr>
-              <w:sz w:val="4"/>
-              <w:szCs w:val="4"/>
-            </w:rPr>
-          </w:pPr>
-        </w:p>
-        <w:p>
-          <w:pPr>
-            <w:widowControl w:val="0"/>
-            <w:rPr>
-              <w:sz w:val="20"/>
-              <w:szCs w:val="20"/>
-            </w:rPr>
-          </w:pPr>
-          <w:r>
-            <w:rPr>
-              <w:sz w:val="20"/>
-              <w:szCs w:val="20"/>
-            </w:rPr>
-            <w:t>DATE</w:t>
-          </w:r>
-        </w:p>
-        <w:p>
-          <w:pPr>
-            <w:widowControl w:val="0"/>
-            <w:rPr>
-              <w:sz w:val="20"/>
-              <w:szCs w:val="20"/>
-            </w:rPr>
-          </w:pPr>
-        </w:p>
-        <w:p>
-          <w:pPr>
-            <w:widowControl w:val="0"/>
-            <w:rPr>
-              <w:sz w:val="20"/>
-              <w:szCs w:val="20"/>
-            </w:rPr>
-          </w:pPr>
-        </w:p>
-        <w:p>
-          <w:pPr>
-            <w:widowControl w:val="0"/>
-            <w:rPr>
-              <w:sz w:val="20"/>
-              <w:szCs w:val="20"/>
-            </w:rPr>
-          </w:pPr>
-          <w:r>
-            <w:rPr>
-              <w:sz w:val="20"/>
-              <w:szCs w:val="20"/>
-            </w:rPr>
-            <w:t>VOL                      N°</w:t>
-          </w:r>
-        </w:p>
-      </w:tc>
-    </w:tr>
-  </w:tbl>
   <w:p>
     <w:pPr>
       <w:pStyle w:val="En-tte"/>
@@ -17731,6 +17650,7 @@
   <w:style w:type="character" w:default="1" w:styleId="Policepardfaut">
     <w:name w:val="Default Paragraph Font"/>
     <w:uiPriority w:val="1"/>
+    <w:semiHidden/>
     <w:unhideWhenUsed/>
   </w:style>
   <w:style w:type="table" w:default="1" w:styleId="TableauNormal">

</xml_diff>